<commit_message>
Add .DS_Store and update Proposal_v1.0.0 documents in PDF and DOCX formats
</commit_message>
<xml_diff>
--- a/artifacts/Proposal_v1.0.0.docx
+++ b/artifacts/Proposal_v1.0.0.docx
@@ -169,11 +169,6 @@
       </w:r>
     </w:p>
     <w:p>
-      <w:r>
-        <w:br w:type="page"/>
-      </w:r>
-    </w:p>
-    <w:p>
       <w:pPr>
         <w:sectPr>
           <w:headerReference w:type="default" r:id="rId7"/>
@@ -194,7 +189,7 @@
         </w:pBdr>
         <w:spacing w:before="0"/>
       </w:pPr>
-      <w:bookmarkStart w:id="0" w:name="_Toc233281597"/>
+      <w:bookmarkStart w:id="0" w:name="_Toc233304217"/>
       <w:r>
         <w:lastRenderedPageBreak/>
         <w:t>Statement of Ethical Compliance: A0</w:t>
@@ -255,7 +250,7 @@
         </w:pBdr>
         <w:spacing w:before="0"/>
       </w:pPr>
-      <w:bookmarkStart w:id="1" w:name="_Toc233281598"/>
+      <w:bookmarkStart w:id="1" w:name="_Toc233304218"/>
       <w:r>
         <w:lastRenderedPageBreak/>
         <w:t>Table of Contents</w:t>
@@ -275,15 +270,26 @@
               <w:tab w:val="right" w:leader="dot" w:pos="9062"/>
             </w:tabs>
             <w:rPr>
+              <w:rFonts w:asciiTheme="minorHAnsi" w:eastAsiaTheme="minorEastAsia" w:hAnsiTheme="minorHAnsi" w:cstheme="minorBidi"/>
               <w:noProof/>
+              <w:color w:val="auto"/>
+              <w:kern w:val="2"/>
+              <w:sz w:val="24"/>
+              <w:szCs w:val="24"/>
+              <w:lang w:val="en-IN"/>
+              <w14:ligatures w14:val="standardContextual"/>
             </w:rPr>
           </w:pPr>
           <w:r>
-            <w:fldChar w:fldCharType="begin" w:dirty="true"/>
+            <w:fldChar w:fldCharType="begin"/>
+          </w:r>
+          <w:r>
             <w:instrText>TOC \h \o "1-2"</w:instrText>
+          </w:r>
+          <w:r>
             <w:fldChar w:fldCharType="separate"/>
           </w:r>
-          <w:hyperlink w:anchor="_Toc233281597" w:history="1">
+          <w:hyperlink w:anchor="_Toc233304217" w:history="1">
             <w:r>
               <w:rPr>
                 <w:rStyle w:val="Hyperlink"/>
@@ -296,10 +302,40 @@
                 <w:noProof/>
               </w:rPr>
               <w:tab/>
-              <w:fldChar w:fldCharType="begin" w:dirty="true"/>
-              <w:instrText xml:space="preserve"> PAGEREF _Toc233281597 \h </w:instrText>
+            </w:r>
+            <w:r>
+              <w:rPr>
+                <w:noProof/>
+              </w:rPr>
+              <w:fldChar w:fldCharType="begin"/>
+            </w:r>
+            <w:r>
+              <w:rPr>
+                <w:noProof/>
+              </w:rPr>
+              <w:instrText xml:space="preserve"> PAGEREF _Toc233304217 \h </w:instrText>
+            </w:r>
+            <w:r>
+              <w:rPr>
+                <w:noProof/>
+              </w:rPr>
+            </w:r>
+            <w:r>
+              <w:rPr>
+                <w:noProof/>
+              </w:rPr>
               <w:fldChar w:fldCharType="separate"/>
+            </w:r>
+            <w:r>
+              <w:rPr>
+                <w:noProof/>
+              </w:rPr>
               <w:t>2</w:t>
+            </w:r>
+            <w:r>
+              <w:rPr>
+                <w:noProof/>
+              </w:rPr>
               <w:fldChar w:fldCharType="end"/>
             </w:r>
           </w:hyperlink>
@@ -311,10 +347,17 @@
               <w:tab w:val="right" w:leader="dot" w:pos="9062"/>
             </w:tabs>
             <w:rPr>
+              <w:rFonts w:asciiTheme="minorHAnsi" w:eastAsiaTheme="minorEastAsia" w:hAnsiTheme="minorHAnsi" w:cstheme="minorBidi"/>
               <w:noProof/>
+              <w:color w:val="auto"/>
+              <w:kern w:val="2"/>
+              <w:sz w:val="24"/>
+              <w:szCs w:val="24"/>
+              <w:lang w:val="en-IN"/>
+              <w14:ligatures w14:val="standardContextual"/>
             </w:rPr>
           </w:pPr>
-          <w:hyperlink w:anchor="_Toc233281598" w:history="1">
+          <w:hyperlink w:anchor="_Toc233304218" w:history="1">
             <w:r>
               <w:rPr>
                 <w:rStyle w:val="Hyperlink"/>
@@ -327,10 +370,40 @@
                 <w:noProof/>
               </w:rPr>
               <w:tab/>
-              <w:fldChar w:fldCharType="begin" w:dirty="true"/>
-              <w:instrText xml:space="preserve"> PAGEREF _Toc233281598 \h </w:instrText>
+            </w:r>
+            <w:r>
+              <w:rPr>
+                <w:noProof/>
+              </w:rPr>
+              <w:fldChar w:fldCharType="begin"/>
+            </w:r>
+            <w:r>
+              <w:rPr>
+                <w:noProof/>
+              </w:rPr>
+              <w:instrText xml:space="preserve"> PAGEREF _Toc233304218 \h </w:instrText>
+            </w:r>
+            <w:r>
+              <w:rPr>
+                <w:noProof/>
+              </w:rPr>
+            </w:r>
+            <w:r>
+              <w:rPr>
+                <w:noProof/>
+              </w:rPr>
               <w:fldChar w:fldCharType="separate"/>
+            </w:r>
+            <w:r>
+              <w:rPr>
+                <w:noProof/>
+              </w:rPr>
               <w:t>3</w:t>
+            </w:r>
+            <w:r>
+              <w:rPr>
+                <w:noProof/>
+              </w:rPr>
               <w:fldChar w:fldCharType="end"/>
             </w:r>
           </w:hyperlink>
@@ -342,10 +415,17 @@
               <w:tab w:val="right" w:leader="dot" w:pos="9062"/>
             </w:tabs>
             <w:rPr>
+              <w:rFonts w:asciiTheme="minorHAnsi" w:eastAsiaTheme="minorEastAsia" w:hAnsiTheme="minorHAnsi" w:cstheme="minorBidi"/>
               <w:noProof/>
+              <w:color w:val="auto"/>
+              <w:kern w:val="2"/>
+              <w:sz w:val="24"/>
+              <w:szCs w:val="24"/>
+              <w:lang w:val="en-IN"/>
+              <w14:ligatures w14:val="standardContextual"/>
             </w:rPr>
           </w:pPr>
-          <w:hyperlink w:anchor="_Toc233281599" w:history="1">
+          <w:hyperlink w:anchor="_Toc233304219" w:history="1">
             <w:r>
               <w:rPr>
                 <w:rStyle w:val="Hyperlink"/>
@@ -358,10 +438,40 @@
                 <w:noProof/>
               </w:rPr>
               <w:tab/>
-              <w:fldChar w:fldCharType="begin" w:dirty="true"/>
-              <w:instrText xml:space="preserve"> PAGEREF _Toc233281599 \h </w:instrText>
+            </w:r>
+            <w:r>
+              <w:rPr>
+                <w:noProof/>
+              </w:rPr>
+              <w:fldChar w:fldCharType="begin"/>
+            </w:r>
+            <w:r>
+              <w:rPr>
+                <w:noProof/>
+              </w:rPr>
+              <w:instrText xml:space="preserve"> PAGEREF _Toc233304219 \h </w:instrText>
+            </w:r>
+            <w:r>
+              <w:rPr>
+                <w:noProof/>
+              </w:rPr>
+            </w:r>
+            <w:r>
+              <w:rPr>
+                <w:noProof/>
+              </w:rPr>
               <w:fldChar w:fldCharType="separate"/>
+            </w:r>
+            <w:r>
+              <w:rPr>
+                <w:noProof/>
+              </w:rPr>
               <w:t>4</w:t>
+            </w:r>
+            <w:r>
+              <w:rPr>
+                <w:noProof/>
+              </w:rPr>
               <w:fldChar w:fldCharType="end"/>
             </w:r>
           </w:hyperlink>
@@ -373,10 +483,17 @@
               <w:tab w:val="right" w:leader="dot" w:pos="9062"/>
             </w:tabs>
             <w:rPr>
+              <w:rFonts w:asciiTheme="minorHAnsi" w:eastAsiaTheme="minorEastAsia" w:hAnsiTheme="minorHAnsi" w:cstheme="minorBidi"/>
               <w:noProof/>
+              <w:color w:val="auto"/>
+              <w:kern w:val="2"/>
+              <w:sz w:val="24"/>
+              <w:szCs w:val="24"/>
+              <w:lang w:val="en-IN"/>
+              <w14:ligatures w14:val="standardContextual"/>
             </w:rPr>
           </w:pPr>
-          <w:hyperlink w:anchor="_Toc233281600" w:history="1">
+          <w:hyperlink w:anchor="_Toc233304220" w:history="1">
             <w:r>
               <w:rPr>
                 <w:rStyle w:val="Hyperlink"/>
@@ -389,10 +506,40 @@
                 <w:noProof/>
               </w:rPr>
               <w:tab/>
-              <w:fldChar w:fldCharType="begin" w:dirty="true"/>
-              <w:instrText xml:space="preserve"> PAGEREF _Toc233281600 \h </w:instrText>
+            </w:r>
+            <w:r>
+              <w:rPr>
+                <w:noProof/>
+              </w:rPr>
+              <w:fldChar w:fldCharType="begin"/>
+            </w:r>
+            <w:r>
+              <w:rPr>
+                <w:noProof/>
+              </w:rPr>
+              <w:instrText xml:space="preserve"> PAGEREF _Toc233304220 \h </w:instrText>
+            </w:r>
+            <w:r>
+              <w:rPr>
+                <w:noProof/>
+              </w:rPr>
+            </w:r>
+            <w:r>
+              <w:rPr>
+                <w:noProof/>
+              </w:rPr>
               <w:fldChar w:fldCharType="separate"/>
+            </w:r>
+            <w:r>
+              <w:rPr>
+                <w:noProof/>
+              </w:rPr>
               <w:t>4</w:t>
+            </w:r>
+            <w:r>
+              <w:rPr>
+                <w:noProof/>
+              </w:rPr>
               <w:fldChar w:fldCharType="end"/>
             </w:r>
           </w:hyperlink>
@@ -404,10 +551,17 @@
               <w:tab w:val="right" w:leader="dot" w:pos="9062"/>
             </w:tabs>
             <w:rPr>
+              <w:rFonts w:asciiTheme="minorHAnsi" w:eastAsiaTheme="minorEastAsia" w:hAnsiTheme="minorHAnsi" w:cstheme="minorBidi"/>
               <w:noProof/>
+              <w:color w:val="auto"/>
+              <w:kern w:val="2"/>
+              <w:sz w:val="24"/>
+              <w:szCs w:val="24"/>
+              <w:lang w:val="en-IN"/>
+              <w14:ligatures w14:val="standardContextual"/>
             </w:rPr>
           </w:pPr>
-          <w:hyperlink w:anchor="_Toc233281601" w:history="1">
+          <w:hyperlink w:anchor="_Toc233304221" w:history="1">
             <w:r>
               <w:rPr>
                 <w:rStyle w:val="Hyperlink"/>
@@ -420,10 +574,40 @@
                 <w:noProof/>
               </w:rPr>
               <w:tab/>
-              <w:fldChar w:fldCharType="begin" w:dirty="true"/>
-              <w:instrText xml:space="preserve"> PAGEREF _Toc233281601 \h </w:instrText>
+            </w:r>
+            <w:r>
+              <w:rPr>
+                <w:noProof/>
+              </w:rPr>
+              <w:fldChar w:fldCharType="begin"/>
+            </w:r>
+            <w:r>
+              <w:rPr>
+                <w:noProof/>
+              </w:rPr>
+              <w:instrText xml:space="preserve"> PAGEREF _Toc233304221 \h </w:instrText>
+            </w:r>
+            <w:r>
+              <w:rPr>
+                <w:noProof/>
+              </w:rPr>
+            </w:r>
+            <w:r>
+              <w:rPr>
+                <w:noProof/>
+              </w:rPr>
               <w:fldChar w:fldCharType="separate"/>
+            </w:r>
+            <w:r>
+              <w:rPr>
+                <w:noProof/>
+              </w:rPr>
               <w:t>4</w:t>
+            </w:r>
+            <w:r>
+              <w:rPr>
+                <w:noProof/>
+              </w:rPr>
               <w:fldChar w:fldCharType="end"/>
             </w:r>
           </w:hyperlink>
@@ -435,10 +619,17 @@
               <w:tab w:val="right" w:leader="dot" w:pos="9062"/>
             </w:tabs>
             <w:rPr>
+              <w:rFonts w:asciiTheme="minorHAnsi" w:eastAsiaTheme="minorEastAsia" w:hAnsiTheme="minorHAnsi" w:cstheme="minorBidi"/>
               <w:noProof/>
+              <w:color w:val="auto"/>
+              <w:kern w:val="2"/>
+              <w:sz w:val="24"/>
+              <w:szCs w:val="24"/>
+              <w:lang w:val="en-IN"/>
+              <w14:ligatures w14:val="standardContextual"/>
             </w:rPr>
           </w:pPr>
-          <w:hyperlink w:anchor="_Toc233281602" w:history="1">
+          <w:hyperlink w:anchor="_Toc233304222" w:history="1">
             <w:r>
               <w:rPr>
                 <w:rStyle w:val="Hyperlink"/>
@@ -451,10 +642,40 @@
                 <w:noProof/>
               </w:rPr>
               <w:tab/>
-              <w:fldChar w:fldCharType="begin" w:dirty="true"/>
-              <w:instrText xml:space="preserve"> PAGEREF _Toc233281602 \h </w:instrText>
+            </w:r>
+            <w:r>
+              <w:rPr>
+                <w:noProof/>
+              </w:rPr>
+              <w:fldChar w:fldCharType="begin"/>
+            </w:r>
+            <w:r>
+              <w:rPr>
+                <w:noProof/>
+              </w:rPr>
+              <w:instrText xml:space="preserve"> PAGEREF _Toc233304222 \h </w:instrText>
+            </w:r>
+            <w:r>
+              <w:rPr>
+                <w:noProof/>
+              </w:rPr>
+            </w:r>
+            <w:r>
+              <w:rPr>
+                <w:noProof/>
+              </w:rPr>
               <w:fldChar w:fldCharType="separate"/>
+            </w:r>
+            <w:r>
+              <w:rPr>
+                <w:noProof/>
+              </w:rPr>
               <w:t>4</w:t>
+            </w:r>
+            <w:r>
+              <w:rPr>
+                <w:noProof/>
+              </w:rPr>
               <w:fldChar w:fldCharType="end"/>
             </w:r>
           </w:hyperlink>
@@ -466,10 +687,17 @@
               <w:tab w:val="right" w:leader="dot" w:pos="9062"/>
             </w:tabs>
             <w:rPr>
+              <w:rFonts w:asciiTheme="minorHAnsi" w:eastAsiaTheme="minorEastAsia" w:hAnsiTheme="minorHAnsi" w:cstheme="minorBidi"/>
               <w:noProof/>
+              <w:color w:val="auto"/>
+              <w:kern w:val="2"/>
+              <w:sz w:val="24"/>
+              <w:szCs w:val="24"/>
+              <w:lang w:val="en-IN"/>
+              <w14:ligatures w14:val="standardContextual"/>
             </w:rPr>
           </w:pPr>
-          <w:hyperlink w:anchor="_Toc233281603" w:history="1">
+          <w:hyperlink w:anchor="_Toc233304223" w:history="1">
             <w:r>
               <w:rPr>
                 <w:rStyle w:val="Hyperlink"/>
@@ -482,10 +710,40 @@
                 <w:noProof/>
               </w:rPr>
               <w:tab/>
-              <w:fldChar w:fldCharType="begin" w:dirty="true"/>
-              <w:instrText xml:space="preserve"> PAGEREF _Toc233281603 \h </w:instrText>
+            </w:r>
+            <w:r>
+              <w:rPr>
+                <w:noProof/>
+              </w:rPr>
+              <w:fldChar w:fldCharType="begin"/>
+            </w:r>
+            <w:r>
+              <w:rPr>
+                <w:noProof/>
+              </w:rPr>
+              <w:instrText xml:space="preserve"> PAGEREF _Toc233304223 \h </w:instrText>
+            </w:r>
+            <w:r>
+              <w:rPr>
+                <w:noProof/>
+              </w:rPr>
+            </w:r>
+            <w:r>
+              <w:rPr>
+                <w:noProof/>
+              </w:rPr>
               <w:fldChar w:fldCharType="separate"/>
-              <w:t>4</w:t>
+            </w:r>
+            <w:r>
+              <w:rPr>
+                <w:noProof/>
+              </w:rPr>
+              <w:t>5</w:t>
+            </w:r>
+            <w:r>
+              <w:rPr>
+                <w:noProof/>
+              </w:rPr>
               <w:fldChar w:fldCharType="end"/>
             </w:r>
           </w:hyperlink>
@@ -497,10 +755,17 @@
               <w:tab w:val="right" w:leader="dot" w:pos="9062"/>
             </w:tabs>
             <w:rPr>
+              <w:rFonts w:asciiTheme="minorHAnsi" w:eastAsiaTheme="minorEastAsia" w:hAnsiTheme="minorHAnsi" w:cstheme="minorBidi"/>
               <w:noProof/>
+              <w:color w:val="auto"/>
+              <w:kern w:val="2"/>
+              <w:sz w:val="24"/>
+              <w:szCs w:val="24"/>
+              <w:lang w:val="en-IN"/>
+              <w14:ligatures w14:val="standardContextual"/>
             </w:rPr>
           </w:pPr>
-          <w:hyperlink w:anchor="_Toc233281604" w:history="1">
+          <w:hyperlink w:anchor="_Toc233304224" w:history="1">
             <w:r>
               <w:rPr>
                 <w:rStyle w:val="Hyperlink"/>
@@ -513,10 +778,40 @@
                 <w:noProof/>
               </w:rPr>
               <w:tab/>
-              <w:fldChar w:fldCharType="begin" w:dirty="true"/>
-              <w:instrText xml:space="preserve"> PAGEREF _Toc233281604 \h </w:instrText>
+            </w:r>
+            <w:r>
+              <w:rPr>
+                <w:noProof/>
+              </w:rPr>
+              <w:fldChar w:fldCharType="begin"/>
+            </w:r>
+            <w:r>
+              <w:rPr>
+                <w:noProof/>
+              </w:rPr>
+              <w:instrText xml:space="preserve"> PAGEREF _Toc233304224 \h </w:instrText>
+            </w:r>
+            <w:r>
+              <w:rPr>
+                <w:noProof/>
+              </w:rPr>
+            </w:r>
+            <w:r>
+              <w:rPr>
+                <w:noProof/>
+              </w:rPr>
               <w:fldChar w:fldCharType="separate"/>
+            </w:r>
+            <w:r>
+              <w:rPr>
+                <w:noProof/>
+              </w:rPr>
               <w:t>5</w:t>
+            </w:r>
+            <w:r>
+              <w:rPr>
+                <w:noProof/>
+              </w:rPr>
               <w:fldChar w:fldCharType="end"/>
             </w:r>
           </w:hyperlink>
@@ -528,10 +823,17 @@
               <w:tab w:val="right" w:leader="dot" w:pos="9062"/>
             </w:tabs>
             <w:rPr>
+              <w:rFonts w:asciiTheme="minorHAnsi" w:eastAsiaTheme="minorEastAsia" w:hAnsiTheme="minorHAnsi" w:cstheme="minorBidi"/>
               <w:noProof/>
+              <w:color w:val="auto"/>
+              <w:kern w:val="2"/>
+              <w:sz w:val="24"/>
+              <w:szCs w:val="24"/>
+              <w:lang w:val="en-IN"/>
+              <w14:ligatures w14:val="standardContextual"/>
             </w:rPr>
           </w:pPr>
-          <w:hyperlink w:anchor="_Toc233281605" w:history="1">
+          <w:hyperlink w:anchor="_Toc233304225" w:history="1">
             <w:r>
               <w:rPr>
                 <w:rStyle w:val="Hyperlink"/>
@@ -544,10 +846,40 @@
                 <w:noProof/>
               </w:rPr>
               <w:tab/>
-              <w:fldChar w:fldCharType="begin" w:dirty="true"/>
-              <w:instrText xml:space="preserve"> PAGEREF _Toc233281605 \h </w:instrText>
+            </w:r>
+            <w:r>
+              <w:rPr>
+                <w:noProof/>
+              </w:rPr>
+              <w:fldChar w:fldCharType="begin"/>
+            </w:r>
+            <w:r>
+              <w:rPr>
+                <w:noProof/>
+              </w:rPr>
+              <w:instrText xml:space="preserve"> PAGEREF _Toc233304225 \h </w:instrText>
+            </w:r>
+            <w:r>
+              <w:rPr>
+                <w:noProof/>
+              </w:rPr>
+            </w:r>
+            <w:r>
+              <w:rPr>
+                <w:noProof/>
+              </w:rPr>
               <w:fldChar w:fldCharType="separate"/>
-              <w:t>5</w:t>
+            </w:r>
+            <w:r>
+              <w:rPr>
+                <w:noProof/>
+              </w:rPr>
+              <w:t>6</w:t>
+            </w:r>
+            <w:r>
+              <w:rPr>
+                <w:noProof/>
+              </w:rPr>
               <w:fldChar w:fldCharType="end"/>
             </w:r>
           </w:hyperlink>
@@ -559,10 +891,17 @@
               <w:tab w:val="right" w:leader="dot" w:pos="9062"/>
             </w:tabs>
             <w:rPr>
+              <w:rFonts w:asciiTheme="minorHAnsi" w:eastAsiaTheme="minorEastAsia" w:hAnsiTheme="minorHAnsi" w:cstheme="minorBidi"/>
               <w:noProof/>
+              <w:color w:val="auto"/>
+              <w:kern w:val="2"/>
+              <w:sz w:val="24"/>
+              <w:szCs w:val="24"/>
+              <w:lang w:val="en-IN"/>
+              <w14:ligatures w14:val="standardContextual"/>
             </w:rPr>
           </w:pPr>
-          <w:hyperlink w:anchor="_Toc233281606" w:history="1">
+          <w:hyperlink w:anchor="_Toc233304226" w:history="1">
             <w:r>
               <w:rPr>
                 <w:rStyle w:val="Hyperlink"/>
@@ -575,10 +914,40 @@
                 <w:noProof/>
               </w:rPr>
               <w:tab/>
-              <w:fldChar w:fldCharType="begin" w:dirty="true"/>
-              <w:instrText xml:space="preserve"> PAGEREF _Toc233281606 \h </w:instrText>
+            </w:r>
+            <w:r>
+              <w:rPr>
+                <w:noProof/>
+              </w:rPr>
+              <w:fldChar w:fldCharType="begin"/>
+            </w:r>
+            <w:r>
+              <w:rPr>
+                <w:noProof/>
+              </w:rPr>
+              <w:instrText xml:space="preserve"> PAGEREF _Toc233304226 \h </w:instrText>
+            </w:r>
+            <w:r>
+              <w:rPr>
+                <w:noProof/>
+              </w:rPr>
+            </w:r>
+            <w:r>
+              <w:rPr>
+                <w:noProof/>
+              </w:rPr>
               <w:fldChar w:fldCharType="separate"/>
-              <w:t>6</w:t>
+            </w:r>
+            <w:r>
+              <w:rPr>
+                <w:noProof/>
+              </w:rPr>
+              <w:t>7</w:t>
+            </w:r>
+            <w:r>
+              <w:rPr>
+                <w:noProof/>
+              </w:rPr>
               <w:fldChar w:fldCharType="end"/>
             </w:r>
           </w:hyperlink>
@@ -590,10 +959,17 @@
               <w:tab w:val="right" w:leader="dot" w:pos="9062"/>
             </w:tabs>
             <w:rPr>
+              <w:rFonts w:asciiTheme="minorHAnsi" w:eastAsiaTheme="minorEastAsia" w:hAnsiTheme="minorHAnsi" w:cstheme="minorBidi"/>
               <w:noProof/>
+              <w:color w:val="auto"/>
+              <w:kern w:val="2"/>
+              <w:sz w:val="24"/>
+              <w:szCs w:val="24"/>
+              <w:lang w:val="en-IN"/>
+              <w14:ligatures w14:val="standardContextual"/>
             </w:rPr>
           </w:pPr>
-          <w:hyperlink w:anchor="_Toc233281607" w:history="1">
+          <w:hyperlink w:anchor="_Toc233304227" w:history="1">
             <w:r>
               <w:rPr>
                 <w:rStyle w:val="Hyperlink"/>
@@ -606,10 +982,40 @@
                 <w:noProof/>
               </w:rPr>
               <w:tab/>
-              <w:fldChar w:fldCharType="begin" w:dirty="true"/>
-              <w:instrText xml:space="preserve"> PAGEREF _Toc233281607 \h </w:instrText>
+            </w:r>
+            <w:r>
+              <w:rPr>
+                <w:noProof/>
+              </w:rPr>
+              <w:fldChar w:fldCharType="begin"/>
+            </w:r>
+            <w:r>
+              <w:rPr>
+                <w:noProof/>
+              </w:rPr>
+              <w:instrText xml:space="preserve"> PAGEREF _Toc233304227 \h </w:instrText>
+            </w:r>
+            <w:r>
+              <w:rPr>
+                <w:noProof/>
+              </w:rPr>
+            </w:r>
+            <w:r>
+              <w:rPr>
+                <w:noProof/>
+              </w:rPr>
               <w:fldChar w:fldCharType="separate"/>
+            </w:r>
+            <w:r>
+              <w:rPr>
+                <w:noProof/>
+              </w:rPr>
               <w:t>7</w:t>
+            </w:r>
+            <w:r>
+              <w:rPr>
+                <w:noProof/>
+              </w:rPr>
               <w:fldChar w:fldCharType="end"/>
             </w:r>
           </w:hyperlink>
@@ -621,10 +1027,17 @@
               <w:tab w:val="right" w:leader="dot" w:pos="9062"/>
             </w:tabs>
             <w:rPr>
+              <w:rFonts w:asciiTheme="minorHAnsi" w:eastAsiaTheme="minorEastAsia" w:hAnsiTheme="minorHAnsi" w:cstheme="minorBidi"/>
               <w:noProof/>
+              <w:color w:val="auto"/>
+              <w:kern w:val="2"/>
+              <w:sz w:val="24"/>
+              <w:szCs w:val="24"/>
+              <w:lang w:val="en-IN"/>
+              <w14:ligatures w14:val="standardContextual"/>
             </w:rPr>
           </w:pPr>
-          <w:hyperlink w:anchor="_Toc233281608" w:history="1">
+          <w:hyperlink w:anchor="_Toc233304228" w:history="1">
             <w:r>
               <w:rPr>
                 <w:rStyle w:val="Hyperlink"/>
@@ -637,10 +1050,40 @@
                 <w:noProof/>
               </w:rPr>
               <w:tab/>
-              <w:fldChar w:fldCharType="begin" w:dirty="true"/>
-              <w:instrText xml:space="preserve"> PAGEREF _Toc233281608 \h </w:instrText>
+            </w:r>
+            <w:r>
+              <w:rPr>
+                <w:noProof/>
+              </w:rPr>
+              <w:fldChar w:fldCharType="begin"/>
+            </w:r>
+            <w:r>
+              <w:rPr>
+                <w:noProof/>
+              </w:rPr>
+              <w:instrText xml:space="preserve"> PAGEREF _Toc233304228 \h </w:instrText>
+            </w:r>
+            <w:r>
+              <w:rPr>
+                <w:noProof/>
+              </w:rPr>
+            </w:r>
+            <w:r>
+              <w:rPr>
+                <w:noProof/>
+              </w:rPr>
               <w:fldChar w:fldCharType="separate"/>
-              <w:t>7</w:t>
+            </w:r>
+            <w:r>
+              <w:rPr>
+                <w:noProof/>
+              </w:rPr>
+              <w:t>8</w:t>
+            </w:r>
+            <w:r>
+              <w:rPr>
+                <w:noProof/>
+              </w:rPr>
               <w:fldChar w:fldCharType="end"/>
             </w:r>
           </w:hyperlink>
@@ -652,10 +1095,17 @@
               <w:tab w:val="right" w:leader="dot" w:pos="9062"/>
             </w:tabs>
             <w:rPr>
+              <w:rFonts w:asciiTheme="minorHAnsi" w:eastAsiaTheme="minorEastAsia" w:hAnsiTheme="minorHAnsi" w:cstheme="minorBidi"/>
               <w:noProof/>
+              <w:color w:val="auto"/>
+              <w:kern w:val="2"/>
+              <w:sz w:val="24"/>
+              <w:szCs w:val="24"/>
+              <w:lang w:val="en-IN"/>
+              <w14:ligatures w14:val="standardContextual"/>
             </w:rPr>
           </w:pPr>
-          <w:hyperlink w:anchor="_Toc233281609" w:history="1">
+          <w:hyperlink w:anchor="_Toc233304229" w:history="1">
             <w:r>
               <w:rPr>
                 <w:rStyle w:val="Hyperlink"/>
@@ -668,10 +1118,40 @@
                 <w:noProof/>
               </w:rPr>
               <w:tab/>
-              <w:fldChar w:fldCharType="begin" w:dirty="true"/>
-              <w:instrText xml:space="preserve"> PAGEREF _Toc233281609 \h </w:instrText>
+            </w:r>
+            <w:r>
+              <w:rPr>
+                <w:noProof/>
+              </w:rPr>
+              <w:fldChar w:fldCharType="begin"/>
+            </w:r>
+            <w:r>
+              <w:rPr>
+                <w:noProof/>
+              </w:rPr>
+              <w:instrText xml:space="preserve"> PAGEREF _Toc233304229 \h </w:instrText>
+            </w:r>
+            <w:r>
+              <w:rPr>
+                <w:noProof/>
+              </w:rPr>
+            </w:r>
+            <w:r>
+              <w:rPr>
+                <w:noProof/>
+              </w:rPr>
               <w:fldChar w:fldCharType="separate"/>
-              <w:t>7</w:t>
+            </w:r>
+            <w:r>
+              <w:rPr>
+                <w:noProof/>
+              </w:rPr>
+              <w:t>8</w:t>
+            </w:r>
+            <w:r>
+              <w:rPr>
+                <w:noProof/>
+              </w:rPr>
               <w:fldChar w:fldCharType="end"/>
             </w:r>
           </w:hyperlink>
@@ -683,10 +1163,17 @@
               <w:tab w:val="right" w:leader="dot" w:pos="9062"/>
             </w:tabs>
             <w:rPr>
+              <w:rFonts w:asciiTheme="minorHAnsi" w:eastAsiaTheme="minorEastAsia" w:hAnsiTheme="minorHAnsi" w:cstheme="minorBidi"/>
               <w:noProof/>
+              <w:color w:val="auto"/>
+              <w:kern w:val="2"/>
+              <w:sz w:val="24"/>
+              <w:szCs w:val="24"/>
+              <w:lang w:val="en-IN"/>
+              <w14:ligatures w14:val="standardContextual"/>
             </w:rPr>
           </w:pPr>
-          <w:hyperlink w:anchor="_Toc233281610" w:history="1">
+          <w:hyperlink w:anchor="_Toc233304230" w:history="1">
             <w:r>
               <w:rPr>
                 <w:rStyle w:val="Hyperlink"/>
@@ -699,10 +1186,40 @@
                 <w:noProof/>
               </w:rPr>
               <w:tab/>
-              <w:fldChar w:fldCharType="begin" w:dirty="true"/>
-              <w:instrText xml:space="preserve"> PAGEREF _Toc233281610 \h </w:instrText>
+            </w:r>
+            <w:r>
+              <w:rPr>
+                <w:noProof/>
+              </w:rPr>
+              <w:fldChar w:fldCharType="begin"/>
+            </w:r>
+            <w:r>
+              <w:rPr>
+                <w:noProof/>
+              </w:rPr>
+              <w:instrText xml:space="preserve"> PAGEREF _Toc233304230 \h </w:instrText>
+            </w:r>
+            <w:r>
+              <w:rPr>
+                <w:noProof/>
+              </w:rPr>
+            </w:r>
+            <w:r>
+              <w:rPr>
+                <w:noProof/>
+              </w:rPr>
               <w:fldChar w:fldCharType="separate"/>
+            </w:r>
+            <w:r>
+              <w:rPr>
+                <w:noProof/>
+              </w:rPr>
               <w:t>8</w:t>
+            </w:r>
+            <w:r>
+              <w:rPr>
+                <w:noProof/>
+              </w:rPr>
               <w:fldChar w:fldCharType="end"/>
             </w:r>
           </w:hyperlink>
@@ -714,10 +1231,17 @@
               <w:tab w:val="right" w:leader="dot" w:pos="9062"/>
             </w:tabs>
             <w:rPr>
+              <w:rFonts w:asciiTheme="minorHAnsi" w:eastAsiaTheme="minorEastAsia" w:hAnsiTheme="minorHAnsi" w:cstheme="minorBidi"/>
               <w:noProof/>
+              <w:color w:val="auto"/>
+              <w:kern w:val="2"/>
+              <w:sz w:val="24"/>
+              <w:szCs w:val="24"/>
+              <w:lang w:val="en-IN"/>
+              <w14:ligatures w14:val="standardContextual"/>
             </w:rPr>
           </w:pPr>
-          <w:hyperlink w:anchor="_Toc233281611" w:history="1">
+          <w:hyperlink w:anchor="_Toc233304231" w:history="1">
             <w:r>
               <w:rPr>
                 <w:rStyle w:val="Hyperlink"/>
@@ -730,10 +1254,40 @@
                 <w:noProof/>
               </w:rPr>
               <w:tab/>
-              <w:fldChar w:fldCharType="begin" w:dirty="true"/>
-              <w:instrText xml:space="preserve"> PAGEREF _Toc233281611 \h </w:instrText>
+            </w:r>
+            <w:r>
+              <w:rPr>
+                <w:noProof/>
+              </w:rPr>
+              <w:fldChar w:fldCharType="begin"/>
+            </w:r>
+            <w:r>
+              <w:rPr>
+                <w:noProof/>
+              </w:rPr>
+              <w:instrText xml:space="preserve"> PAGEREF _Toc233304231 \h </w:instrText>
+            </w:r>
+            <w:r>
+              <w:rPr>
+                <w:noProof/>
+              </w:rPr>
+            </w:r>
+            <w:r>
+              <w:rPr>
+                <w:noProof/>
+              </w:rPr>
               <w:fldChar w:fldCharType="separate"/>
-              <w:t>8</w:t>
+            </w:r>
+            <w:r>
+              <w:rPr>
+                <w:noProof/>
+              </w:rPr>
+              <w:t>9</w:t>
+            </w:r>
+            <w:r>
+              <w:rPr>
+                <w:noProof/>
+              </w:rPr>
               <w:fldChar w:fldCharType="end"/>
             </w:r>
           </w:hyperlink>
@@ -745,10 +1299,17 @@
               <w:tab w:val="right" w:leader="dot" w:pos="9062"/>
             </w:tabs>
             <w:rPr>
+              <w:rFonts w:asciiTheme="minorHAnsi" w:eastAsiaTheme="minorEastAsia" w:hAnsiTheme="minorHAnsi" w:cstheme="minorBidi"/>
               <w:noProof/>
+              <w:color w:val="auto"/>
+              <w:kern w:val="2"/>
+              <w:sz w:val="24"/>
+              <w:szCs w:val="24"/>
+              <w:lang w:val="en-IN"/>
+              <w14:ligatures w14:val="standardContextual"/>
             </w:rPr>
           </w:pPr>
-          <w:hyperlink w:anchor="_Toc233281612" w:history="1">
+          <w:hyperlink w:anchor="_Toc233304232" w:history="1">
             <w:r>
               <w:rPr>
                 <w:rStyle w:val="Hyperlink"/>
@@ -761,10 +1322,40 @@
                 <w:noProof/>
               </w:rPr>
               <w:tab/>
-              <w:fldChar w:fldCharType="begin" w:dirty="true"/>
-              <w:instrText xml:space="preserve"> PAGEREF _Toc233281612 \h </w:instrText>
+            </w:r>
+            <w:r>
+              <w:rPr>
+                <w:noProof/>
+              </w:rPr>
+              <w:fldChar w:fldCharType="begin"/>
+            </w:r>
+            <w:r>
+              <w:rPr>
+                <w:noProof/>
+              </w:rPr>
+              <w:instrText xml:space="preserve"> PAGEREF _Toc233304232 \h </w:instrText>
+            </w:r>
+            <w:r>
+              <w:rPr>
+                <w:noProof/>
+              </w:rPr>
+            </w:r>
+            <w:r>
+              <w:rPr>
+                <w:noProof/>
+              </w:rPr>
               <w:fldChar w:fldCharType="separate"/>
+            </w:r>
+            <w:r>
+              <w:rPr>
+                <w:noProof/>
+              </w:rPr>
               <w:t>9</w:t>
+            </w:r>
+            <w:r>
+              <w:rPr>
+                <w:noProof/>
+              </w:rPr>
               <w:fldChar w:fldCharType="end"/>
             </w:r>
           </w:hyperlink>
@@ -776,10 +1367,17 @@
               <w:tab w:val="right" w:leader="dot" w:pos="9062"/>
             </w:tabs>
             <w:rPr>
+              <w:rFonts w:asciiTheme="minorHAnsi" w:eastAsiaTheme="minorEastAsia" w:hAnsiTheme="minorHAnsi" w:cstheme="minorBidi"/>
               <w:noProof/>
+              <w:color w:val="auto"/>
+              <w:kern w:val="2"/>
+              <w:sz w:val="24"/>
+              <w:szCs w:val="24"/>
+              <w:lang w:val="en-IN"/>
+              <w14:ligatures w14:val="standardContextual"/>
             </w:rPr>
           </w:pPr>
-          <w:hyperlink w:anchor="_Toc233281613" w:history="1">
+          <w:hyperlink w:anchor="_Toc233304233" w:history="1">
             <w:r>
               <w:rPr>
                 <w:rStyle w:val="Hyperlink"/>
@@ -792,10 +1390,40 @@
                 <w:noProof/>
               </w:rPr>
               <w:tab/>
-              <w:fldChar w:fldCharType="begin" w:dirty="true"/>
-              <w:instrText xml:space="preserve"> PAGEREF _Toc233281613 \h </w:instrText>
+            </w:r>
+            <w:r>
+              <w:rPr>
+                <w:noProof/>
+              </w:rPr>
+              <w:fldChar w:fldCharType="begin"/>
+            </w:r>
+            <w:r>
+              <w:rPr>
+                <w:noProof/>
+              </w:rPr>
+              <w:instrText xml:space="preserve"> PAGEREF _Toc233304233 \h </w:instrText>
+            </w:r>
+            <w:r>
+              <w:rPr>
+                <w:noProof/>
+              </w:rPr>
+            </w:r>
+            <w:r>
+              <w:rPr>
+                <w:noProof/>
+              </w:rPr>
               <w:fldChar w:fldCharType="separate"/>
-              <w:t>10</w:t>
+            </w:r>
+            <w:r>
+              <w:rPr>
+                <w:noProof/>
+              </w:rPr>
+              <w:t>11</w:t>
+            </w:r>
+            <w:r>
+              <w:rPr>
+                <w:noProof/>
+              </w:rPr>
               <w:fldChar w:fldCharType="end"/>
             </w:r>
           </w:hyperlink>
@@ -819,7 +1447,7 @@
           <w:bottom w:val="single" w:sz="8" w:space="6" w:color="15406B"/>
         </w:pBdr>
       </w:pPr>
-      <w:bookmarkStart w:id="2" w:name="_Toc233281599"/>
+      <w:bookmarkStart w:id="2" w:name="_Toc233304219"/>
       <w:r>
         <w:lastRenderedPageBreak/>
         <w:t>1. Project Description</w:t>
@@ -862,7 +1490,7 @@
           <w:bottom w:val="single" w:sz="8" w:space="6" w:color="15406B"/>
         </w:pBdr>
       </w:pPr>
-      <w:bookmarkStart w:id="3" w:name="_Toc233281600"/>
+      <w:bookmarkStart w:id="3" w:name="_Toc233304220"/>
       <w:r>
         <w:t>2. Aims and Requirements</w:t>
       </w:r>
@@ -872,7 +1500,7 @@
       <w:pPr>
         <w:pStyle w:val="Heading2"/>
       </w:pPr>
-      <w:bookmarkStart w:id="4" w:name="_Toc233281601"/>
+      <w:bookmarkStart w:id="4" w:name="_Toc233304221"/>
       <w:r>
         <w:t>2.1 Aims</w:t>
       </w:r>
@@ -924,7 +1552,7 @@
       <w:pPr>
         <w:pStyle w:val="Heading2"/>
       </w:pPr>
-      <w:bookmarkStart w:id="5" w:name="_Toc233281602"/>
+      <w:bookmarkStart w:id="5" w:name="_Toc233304222"/>
       <w:r>
         <w:t>2.2 Requirements: Essential</w:t>
       </w:r>
@@ -1004,7 +1632,7 @@
       <w:pPr>
         <w:pStyle w:val="Heading2"/>
       </w:pPr>
-      <w:bookmarkStart w:id="6" w:name="_Toc233281603"/>
+      <w:bookmarkStart w:id="6" w:name="_Toc233304223"/>
       <w:r>
         <w:lastRenderedPageBreak/>
         <w:t>2.3 Requirements: Desirable</w:t>
@@ -1046,7 +1674,7 @@
           <w:bottom w:val="single" w:sz="8" w:space="6" w:color="15406B"/>
         </w:pBdr>
       </w:pPr>
-      <w:bookmarkStart w:id="7" w:name="_Toc233281604"/>
+      <w:bookmarkStart w:id="7" w:name="_Toc233304224"/>
       <w:r>
         <w:t>3. Key Literature and Background Reading</w:t>
       </w:r>
@@ -1183,7 +1811,7 @@
           <w:bottom w:val="single" w:sz="8" w:space="6" w:color="15406B"/>
         </w:pBdr>
       </w:pPr>
-      <w:bookmarkStart w:id="8" w:name="_Toc233281605"/>
+      <w:bookmarkStart w:id="8" w:name="_Toc233304225"/>
       <w:r>
         <w:lastRenderedPageBreak/>
         <w:t>4. Development and Implementation Summary</w:t>
@@ -1192,7 +1820,7 @@
     </w:p>
     <w:p>
       <w:pPr>
-        <w:spacing w:after="180" w:line="360" w:lineRule="auto"/>
+        <w:spacing w:after="120" w:line="240" w:lineRule="auto"/>
         <w:jc w:val="both"/>
       </w:pPr>
       <w:r>
@@ -1201,17 +1829,11 @@
     </w:p>
     <w:p>
       <w:pPr>
-        <w:spacing w:after="180" w:line="360" w:lineRule="auto"/>
+        <w:spacing w:after="120" w:line="240" w:lineRule="auto"/>
         <w:jc w:val="both"/>
       </w:pPr>
       <w:r>
-        <w:t xml:space="preserve">ChromaDB provides the local vector store for P1, </w:t>
-      </w:r>
-      <w:r>
-        <w:t>rank_bm25</w:t>
-      </w:r>
-      <w:r>
-        <w:t xml:space="preserve"> provides the keyword index for P2, and a cached LlamaIndex SummaryIndex provides the structural pipeline for P3. A single SQLite database, run in Write-Ahead Logging mode, is the sole state store; every benchmark run commits immediately, so a crash resumes from the last written row rather than re-spending free-tier quota. Asynchronous worker pools, bounded by a semaphore and wrapped in an exponential-backoff retry layer, keep concurrent API calls within Groq’s free-tier rate limits. Workflow is organised phase-by-phase as set out in Section 10, with the code for each phase committed and exercised under a three-item local throttle before being released at full scale, so a fault discovered in one phase is never allowed to consume the free-tier quota reserved for an earlier or later phase.</w:t>
+        <w:t>ChromaDB provides the local vector store for P1, rank_bm25 provides the keyword index for P2, and a cached LlamaIndex SummaryIndex provides the structural pipeline for P3. A single SQLite database, run in Write-Ahead Logging mode, is the sole state store; every benchmark run commits immediately, so a crash resumes from the last written row rather than re-spending free-tier quota. Asynchronous worker pools, bounded by a semaphore and wrapped in an exponential-backoff retry layer, keep concurrent API calls within Groq’s free-tier rate limits. Workflow is organised phase-by-phase as set out in Section 10, with the code for each phase committed and exercised under a three-item local throttle before being released at full scale, so a fault discovered in one phase is never allowed to consume the free-tier quota reserved for an earlier or later phase.</w:t>
       </w:r>
     </w:p>
     <w:tbl>
@@ -1757,7 +2379,7 @@
           <w:bottom w:val="single" w:sz="8" w:space="6" w:color="15406B"/>
         </w:pBdr>
       </w:pPr>
-      <w:bookmarkStart w:id="9" w:name="_Toc233281606"/>
+      <w:bookmarkStart w:id="9" w:name="_Toc233304226"/>
       <w:r>
         <w:lastRenderedPageBreak/>
         <w:t>5. Data Sources</w:t>
@@ -1856,7 +2478,7 @@
           <w:bottom w:val="single" w:sz="8" w:space="6" w:color="15406B"/>
         </w:pBdr>
       </w:pPr>
-      <w:bookmarkStart w:id="10" w:name="_Toc233281607"/>
+      <w:bookmarkStart w:id="10" w:name="_Toc233304227"/>
       <w:r>
         <w:t>6. Testing and Evaluation</w:t>
       </w:r>
@@ -2027,7 +2649,7 @@
           <w:bottom w:val="single" w:sz="8" w:space="6" w:color="15406B"/>
         </w:pBdr>
       </w:pPr>
-      <w:bookmarkStart w:id="11" w:name="_Toc233281608"/>
+      <w:bookmarkStart w:id="11" w:name="_Toc233304228"/>
       <w:r>
         <w:lastRenderedPageBreak/>
         <w:t>7. Project Ethics and Human Participants</w:t>
@@ -2050,7 +2672,7 @@
           <w:bottom w:val="single" w:sz="8" w:space="6" w:color="15406B"/>
         </w:pBdr>
       </w:pPr>
-      <w:bookmarkStart w:id="12" w:name="_Toc233281609"/>
+      <w:bookmarkStart w:id="12" w:name="_Toc233304229"/>
       <w:r>
         <w:t>8. BCS Project Criteria</w:t>
       </w:r>
@@ -2147,7 +2769,7 @@
           <w:bottom w:val="single" w:sz="8" w:space="6" w:color="15406B"/>
         </w:pBdr>
       </w:pPr>
-      <w:bookmarkStart w:id="13" w:name="_Toc233281610"/>
+      <w:bookmarkStart w:id="13" w:name="_Toc233304230"/>
       <w:r>
         <w:t>9. UI/UX Mockup</w:t>
       </w:r>
@@ -2159,9 +2781,11 @@
         <w:jc w:val="both"/>
       </w:pPr>
       <w:r>
-        <w:t xml:space="preserve">This is a research and benchmarking system rather than an end-user application, so its principal “interface” is the results comparison view produced at the end of the run and consulted directly in the dissertation analysis. Day to day, the researcher’s surface is a command line: a phase is started with a single script invocation (for example, running the benchmark executor for a given phase), progress and free-tier token usage are checked by glancing at the run log and the index-build cost </w:t>
+        <w:t xml:space="preserve">This is a research and benchmarking system rather than an end-user application, so its principal “interface” is the results comparison view produced at the end of the run and consulted directly in the dissertation </w:t>
+      </w:r>
+      <w:r>
         <w:lastRenderedPageBreak/>
-        <w:t>file, and intermediate results are inspected directly with SQL queries against the results table while a long phase is still in progress. A wireframe sketch of the final comparison view, the artefact the researcher consults most, is shown below.</w:t>
+        <w:t>analysis. Day to day, the researcher’s surface is a command line: a phase is started with a single script invocation (for example, running the benchmark executor for a given phase), progress and free-tier token usage are checked by glancing at the run log and the index-build cost file, and intermediate results are inspected directly with SQL queries against the results table while a long phase is still in progress. A wireframe sketch of the final comparison view, the artefact the researcher consults most, is shown below.</w:t>
       </w:r>
     </w:p>
     <w:tbl>
@@ -2192,6 +2816,7 @@
       <w:tr>
         <w:trPr>
           <w:cantSplit/>
+          <w:tblHeader/>
         </w:trPr>
         <w:tc>
           <w:tcPr>
@@ -3006,7 +3631,7 @@
           <w:bottom w:val="single" w:sz="8" w:space="6" w:color="15406B"/>
         </w:pBdr>
       </w:pPr>
-      <w:bookmarkStart w:id="14" w:name="_Toc233281611"/>
+      <w:bookmarkStart w:id="14" w:name="_Toc233304231"/>
       <w:r>
         <w:t>10. Project Plan</w:t>
       </w:r>
@@ -3054,6 +3679,7 @@
       <w:tr>
         <w:trPr>
           <w:cantSplit/>
+          <w:tblHeader/>
         </w:trPr>
         <w:tc>
           <w:tcPr>
@@ -5333,7 +5959,7 @@
           <w:bottom w:val="single" w:sz="8" w:space="6" w:color="15406B"/>
         </w:pBdr>
       </w:pPr>
-      <w:bookmarkStart w:id="15" w:name="_Toc233281612"/>
+      <w:bookmarkStart w:id="15" w:name="_Toc233304232"/>
       <w:r>
         <w:t>11. Risks and Contingency Plans</w:t>
       </w:r>
@@ -5365,6 +5991,7 @@
       <w:tr>
         <w:trPr>
           <w:cantSplit/>
+          <w:tblHeader/>
         </w:trPr>
         <w:tc>
           <w:tcPr>
@@ -5373,7 +6000,7 @@
               <w:top w:val="single" w:sz="4" w:space="0" w:color="B7BCC2"/>
               <w:left w:val="single" w:sz="4" w:space="0" w:color="B7BCC2"/>
               <w:bottom w:val="single" w:sz="4" w:space="0" w:color="B7BCC2"/>
-              <w:right w:val="nil"/>
+              <w:right w:val="single" w:sz="4" w:space="0" w:color="auto"/>
             </w:tcBorders>
             <w:shd w:val="clear" w:color="auto" w:fill="15406B"/>
             <w:tcMar>
@@ -5402,10 +6029,10 @@
           <w:tcPr>
             <w:tcW w:w="4300" w:type="dxa"/>
             <w:tcBorders>
-              <w:top w:val="single" w:sz="4" w:space="0" w:color="B7BCC2"/>
-              <w:left w:val="nil"/>
-              <w:bottom w:val="single" w:sz="4" w:space="0" w:color="B7BCC2"/>
-              <w:right w:val="nil"/>
+              <w:top w:val="single" w:sz="4" w:space="0" w:color="auto"/>
+              <w:left w:val="single" w:sz="4" w:space="0" w:color="auto"/>
+              <w:bottom w:val="single" w:sz="4" w:space="0" w:color="auto"/>
+              <w:right w:val="single" w:sz="4" w:space="0" w:color="auto"/>
             </w:tcBorders>
             <w:shd w:val="clear" w:color="auto" w:fill="15406B"/>
             <w:tcMar>
@@ -5435,7 +6062,7 @@
             <w:tcW w:w="1186" w:type="dxa"/>
             <w:tcBorders>
               <w:top w:val="single" w:sz="4" w:space="0" w:color="B7BCC2"/>
-              <w:left w:val="nil"/>
+              <w:left w:val="single" w:sz="4" w:space="0" w:color="auto"/>
               <w:bottom w:val="single" w:sz="4" w:space="0" w:color="B7BCC2"/>
               <w:right w:val="nil"/>
             </w:tcBorders>
@@ -5538,7 +6165,7 @@
           <w:tcPr>
             <w:tcW w:w="4300" w:type="dxa"/>
             <w:tcBorders>
-              <w:top w:val="single" w:sz="4" w:space="0" w:color="B7BCC2"/>
+              <w:top w:val="single" w:sz="4" w:space="0" w:color="auto"/>
               <w:left w:val="nil"/>
               <w:bottom w:val="single" w:sz="4" w:space="0" w:color="B7BCC2"/>
               <w:right w:val="nil"/>
@@ -5663,6 +6290,7 @@
                 <w:sz w:val="19"/>
                 <w:szCs w:val="19"/>
               </w:rPr>
+              <w:lastRenderedPageBreak/>
               <w:t>LlamaParse fragments or bisects a financial table</w:t>
             </w:r>
           </w:p>
@@ -5929,7 +6557,6 @@
                 <w:sz w:val="19"/>
                 <w:szCs w:val="19"/>
               </w:rPr>
-              <w:lastRenderedPageBreak/>
               <w:t>Breaking API changes in a fast-moving dependency (LlamaIndex)</w:t>
             </w:r>
           </w:p>
@@ -6461,7 +7088,7 @@
           <w:bottom w:val="single" w:sz="8" w:space="6" w:color="15406B"/>
         </w:pBdr>
       </w:pPr>
-      <w:bookmarkStart w:id="16" w:name="_Toc233281613"/>
+      <w:bookmarkStart w:id="16" w:name="_Toc233304233"/>
       <w:r>
         <w:lastRenderedPageBreak/>
         <w:t>12. References</w:t>
@@ -6475,10 +7102,6 @@
         <w:jc w:val="both"/>
       </w:pPr>
       <w:r>
-        <w:rPr>
-          <w:sz w:val="22"/>
-          <w:szCs w:val="22"/>
-        </w:rPr>
         <w:t>Chen, Z., Chen, W., Smiley, C., Shah, S., Borova, I., Langdon, D., Moussa, R., Beane, M., Huang, T.-H., Routledge, B. and Wang, W.Y. (2021) 'FinQA: A Dataset of Numerical Reasoning over Financial Data', Proceedings of the 2021 Conference on Empirical Methods in Natural Language Processing (EMNLP 2021), pp. 3697–3711.</w:t>
       </w:r>
     </w:p>
@@ -6489,10 +7112,6 @@
         <w:jc w:val="both"/>
       </w:pPr>
       <w:r>
-        <w:rPr>
-          <w:sz w:val="22"/>
-          <w:szCs w:val="22"/>
-        </w:rPr>
         <w:t>Karpukhin, V., Oguz, B., Min, S., Lewis, P., Wu, L., Edunov, S., Chen, D. and Yih, W.-t. (2020) 'Dense Passage Retrieval for Open-Domain Question Answering', Proceedings of the 2020 Conference on Empirical Methods in Natural Language Processing (EMNLP 2020), pp. 6769–6781.</w:t>
       </w:r>
     </w:p>
@@ -6503,10 +7122,6 @@
         <w:jc w:val="both"/>
       </w:pPr>
       <w:r>
-        <w:rPr>
-          <w:sz w:val="22"/>
-          <w:szCs w:val="22"/>
-        </w:rPr>
         <w:t>Lewis, P., Perez, E., Piktus, A., Petroni, F., Karpukhin, V., Goyal, N., Küttler, H., Lewis, M., Yih, W.-t., Rocktäschel, T., Riedel, S. and Kiela, D. (2020) 'Retrieval-Augmented Generation for Knowledge-Intensive NLP Tasks', Advances in Neural Information Processing Systems, 33 (NeurIPS 2020).</w:t>
       </w:r>
     </w:p>
@@ -6517,10 +7132,6 @@
         <w:jc w:val="both"/>
       </w:pPr>
       <w:r>
-        <w:rPr>
-          <w:sz w:val="22"/>
-          <w:szCs w:val="22"/>
-        </w:rPr>
         <w:t>Liu, N.F., Lin, K., Hewitt, J., Paranjape, A., Bevilacqua, M., Petroni, F. and Liang, P. (2024) 'Lost in the Middle: How Language Models Use Long Contexts', Transactions of the Association for Computational Linguistics, 12, pp. 157–173.</w:t>
       </w:r>
     </w:p>
@@ -6531,10 +7142,6 @@
         <w:jc w:val="both"/>
       </w:pPr>
       <w:r>
-        <w:rPr>
-          <w:sz w:val="22"/>
-          <w:szCs w:val="22"/>
-        </w:rPr>
         <w:t>Nogueira, R. and Cho, K. (2019) 'Passage Re-ranking with BERT', arXiv preprint, arXiv:1901.04085.</w:t>
       </w:r>
     </w:p>
@@ -6545,10 +7152,6 @@
         <w:jc w:val="both"/>
       </w:pPr>
       <w:r>
-        <w:rPr>
-          <w:sz w:val="22"/>
-          <w:szCs w:val="22"/>
-        </w:rPr>
         <w:t>Robertson, S. and Zaragoza, H. (2009) 'The Probabilistic Relevance Framework: BM25 and Beyond', Foundations and Trends in Information Retrieval, 3(4), pp. 333–389.</w:t>
       </w:r>
     </w:p>
@@ -6559,10 +7162,6 @@
         <w:jc w:val="both"/>
       </w:pPr>
       <w:r>
-        <w:rPr>
-          <w:sz w:val="22"/>
-          <w:szCs w:val="22"/>
-        </w:rPr>
         <w:t>Sarthi, P., Abdullah, S., Tuli, A., Khanna, S., Goldie, A. and Manning, C.D. (2024) 'RAPTOR: Recursive Abstractive Processing for Tree-Organized Retrieval', Proceedings of the International Conference on Learning Representations (ICLR 2024).</w:t>
       </w:r>
     </w:p>
@@ -6573,10 +7172,6 @@
         <w:jc w:val="both"/>
       </w:pPr>
       <w:r>
-        <w:rPr>
-          <w:sz w:val="22"/>
-          <w:szCs w:val="22"/>
-        </w:rPr>
         <w:t>Xiao, S., Liu, Z., Zhang, P. and Muennighoff, N. (2023) 'C-Pack: Packaged Resources to Advance General Chinese Embedding', arXiv preprint, arXiv:2309.07597.</w:t>
       </w:r>
     </w:p>
@@ -6587,10 +7182,6 @@
         <w:jc w:val="both"/>
       </w:pPr>
       <w:r>
-        <w:rPr>
-          <w:sz w:val="22"/>
-          <w:szCs w:val="22"/>
-        </w:rPr>
         <w:t>Zheng, L., Chiang, W.-L., Sheng, Y., Zhuang, S., Wu, Z., Zhuang, Y., Lin, Z., Li, Z., Li, D., Xing, E.P., Zhang, H., Gonzalez, J.E. and Stoica, I. (2023) 'Judging LLM-as-a-Judge with MT-Bench and Chatbot Arena', Advances in Neural Information Processing Systems, 36 (NeurIPS 2023).</w:t>
       </w:r>
     </w:p>

</xml_diff>

<commit_message>
Final draft for proposal.
</commit_message>
<xml_diff>
--- a/artifacts/Proposal_v1.0.0.docx
+++ b/artifacts/Proposal_v1.0.0.docx
@@ -43,7 +43,43 @@
           <w:sz w:val="26"/>
           <w:szCs w:val="26"/>
         </w:rPr>
-        <w:t>Design and Specification Proposal, COMP702 M.Sc. Project (2025/26)</w:t>
+        <w:t>Design and Specification Proposal, COMP702 M.Sc. Project (202</w:t>
+      </w:r>
+      <w:r>
+        <w:rPr>
+          <w:rFonts w:ascii="Calibri" w:eastAsia="Calibri" w:hAnsi="Calibri" w:cs="Calibri"/>
+          <w:color w:val="15406B"/>
+          <w:sz w:val="26"/>
+          <w:szCs w:val="26"/>
+        </w:rPr>
+        <w:t>6</w:t>
+      </w:r>
+      <w:r>
+        <w:rPr>
+          <w:rFonts w:ascii="Calibri" w:eastAsia="Calibri" w:hAnsi="Calibri" w:cs="Calibri"/>
+          <w:color w:val="15406B"/>
+          <w:sz w:val="26"/>
+          <w:szCs w:val="26"/>
+        </w:rPr>
+        <w:t>/2</w:t>
+      </w:r>
+      <w:r>
+        <w:rPr>
+          <w:rFonts w:ascii="Calibri" w:eastAsia="Calibri" w:hAnsi="Calibri" w:cs="Calibri"/>
+          <w:color w:val="15406B"/>
+          <w:sz w:val="26"/>
+          <w:szCs w:val="26"/>
+        </w:rPr>
+        <w:t>7</w:t>
+      </w:r>
+      <w:r>
+        <w:rPr>
+          <w:rFonts w:ascii="Calibri" w:eastAsia="Calibri" w:hAnsi="Calibri" w:cs="Calibri"/>
+          <w:color w:val="15406B"/>
+          <w:sz w:val="26"/>
+          <w:szCs w:val="26"/>
+        </w:rPr>
+        <w:t>)</w:t>
       </w:r>
     </w:p>
     <w:p>
@@ -139,6 +175,10 @@
       <w:pPr>
         <w:spacing w:before="260" w:after="50"/>
         <w:jc w:val="center"/>
+        <w:rPr>
+          <w:sz w:val="28"/>
+          <w:szCs w:val="28"/>
+        </w:rPr>
       </w:pPr>
       <w:r>
         <w:rPr>
@@ -146,8 +186,8 @@
           <w:b/>
           <w:bCs/>
           <w:color w:val="0A1F33"/>
-          <w:sz w:val="23"/>
-          <w:szCs w:val="23"/>
+          <w:sz w:val="28"/>
+          <w:szCs w:val="28"/>
         </w:rPr>
         <w:t>SCHOOL OF COMPUTER SCIENCE AND INFORMATICS</w:t>
       </w:r>
@@ -155,6 +195,10 @@
     <w:p>
       <w:pPr>
         <w:jc w:val="center"/>
+        <w:rPr>
+          <w:sz w:val="28"/>
+          <w:szCs w:val="28"/>
+        </w:rPr>
       </w:pPr>
       <w:r>
         <w:rPr>
@@ -162,8 +206,8 @@
           <w:b/>
           <w:bCs/>
           <w:color w:val="0A1F33"/>
-          <w:sz w:val="23"/>
-          <w:szCs w:val="23"/>
+          <w:sz w:val="28"/>
+          <w:szCs w:val="28"/>
         </w:rPr>
         <w:t>UNIVERSITY OF LIVERPOOL</w:t>
       </w:r>
@@ -200,15 +244,25 @@
       <w:pPr>
         <w:spacing w:after="180" w:line="360" w:lineRule="auto"/>
         <w:jc w:val="both"/>
+        <w:rPr>
+          <w:sz w:val="24"/>
+          <w:szCs w:val="24"/>
+        </w:rPr>
       </w:pPr>
       <w:r>
         <w:rPr>
           <w:b/>
           <w:bCs/>
+          <w:sz w:val="24"/>
+          <w:szCs w:val="24"/>
         </w:rPr>
         <w:t xml:space="preserve">Data Category: </w:t>
       </w:r>
       <w:r>
+        <w:rPr>
+          <w:sz w:val="24"/>
+          <w:szCs w:val="24"/>
+        </w:rPr>
         <w:t>A. Every source document is a United States SEC 10-K filing obtained from SEC EDGAR, a public regulatory archive. The data is publicly available, contains no personal or confidential information, and its use requires no licence, consent, or data-sharing agreement.</w:t>
       </w:r>
     </w:p>
@@ -216,15 +270,25 @@
       <w:pPr>
         <w:spacing w:after="180" w:line="360" w:lineRule="auto"/>
         <w:jc w:val="both"/>
+        <w:rPr>
+          <w:sz w:val="24"/>
+          <w:szCs w:val="24"/>
+        </w:rPr>
       </w:pPr>
       <w:r>
         <w:rPr>
           <w:b/>
           <w:bCs/>
+          <w:sz w:val="24"/>
+          <w:szCs w:val="24"/>
         </w:rPr>
         <w:t xml:space="preserve">Participant Category: </w:t>
       </w:r>
       <w:r>
+        <w:rPr>
+          <w:sz w:val="24"/>
+          <w:szCs w:val="24"/>
+        </w:rPr>
         <w:t>0. The project involves no human participants at any stage. The 140-query benchmark is generated and verified entirely by two independent language models acting as generator and critic, and the two manual steps (labelling teaching exemplars and hand-scoring validation outputs) are carried out solely by the researcher on the project’s own outputs, not on data gathered from, or about, other people.</w:t>
       </w:r>
     </w:p>
@@ -232,8 +296,16 @@
       <w:pPr>
         <w:spacing w:before="160" w:after="180" w:line="360" w:lineRule="auto"/>
         <w:jc w:val="both"/>
-      </w:pPr>
-      <w:r>
+        <w:rPr>
+          <w:sz w:val="24"/>
+          <w:szCs w:val="24"/>
+        </w:rPr>
+      </w:pPr>
+      <w:r>
+        <w:rPr>
+          <w:sz w:val="24"/>
+          <w:szCs w:val="24"/>
+        </w:rPr>
         <w:t>I confirm that I have read the ethical guidelines and will follow them during this project. This project uses only publicly available, non-personal United States SEC 10-K corporate filings sourced from SEC EDGAR. It involves no human participants and no personal data of any kind.</w:t>
       </w:r>
     </w:p>
@@ -274,19 +346,31 @@
               <w:noProof/>
               <w:color w:val="auto"/>
               <w:kern w:val="2"/>
-              <w:sz w:val="24"/>
-              <w:szCs w:val="24"/>
+              <w:sz w:val="28"/>
+              <w:szCs w:val="28"/>
               <w:lang w:val="en-IN"/>
               <w14:ligatures w14:val="standardContextual"/>
             </w:rPr>
           </w:pPr>
           <w:r>
+            <w:rPr>
+              <w:sz w:val="24"/>
+              <w:szCs w:val="24"/>
+            </w:rPr>
             <w:fldChar w:fldCharType="begin"/>
           </w:r>
           <w:r>
+            <w:rPr>
+              <w:sz w:val="24"/>
+              <w:szCs w:val="24"/>
+            </w:rPr>
             <w:instrText>TOC \h \o "1-2"</w:instrText>
           </w:r>
           <w:r>
+            <w:rPr>
+              <w:sz w:val="24"/>
+              <w:szCs w:val="24"/>
+            </w:rPr>
             <w:fldChar w:fldCharType="separate"/>
           </w:r>
           <w:hyperlink w:anchor="_Toc233304217" w:history="1">
@@ -294,47 +378,63 @@
               <w:rPr>
                 <w:rStyle w:val="Hyperlink"/>
                 <w:noProof/>
+                <w:sz w:val="24"/>
+                <w:szCs w:val="24"/>
               </w:rPr>
               <w:t>Statement of Ethical Compliance: A0</w:t>
             </w:r>
             <w:r>
               <w:rPr>
                 <w:noProof/>
+                <w:sz w:val="24"/>
+                <w:szCs w:val="24"/>
               </w:rPr>
               <w:tab/>
             </w:r>
             <w:r>
               <w:rPr>
                 <w:noProof/>
+                <w:sz w:val="24"/>
+                <w:szCs w:val="24"/>
               </w:rPr>
               <w:fldChar w:fldCharType="begin"/>
             </w:r>
             <w:r>
               <w:rPr>
                 <w:noProof/>
+                <w:sz w:val="24"/>
+                <w:szCs w:val="24"/>
               </w:rPr>
               <w:instrText xml:space="preserve"> PAGEREF _Toc233304217 \h </w:instrText>
             </w:r>
             <w:r>
               <w:rPr>
                 <w:noProof/>
-              </w:rPr>
-            </w:r>
-            <w:r>
-              <w:rPr>
-                <w:noProof/>
+                <w:sz w:val="24"/>
+                <w:szCs w:val="24"/>
+              </w:rPr>
+            </w:r>
+            <w:r>
+              <w:rPr>
+                <w:noProof/>
+                <w:sz w:val="24"/>
+                <w:szCs w:val="24"/>
               </w:rPr>
               <w:fldChar w:fldCharType="separate"/>
             </w:r>
             <w:r>
               <w:rPr>
                 <w:noProof/>
+                <w:sz w:val="24"/>
+                <w:szCs w:val="24"/>
               </w:rPr>
               <w:t>2</w:t>
             </w:r>
             <w:r>
               <w:rPr>
                 <w:noProof/>
+                <w:sz w:val="24"/>
+                <w:szCs w:val="24"/>
               </w:rPr>
               <w:fldChar w:fldCharType="end"/>
             </w:r>
@@ -351,8 +451,8 @@
               <w:noProof/>
               <w:color w:val="auto"/>
               <w:kern w:val="2"/>
-              <w:sz w:val="24"/>
-              <w:szCs w:val="24"/>
+              <w:sz w:val="28"/>
+              <w:szCs w:val="28"/>
               <w:lang w:val="en-IN"/>
               <w14:ligatures w14:val="standardContextual"/>
             </w:rPr>
@@ -362,47 +462,63 @@
               <w:rPr>
                 <w:rStyle w:val="Hyperlink"/>
                 <w:noProof/>
+                <w:sz w:val="24"/>
+                <w:szCs w:val="24"/>
               </w:rPr>
               <w:t>Table of Contents</w:t>
             </w:r>
             <w:r>
               <w:rPr>
                 <w:noProof/>
+                <w:sz w:val="24"/>
+                <w:szCs w:val="24"/>
               </w:rPr>
               <w:tab/>
             </w:r>
             <w:r>
               <w:rPr>
                 <w:noProof/>
+                <w:sz w:val="24"/>
+                <w:szCs w:val="24"/>
               </w:rPr>
               <w:fldChar w:fldCharType="begin"/>
             </w:r>
             <w:r>
               <w:rPr>
                 <w:noProof/>
+                <w:sz w:val="24"/>
+                <w:szCs w:val="24"/>
               </w:rPr>
               <w:instrText xml:space="preserve"> PAGEREF _Toc233304218 \h </w:instrText>
             </w:r>
             <w:r>
               <w:rPr>
                 <w:noProof/>
-              </w:rPr>
-            </w:r>
-            <w:r>
-              <w:rPr>
-                <w:noProof/>
+                <w:sz w:val="24"/>
+                <w:szCs w:val="24"/>
+              </w:rPr>
+            </w:r>
+            <w:r>
+              <w:rPr>
+                <w:noProof/>
+                <w:sz w:val="24"/>
+                <w:szCs w:val="24"/>
               </w:rPr>
               <w:fldChar w:fldCharType="separate"/>
             </w:r>
             <w:r>
               <w:rPr>
                 <w:noProof/>
+                <w:sz w:val="24"/>
+                <w:szCs w:val="24"/>
               </w:rPr>
               <w:t>3</w:t>
             </w:r>
             <w:r>
               <w:rPr>
                 <w:noProof/>
+                <w:sz w:val="24"/>
+                <w:szCs w:val="24"/>
               </w:rPr>
               <w:fldChar w:fldCharType="end"/>
             </w:r>
@@ -419,8 +535,8 @@
               <w:noProof/>
               <w:color w:val="auto"/>
               <w:kern w:val="2"/>
-              <w:sz w:val="24"/>
-              <w:szCs w:val="24"/>
+              <w:sz w:val="28"/>
+              <w:szCs w:val="28"/>
               <w:lang w:val="en-IN"/>
               <w14:ligatures w14:val="standardContextual"/>
             </w:rPr>
@@ -430,47 +546,63 @@
               <w:rPr>
                 <w:rStyle w:val="Hyperlink"/>
                 <w:noProof/>
+                <w:sz w:val="24"/>
+                <w:szCs w:val="24"/>
               </w:rPr>
               <w:t>1. Project Description</w:t>
             </w:r>
             <w:r>
               <w:rPr>
                 <w:noProof/>
+                <w:sz w:val="24"/>
+                <w:szCs w:val="24"/>
               </w:rPr>
               <w:tab/>
             </w:r>
             <w:r>
               <w:rPr>
                 <w:noProof/>
+                <w:sz w:val="24"/>
+                <w:szCs w:val="24"/>
               </w:rPr>
               <w:fldChar w:fldCharType="begin"/>
             </w:r>
             <w:r>
               <w:rPr>
                 <w:noProof/>
+                <w:sz w:val="24"/>
+                <w:szCs w:val="24"/>
               </w:rPr>
               <w:instrText xml:space="preserve"> PAGEREF _Toc233304219 \h </w:instrText>
             </w:r>
             <w:r>
               <w:rPr>
                 <w:noProof/>
-              </w:rPr>
-            </w:r>
-            <w:r>
-              <w:rPr>
-                <w:noProof/>
+                <w:sz w:val="24"/>
+                <w:szCs w:val="24"/>
+              </w:rPr>
+            </w:r>
+            <w:r>
+              <w:rPr>
+                <w:noProof/>
+                <w:sz w:val="24"/>
+                <w:szCs w:val="24"/>
               </w:rPr>
               <w:fldChar w:fldCharType="separate"/>
             </w:r>
             <w:r>
               <w:rPr>
                 <w:noProof/>
+                <w:sz w:val="24"/>
+                <w:szCs w:val="24"/>
               </w:rPr>
               <w:t>4</w:t>
             </w:r>
             <w:r>
               <w:rPr>
                 <w:noProof/>
+                <w:sz w:val="24"/>
+                <w:szCs w:val="24"/>
               </w:rPr>
               <w:fldChar w:fldCharType="end"/>
             </w:r>
@@ -487,8 +619,8 @@
               <w:noProof/>
               <w:color w:val="auto"/>
               <w:kern w:val="2"/>
-              <w:sz w:val="24"/>
-              <w:szCs w:val="24"/>
+              <w:sz w:val="28"/>
+              <w:szCs w:val="28"/>
               <w:lang w:val="en-IN"/>
               <w14:ligatures w14:val="standardContextual"/>
             </w:rPr>
@@ -498,47 +630,63 @@
               <w:rPr>
                 <w:rStyle w:val="Hyperlink"/>
                 <w:noProof/>
+                <w:sz w:val="24"/>
+                <w:szCs w:val="24"/>
               </w:rPr>
               <w:t>2. Aims and Requirements</w:t>
             </w:r>
             <w:r>
               <w:rPr>
                 <w:noProof/>
+                <w:sz w:val="24"/>
+                <w:szCs w:val="24"/>
               </w:rPr>
               <w:tab/>
             </w:r>
             <w:r>
               <w:rPr>
                 <w:noProof/>
+                <w:sz w:val="24"/>
+                <w:szCs w:val="24"/>
               </w:rPr>
               <w:fldChar w:fldCharType="begin"/>
             </w:r>
             <w:r>
               <w:rPr>
                 <w:noProof/>
+                <w:sz w:val="24"/>
+                <w:szCs w:val="24"/>
               </w:rPr>
               <w:instrText xml:space="preserve"> PAGEREF _Toc233304220 \h </w:instrText>
             </w:r>
             <w:r>
               <w:rPr>
                 <w:noProof/>
-              </w:rPr>
-            </w:r>
-            <w:r>
-              <w:rPr>
-                <w:noProof/>
+                <w:sz w:val="24"/>
+                <w:szCs w:val="24"/>
+              </w:rPr>
+            </w:r>
+            <w:r>
+              <w:rPr>
+                <w:noProof/>
+                <w:sz w:val="24"/>
+                <w:szCs w:val="24"/>
               </w:rPr>
               <w:fldChar w:fldCharType="separate"/>
             </w:r>
             <w:r>
               <w:rPr>
                 <w:noProof/>
+                <w:sz w:val="24"/>
+                <w:szCs w:val="24"/>
               </w:rPr>
               <w:t>4</w:t>
             </w:r>
             <w:r>
               <w:rPr>
                 <w:noProof/>
+                <w:sz w:val="24"/>
+                <w:szCs w:val="24"/>
               </w:rPr>
               <w:fldChar w:fldCharType="end"/>
             </w:r>
@@ -555,8 +703,8 @@
               <w:noProof/>
               <w:color w:val="auto"/>
               <w:kern w:val="2"/>
-              <w:sz w:val="24"/>
-              <w:szCs w:val="24"/>
+              <w:sz w:val="28"/>
+              <w:szCs w:val="28"/>
               <w:lang w:val="en-IN"/>
               <w14:ligatures w14:val="standardContextual"/>
             </w:rPr>
@@ -566,47 +714,63 @@
               <w:rPr>
                 <w:rStyle w:val="Hyperlink"/>
                 <w:noProof/>
+                <w:sz w:val="24"/>
+                <w:szCs w:val="24"/>
               </w:rPr>
               <w:t>2.1 Aims</w:t>
             </w:r>
             <w:r>
               <w:rPr>
                 <w:noProof/>
+                <w:sz w:val="24"/>
+                <w:szCs w:val="24"/>
               </w:rPr>
               <w:tab/>
             </w:r>
             <w:r>
               <w:rPr>
                 <w:noProof/>
+                <w:sz w:val="24"/>
+                <w:szCs w:val="24"/>
               </w:rPr>
               <w:fldChar w:fldCharType="begin"/>
             </w:r>
             <w:r>
               <w:rPr>
                 <w:noProof/>
+                <w:sz w:val="24"/>
+                <w:szCs w:val="24"/>
               </w:rPr>
               <w:instrText xml:space="preserve"> PAGEREF _Toc233304221 \h </w:instrText>
             </w:r>
             <w:r>
               <w:rPr>
                 <w:noProof/>
-              </w:rPr>
-            </w:r>
-            <w:r>
-              <w:rPr>
-                <w:noProof/>
+                <w:sz w:val="24"/>
+                <w:szCs w:val="24"/>
+              </w:rPr>
+            </w:r>
+            <w:r>
+              <w:rPr>
+                <w:noProof/>
+                <w:sz w:val="24"/>
+                <w:szCs w:val="24"/>
               </w:rPr>
               <w:fldChar w:fldCharType="separate"/>
             </w:r>
             <w:r>
               <w:rPr>
                 <w:noProof/>
+                <w:sz w:val="24"/>
+                <w:szCs w:val="24"/>
               </w:rPr>
               <w:t>4</w:t>
             </w:r>
             <w:r>
               <w:rPr>
                 <w:noProof/>
+                <w:sz w:val="24"/>
+                <w:szCs w:val="24"/>
               </w:rPr>
               <w:fldChar w:fldCharType="end"/>
             </w:r>
@@ -623,8 +787,8 @@
               <w:noProof/>
               <w:color w:val="auto"/>
               <w:kern w:val="2"/>
-              <w:sz w:val="24"/>
-              <w:szCs w:val="24"/>
+              <w:sz w:val="28"/>
+              <w:szCs w:val="28"/>
               <w:lang w:val="en-IN"/>
               <w14:ligatures w14:val="standardContextual"/>
             </w:rPr>
@@ -634,47 +798,63 @@
               <w:rPr>
                 <w:rStyle w:val="Hyperlink"/>
                 <w:noProof/>
+                <w:sz w:val="24"/>
+                <w:szCs w:val="24"/>
               </w:rPr>
               <w:t>2.2 Requirements: Essential</w:t>
             </w:r>
             <w:r>
               <w:rPr>
                 <w:noProof/>
+                <w:sz w:val="24"/>
+                <w:szCs w:val="24"/>
               </w:rPr>
               <w:tab/>
             </w:r>
             <w:r>
               <w:rPr>
                 <w:noProof/>
+                <w:sz w:val="24"/>
+                <w:szCs w:val="24"/>
               </w:rPr>
               <w:fldChar w:fldCharType="begin"/>
             </w:r>
             <w:r>
               <w:rPr>
                 <w:noProof/>
+                <w:sz w:val="24"/>
+                <w:szCs w:val="24"/>
               </w:rPr>
               <w:instrText xml:space="preserve"> PAGEREF _Toc233304222 \h </w:instrText>
             </w:r>
             <w:r>
               <w:rPr>
                 <w:noProof/>
-              </w:rPr>
-            </w:r>
-            <w:r>
-              <w:rPr>
-                <w:noProof/>
+                <w:sz w:val="24"/>
+                <w:szCs w:val="24"/>
+              </w:rPr>
+            </w:r>
+            <w:r>
+              <w:rPr>
+                <w:noProof/>
+                <w:sz w:val="24"/>
+                <w:szCs w:val="24"/>
               </w:rPr>
               <w:fldChar w:fldCharType="separate"/>
             </w:r>
             <w:r>
               <w:rPr>
                 <w:noProof/>
+                <w:sz w:val="24"/>
+                <w:szCs w:val="24"/>
               </w:rPr>
               <w:t>4</w:t>
             </w:r>
             <w:r>
               <w:rPr>
                 <w:noProof/>
+                <w:sz w:val="24"/>
+                <w:szCs w:val="24"/>
               </w:rPr>
               <w:fldChar w:fldCharType="end"/>
             </w:r>
@@ -691,8 +871,8 @@
               <w:noProof/>
               <w:color w:val="auto"/>
               <w:kern w:val="2"/>
-              <w:sz w:val="24"/>
-              <w:szCs w:val="24"/>
+              <w:sz w:val="28"/>
+              <w:szCs w:val="28"/>
               <w:lang w:val="en-IN"/>
               <w14:ligatures w14:val="standardContextual"/>
             </w:rPr>
@@ -702,47 +882,63 @@
               <w:rPr>
                 <w:rStyle w:val="Hyperlink"/>
                 <w:noProof/>
+                <w:sz w:val="24"/>
+                <w:szCs w:val="24"/>
               </w:rPr>
               <w:t>2.3 Requirements: Desirable</w:t>
             </w:r>
             <w:r>
               <w:rPr>
                 <w:noProof/>
+                <w:sz w:val="24"/>
+                <w:szCs w:val="24"/>
               </w:rPr>
               <w:tab/>
             </w:r>
             <w:r>
               <w:rPr>
                 <w:noProof/>
+                <w:sz w:val="24"/>
+                <w:szCs w:val="24"/>
               </w:rPr>
               <w:fldChar w:fldCharType="begin"/>
             </w:r>
             <w:r>
               <w:rPr>
                 <w:noProof/>
+                <w:sz w:val="24"/>
+                <w:szCs w:val="24"/>
               </w:rPr>
               <w:instrText xml:space="preserve"> PAGEREF _Toc233304223 \h </w:instrText>
             </w:r>
             <w:r>
               <w:rPr>
                 <w:noProof/>
-              </w:rPr>
-            </w:r>
-            <w:r>
-              <w:rPr>
-                <w:noProof/>
+                <w:sz w:val="24"/>
+                <w:szCs w:val="24"/>
+              </w:rPr>
+            </w:r>
+            <w:r>
+              <w:rPr>
+                <w:noProof/>
+                <w:sz w:val="24"/>
+                <w:szCs w:val="24"/>
               </w:rPr>
               <w:fldChar w:fldCharType="separate"/>
             </w:r>
             <w:r>
               <w:rPr>
                 <w:noProof/>
+                <w:sz w:val="24"/>
+                <w:szCs w:val="24"/>
               </w:rPr>
               <w:t>5</w:t>
             </w:r>
             <w:r>
               <w:rPr>
                 <w:noProof/>
+                <w:sz w:val="24"/>
+                <w:szCs w:val="24"/>
               </w:rPr>
               <w:fldChar w:fldCharType="end"/>
             </w:r>
@@ -759,8 +955,8 @@
               <w:noProof/>
               <w:color w:val="auto"/>
               <w:kern w:val="2"/>
-              <w:sz w:val="24"/>
-              <w:szCs w:val="24"/>
+              <w:sz w:val="28"/>
+              <w:szCs w:val="28"/>
               <w:lang w:val="en-IN"/>
               <w14:ligatures w14:val="standardContextual"/>
             </w:rPr>
@@ -770,47 +966,63 @@
               <w:rPr>
                 <w:rStyle w:val="Hyperlink"/>
                 <w:noProof/>
+                <w:sz w:val="24"/>
+                <w:szCs w:val="24"/>
               </w:rPr>
               <w:t>3. Key Literature and Background Reading</w:t>
             </w:r>
             <w:r>
               <w:rPr>
                 <w:noProof/>
+                <w:sz w:val="24"/>
+                <w:szCs w:val="24"/>
               </w:rPr>
               <w:tab/>
             </w:r>
             <w:r>
               <w:rPr>
                 <w:noProof/>
+                <w:sz w:val="24"/>
+                <w:szCs w:val="24"/>
               </w:rPr>
               <w:fldChar w:fldCharType="begin"/>
             </w:r>
             <w:r>
               <w:rPr>
                 <w:noProof/>
+                <w:sz w:val="24"/>
+                <w:szCs w:val="24"/>
               </w:rPr>
               <w:instrText xml:space="preserve"> PAGEREF _Toc233304224 \h </w:instrText>
             </w:r>
             <w:r>
               <w:rPr>
                 <w:noProof/>
-              </w:rPr>
-            </w:r>
-            <w:r>
-              <w:rPr>
-                <w:noProof/>
+                <w:sz w:val="24"/>
+                <w:szCs w:val="24"/>
+              </w:rPr>
+            </w:r>
+            <w:r>
+              <w:rPr>
+                <w:noProof/>
+                <w:sz w:val="24"/>
+                <w:szCs w:val="24"/>
               </w:rPr>
               <w:fldChar w:fldCharType="separate"/>
             </w:r>
             <w:r>
               <w:rPr>
                 <w:noProof/>
+                <w:sz w:val="24"/>
+                <w:szCs w:val="24"/>
               </w:rPr>
               <w:t>5</w:t>
             </w:r>
             <w:r>
               <w:rPr>
                 <w:noProof/>
+                <w:sz w:val="24"/>
+                <w:szCs w:val="24"/>
               </w:rPr>
               <w:fldChar w:fldCharType="end"/>
             </w:r>
@@ -827,8 +1039,8 @@
               <w:noProof/>
               <w:color w:val="auto"/>
               <w:kern w:val="2"/>
-              <w:sz w:val="24"/>
-              <w:szCs w:val="24"/>
+              <w:sz w:val="28"/>
+              <w:szCs w:val="28"/>
               <w:lang w:val="en-IN"/>
               <w14:ligatures w14:val="standardContextual"/>
             </w:rPr>
@@ -838,47 +1050,63 @@
               <w:rPr>
                 <w:rStyle w:val="Hyperlink"/>
                 <w:noProof/>
+                <w:sz w:val="24"/>
+                <w:szCs w:val="24"/>
               </w:rPr>
               <w:t>4. Development and Implementation Summary</w:t>
             </w:r>
             <w:r>
               <w:rPr>
                 <w:noProof/>
+                <w:sz w:val="24"/>
+                <w:szCs w:val="24"/>
               </w:rPr>
               <w:tab/>
             </w:r>
             <w:r>
               <w:rPr>
                 <w:noProof/>
+                <w:sz w:val="24"/>
+                <w:szCs w:val="24"/>
               </w:rPr>
               <w:fldChar w:fldCharType="begin"/>
             </w:r>
             <w:r>
               <w:rPr>
                 <w:noProof/>
+                <w:sz w:val="24"/>
+                <w:szCs w:val="24"/>
               </w:rPr>
               <w:instrText xml:space="preserve"> PAGEREF _Toc233304225 \h </w:instrText>
             </w:r>
             <w:r>
               <w:rPr>
                 <w:noProof/>
-              </w:rPr>
-            </w:r>
-            <w:r>
-              <w:rPr>
-                <w:noProof/>
+                <w:sz w:val="24"/>
+                <w:szCs w:val="24"/>
+              </w:rPr>
+            </w:r>
+            <w:r>
+              <w:rPr>
+                <w:noProof/>
+                <w:sz w:val="24"/>
+                <w:szCs w:val="24"/>
               </w:rPr>
               <w:fldChar w:fldCharType="separate"/>
             </w:r>
             <w:r>
               <w:rPr>
                 <w:noProof/>
+                <w:sz w:val="24"/>
+                <w:szCs w:val="24"/>
               </w:rPr>
               <w:t>6</w:t>
             </w:r>
             <w:r>
               <w:rPr>
                 <w:noProof/>
+                <w:sz w:val="24"/>
+                <w:szCs w:val="24"/>
               </w:rPr>
               <w:fldChar w:fldCharType="end"/>
             </w:r>
@@ -895,8 +1123,8 @@
               <w:noProof/>
               <w:color w:val="auto"/>
               <w:kern w:val="2"/>
-              <w:sz w:val="24"/>
-              <w:szCs w:val="24"/>
+              <w:sz w:val="28"/>
+              <w:szCs w:val="28"/>
               <w:lang w:val="en-IN"/>
               <w14:ligatures w14:val="standardContextual"/>
             </w:rPr>
@@ -906,47 +1134,63 @@
               <w:rPr>
                 <w:rStyle w:val="Hyperlink"/>
                 <w:noProof/>
+                <w:sz w:val="24"/>
+                <w:szCs w:val="24"/>
               </w:rPr>
               <w:t>5. Data Sources</w:t>
             </w:r>
             <w:r>
               <w:rPr>
                 <w:noProof/>
+                <w:sz w:val="24"/>
+                <w:szCs w:val="24"/>
               </w:rPr>
               <w:tab/>
             </w:r>
             <w:r>
               <w:rPr>
                 <w:noProof/>
+                <w:sz w:val="24"/>
+                <w:szCs w:val="24"/>
               </w:rPr>
               <w:fldChar w:fldCharType="begin"/>
             </w:r>
             <w:r>
               <w:rPr>
                 <w:noProof/>
+                <w:sz w:val="24"/>
+                <w:szCs w:val="24"/>
               </w:rPr>
               <w:instrText xml:space="preserve"> PAGEREF _Toc233304226 \h </w:instrText>
             </w:r>
             <w:r>
               <w:rPr>
                 <w:noProof/>
-              </w:rPr>
-            </w:r>
-            <w:r>
-              <w:rPr>
-                <w:noProof/>
+                <w:sz w:val="24"/>
+                <w:szCs w:val="24"/>
+              </w:rPr>
+            </w:r>
+            <w:r>
+              <w:rPr>
+                <w:noProof/>
+                <w:sz w:val="24"/>
+                <w:szCs w:val="24"/>
               </w:rPr>
               <w:fldChar w:fldCharType="separate"/>
             </w:r>
             <w:r>
               <w:rPr>
                 <w:noProof/>
+                <w:sz w:val="24"/>
+                <w:szCs w:val="24"/>
               </w:rPr>
               <w:t>7</w:t>
             </w:r>
             <w:r>
               <w:rPr>
                 <w:noProof/>
+                <w:sz w:val="24"/>
+                <w:szCs w:val="24"/>
               </w:rPr>
               <w:fldChar w:fldCharType="end"/>
             </w:r>
@@ -963,8 +1207,8 @@
               <w:noProof/>
               <w:color w:val="auto"/>
               <w:kern w:val="2"/>
-              <w:sz w:val="24"/>
-              <w:szCs w:val="24"/>
+              <w:sz w:val="28"/>
+              <w:szCs w:val="28"/>
               <w:lang w:val="en-IN"/>
               <w14:ligatures w14:val="standardContextual"/>
             </w:rPr>
@@ -974,47 +1218,63 @@
               <w:rPr>
                 <w:rStyle w:val="Hyperlink"/>
                 <w:noProof/>
+                <w:sz w:val="24"/>
+                <w:szCs w:val="24"/>
               </w:rPr>
               <w:t>6. Testing and Evaluation</w:t>
             </w:r>
             <w:r>
               <w:rPr>
                 <w:noProof/>
+                <w:sz w:val="24"/>
+                <w:szCs w:val="24"/>
               </w:rPr>
               <w:tab/>
             </w:r>
             <w:r>
               <w:rPr>
                 <w:noProof/>
+                <w:sz w:val="24"/>
+                <w:szCs w:val="24"/>
               </w:rPr>
               <w:fldChar w:fldCharType="begin"/>
             </w:r>
             <w:r>
               <w:rPr>
                 <w:noProof/>
+                <w:sz w:val="24"/>
+                <w:szCs w:val="24"/>
               </w:rPr>
               <w:instrText xml:space="preserve"> PAGEREF _Toc233304227 \h </w:instrText>
             </w:r>
             <w:r>
               <w:rPr>
                 <w:noProof/>
-              </w:rPr>
-            </w:r>
-            <w:r>
-              <w:rPr>
-                <w:noProof/>
+                <w:sz w:val="24"/>
+                <w:szCs w:val="24"/>
+              </w:rPr>
+            </w:r>
+            <w:r>
+              <w:rPr>
+                <w:noProof/>
+                <w:sz w:val="24"/>
+                <w:szCs w:val="24"/>
               </w:rPr>
               <w:fldChar w:fldCharType="separate"/>
             </w:r>
             <w:r>
               <w:rPr>
                 <w:noProof/>
+                <w:sz w:val="24"/>
+                <w:szCs w:val="24"/>
               </w:rPr>
               <w:t>7</w:t>
             </w:r>
             <w:r>
               <w:rPr>
                 <w:noProof/>
+                <w:sz w:val="24"/>
+                <w:szCs w:val="24"/>
               </w:rPr>
               <w:fldChar w:fldCharType="end"/>
             </w:r>
@@ -1031,8 +1291,8 @@
               <w:noProof/>
               <w:color w:val="auto"/>
               <w:kern w:val="2"/>
-              <w:sz w:val="24"/>
-              <w:szCs w:val="24"/>
+              <w:sz w:val="28"/>
+              <w:szCs w:val="28"/>
               <w:lang w:val="en-IN"/>
               <w14:ligatures w14:val="standardContextual"/>
             </w:rPr>
@@ -1042,47 +1302,63 @@
               <w:rPr>
                 <w:rStyle w:val="Hyperlink"/>
                 <w:noProof/>
+                <w:sz w:val="24"/>
+                <w:szCs w:val="24"/>
               </w:rPr>
               <w:t>7. Project Ethics and Human Participants</w:t>
             </w:r>
             <w:r>
               <w:rPr>
                 <w:noProof/>
+                <w:sz w:val="24"/>
+                <w:szCs w:val="24"/>
               </w:rPr>
               <w:tab/>
             </w:r>
             <w:r>
               <w:rPr>
                 <w:noProof/>
+                <w:sz w:val="24"/>
+                <w:szCs w:val="24"/>
               </w:rPr>
               <w:fldChar w:fldCharType="begin"/>
             </w:r>
             <w:r>
               <w:rPr>
                 <w:noProof/>
+                <w:sz w:val="24"/>
+                <w:szCs w:val="24"/>
               </w:rPr>
               <w:instrText xml:space="preserve"> PAGEREF _Toc233304228 \h </w:instrText>
             </w:r>
             <w:r>
               <w:rPr>
                 <w:noProof/>
-              </w:rPr>
-            </w:r>
-            <w:r>
-              <w:rPr>
-                <w:noProof/>
+                <w:sz w:val="24"/>
+                <w:szCs w:val="24"/>
+              </w:rPr>
+            </w:r>
+            <w:r>
+              <w:rPr>
+                <w:noProof/>
+                <w:sz w:val="24"/>
+                <w:szCs w:val="24"/>
               </w:rPr>
               <w:fldChar w:fldCharType="separate"/>
             </w:r>
             <w:r>
               <w:rPr>
                 <w:noProof/>
+                <w:sz w:val="24"/>
+                <w:szCs w:val="24"/>
               </w:rPr>
               <w:t>8</w:t>
             </w:r>
             <w:r>
               <w:rPr>
                 <w:noProof/>
+                <w:sz w:val="24"/>
+                <w:szCs w:val="24"/>
               </w:rPr>
               <w:fldChar w:fldCharType="end"/>
             </w:r>
@@ -1099,8 +1375,8 @@
               <w:noProof/>
               <w:color w:val="auto"/>
               <w:kern w:val="2"/>
-              <w:sz w:val="24"/>
-              <w:szCs w:val="24"/>
+              <w:sz w:val="28"/>
+              <w:szCs w:val="28"/>
               <w:lang w:val="en-IN"/>
               <w14:ligatures w14:val="standardContextual"/>
             </w:rPr>
@@ -1110,47 +1386,63 @@
               <w:rPr>
                 <w:rStyle w:val="Hyperlink"/>
                 <w:noProof/>
+                <w:sz w:val="24"/>
+                <w:szCs w:val="24"/>
               </w:rPr>
               <w:t>8. BCS Project Criteria</w:t>
             </w:r>
             <w:r>
               <w:rPr>
                 <w:noProof/>
+                <w:sz w:val="24"/>
+                <w:szCs w:val="24"/>
               </w:rPr>
               <w:tab/>
             </w:r>
             <w:r>
               <w:rPr>
                 <w:noProof/>
+                <w:sz w:val="24"/>
+                <w:szCs w:val="24"/>
               </w:rPr>
               <w:fldChar w:fldCharType="begin"/>
             </w:r>
             <w:r>
               <w:rPr>
                 <w:noProof/>
+                <w:sz w:val="24"/>
+                <w:szCs w:val="24"/>
               </w:rPr>
               <w:instrText xml:space="preserve"> PAGEREF _Toc233304229 \h </w:instrText>
             </w:r>
             <w:r>
               <w:rPr>
                 <w:noProof/>
-              </w:rPr>
-            </w:r>
-            <w:r>
-              <w:rPr>
-                <w:noProof/>
+                <w:sz w:val="24"/>
+                <w:szCs w:val="24"/>
+              </w:rPr>
+            </w:r>
+            <w:r>
+              <w:rPr>
+                <w:noProof/>
+                <w:sz w:val="24"/>
+                <w:szCs w:val="24"/>
               </w:rPr>
               <w:fldChar w:fldCharType="separate"/>
             </w:r>
             <w:r>
               <w:rPr>
                 <w:noProof/>
+                <w:sz w:val="24"/>
+                <w:szCs w:val="24"/>
               </w:rPr>
               <w:t>8</w:t>
             </w:r>
             <w:r>
               <w:rPr>
                 <w:noProof/>
+                <w:sz w:val="24"/>
+                <w:szCs w:val="24"/>
               </w:rPr>
               <w:fldChar w:fldCharType="end"/>
             </w:r>
@@ -1167,8 +1459,8 @@
               <w:noProof/>
               <w:color w:val="auto"/>
               <w:kern w:val="2"/>
-              <w:sz w:val="24"/>
-              <w:szCs w:val="24"/>
+              <w:sz w:val="28"/>
+              <w:szCs w:val="28"/>
               <w:lang w:val="en-IN"/>
               <w14:ligatures w14:val="standardContextual"/>
             </w:rPr>
@@ -1178,47 +1470,63 @@
               <w:rPr>
                 <w:rStyle w:val="Hyperlink"/>
                 <w:noProof/>
+                <w:sz w:val="24"/>
+                <w:szCs w:val="24"/>
               </w:rPr>
               <w:t>9. UI/UX Mockup</w:t>
             </w:r>
             <w:r>
               <w:rPr>
                 <w:noProof/>
+                <w:sz w:val="24"/>
+                <w:szCs w:val="24"/>
               </w:rPr>
               <w:tab/>
             </w:r>
             <w:r>
               <w:rPr>
                 <w:noProof/>
+                <w:sz w:val="24"/>
+                <w:szCs w:val="24"/>
               </w:rPr>
               <w:fldChar w:fldCharType="begin"/>
             </w:r>
             <w:r>
               <w:rPr>
                 <w:noProof/>
+                <w:sz w:val="24"/>
+                <w:szCs w:val="24"/>
               </w:rPr>
               <w:instrText xml:space="preserve"> PAGEREF _Toc233304230 \h </w:instrText>
             </w:r>
             <w:r>
               <w:rPr>
                 <w:noProof/>
-              </w:rPr>
-            </w:r>
-            <w:r>
-              <w:rPr>
-                <w:noProof/>
+                <w:sz w:val="24"/>
+                <w:szCs w:val="24"/>
+              </w:rPr>
+            </w:r>
+            <w:r>
+              <w:rPr>
+                <w:noProof/>
+                <w:sz w:val="24"/>
+                <w:szCs w:val="24"/>
               </w:rPr>
               <w:fldChar w:fldCharType="separate"/>
             </w:r>
             <w:r>
               <w:rPr>
                 <w:noProof/>
+                <w:sz w:val="24"/>
+                <w:szCs w:val="24"/>
               </w:rPr>
               <w:t>8</w:t>
             </w:r>
             <w:r>
               <w:rPr>
                 <w:noProof/>
+                <w:sz w:val="24"/>
+                <w:szCs w:val="24"/>
               </w:rPr>
               <w:fldChar w:fldCharType="end"/>
             </w:r>
@@ -1235,8 +1543,8 @@
               <w:noProof/>
               <w:color w:val="auto"/>
               <w:kern w:val="2"/>
-              <w:sz w:val="24"/>
-              <w:szCs w:val="24"/>
+              <w:sz w:val="28"/>
+              <w:szCs w:val="28"/>
               <w:lang w:val="en-IN"/>
               <w14:ligatures w14:val="standardContextual"/>
             </w:rPr>
@@ -1246,47 +1554,63 @@
               <w:rPr>
                 <w:rStyle w:val="Hyperlink"/>
                 <w:noProof/>
+                <w:sz w:val="24"/>
+                <w:szCs w:val="24"/>
               </w:rPr>
               <w:t>10. Project Plan</w:t>
             </w:r>
             <w:r>
               <w:rPr>
                 <w:noProof/>
+                <w:sz w:val="24"/>
+                <w:szCs w:val="24"/>
               </w:rPr>
               <w:tab/>
             </w:r>
             <w:r>
               <w:rPr>
                 <w:noProof/>
+                <w:sz w:val="24"/>
+                <w:szCs w:val="24"/>
               </w:rPr>
               <w:fldChar w:fldCharType="begin"/>
             </w:r>
             <w:r>
               <w:rPr>
                 <w:noProof/>
+                <w:sz w:val="24"/>
+                <w:szCs w:val="24"/>
               </w:rPr>
               <w:instrText xml:space="preserve"> PAGEREF _Toc233304231 \h </w:instrText>
             </w:r>
             <w:r>
               <w:rPr>
                 <w:noProof/>
-              </w:rPr>
-            </w:r>
-            <w:r>
-              <w:rPr>
-                <w:noProof/>
+                <w:sz w:val="24"/>
+                <w:szCs w:val="24"/>
+              </w:rPr>
+            </w:r>
+            <w:r>
+              <w:rPr>
+                <w:noProof/>
+                <w:sz w:val="24"/>
+                <w:szCs w:val="24"/>
               </w:rPr>
               <w:fldChar w:fldCharType="separate"/>
             </w:r>
             <w:r>
               <w:rPr>
                 <w:noProof/>
+                <w:sz w:val="24"/>
+                <w:szCs w:val="24"/>
               </w:rPr>
               <w:t>9</w:t>
             </w:r>
             <w:r>
               <w:rPr>
                 <w:noProof/>
+                <w:sz w:val="24"/>
+                <w:szCs w:val="24"/>
               </w:rPr>
               <w:fldChar w:fldCharType="end"/>
             </w:r>
@@ -1303,8 +1627,8 @@
               <w:noProof/>
               <w:color w:val="auto"/>
               <w:kern w:val="2"/>
-              <w:sz w:val="24"/>
-              <w:szCs w:val="24"/>
+              <w:sz w:val="28"/>
+              <w:szCs w:val="28"/>
               <w:lang w:val="en-IN"/>
               <w14:ligatures w14:val="standardContextual"/>
             </w:rPr>
@@ -1314,47 +1638,63 @@
               <w:rPr>
                 <w:rStyle w:val="Hyperlink"/>
                 <w:noProof/>
+                <w:sz w:val="24"/>
+                <w:szCs w:val="24"/>
               </w:rPr>
               <w:t>11. Risks and Contingency Plans</w:t>
             </w:r>
             <w:r>
               <w:rPr>
                 <w:noProof/>
+                <w:sz w:val="24"/>
+                <w:szCs w:val="24"/>
               </w:rPr>
               <w:tab/>
             </w:r>
             <w:r>
               <w:rPr>
                 <w:noProof/>
+                <w:sz w:val="24"/>
+                <w:szCs w:val="24"/>
               </w:rPr>
               <w:fldChar w:fldCharType="begin"/>
             </w:r>
             <w:r>
               <w:rPr>
                 <w:noProof/>
+                <w:sz w:val="24"/>
+                <w:szCs w:val="24"/>
               </w:rPr>
               <w:instrText xml:space="preserve"> PAGEREF _Toc233304232 \h </w:instrText>
             </w:r>
             <w:r>
               <w:rPr>
                 <w:noProof/>
-              </w:rPr>
-            </w:r>
-            <w:r>
-              <w:rPr>
-                <w:noProof/>
+                <w:sz w:val="24"/>
+                <w:szCs w:val="24"/>
+              </w:rPr>
+            </w:r>
+            <w:r>
+              <w:rPr>
+                <w:noProof/>
+                <w:sz w:val="24"/>
+                <w:szCs w:val="24"/>
               </w:rPr>
               <w:fldChar w:fldCharType="separate"/>
             </w:r>
             <w:r>
               <w:rPr>
                 <w:noProof/>
+                <w:sz w:val="24"/>
+                <w:szCs w:val="24"/>
               </w:rPr>
               <w:t>9</w:t>
             </w:r>
             <w:r>
               <w:rPr>
                 <w:noProof/>
+                <w:sz w:val="24"/>
+                <w:szCs w:val="24"/>
               </w:rPr>
               <w:fldChar w:fldCharType="end"/>
             </w:r>
@@ -1371,8 +1711,8 @@
               <w:noProof/>
               <w:color w:val="auto"/>
               <w:kern w:val="2"/>
-              <w:sz w:val="24"/>
-              <w:szCs w:val="24"/>
+              <w:sz w:val="28"/>
+              <w:szCs w:val="28"/>
               <w:lang w:val="en-IN"/>
               <w14:ligatures w14:val="standardContextual"/>
             </w:rPr>
@@ -1382,47 +1722,63 @@
               <w:rPr>
                 <w:rStyle w:val="Hyperlink"/>
                 <w:noProof/>
+                <w:sz w:val="24"/>
+                <w:szCs w:val="24"/>
               </w:rPr>
               <w:t>12. References</w:t>
             </w:r>
             <w:r>
               <w:rPr>
                 <w:noProof/>
+                <w:sz w:val="24"/>
+                <w:szCs w:val="24"/>
               </w:rPr>
               <w:tab/>
             </w:r>
             <w:r>
               <w:rPr>
                 <w:noProof/>
+                <w:sz w:val="24"/>
+                <w:szCs w:val="24"/>
               </w:rPr>
               <w:fldChar w:fldCharType="begin"/>
             </w:r>
             <w:r>
               <w:rPr>
                 <w:noProof/>
+                <w:sz w:val="24"/>
+                <w:szCs w:val="24"/>
               </w:rPr>
               <w:instrText xml:space="preserve"> PAGEREF _Toc233304233 \h </w:instrText>
             </w:r>
             <w:r>
               <w:rPr>
                 <w:noProof/>
-              </w:rPr>
-            </w:r>
-            <w:r>
-              <w:rPr>
-                <w:noProof/>
+                <w:sz w:val="24"/>
+                <w:szCs w:val="24"/>
+              </w:rPr>
+            </w:r>
+            <w:r>
+              <w:rPr>
+                <w:noProof/>
+                <w:sz w:val="24"/>
+                <w:szCs w:val="24"/>
               </w:rPr>
               <w:fldChar w:fldCharType="separate"/>
             </w:r>
             <w:r>
               <w:rPr>
                 <w:noProof/>
+                <w:sz w:val="24"/>
+                <w:szCs w:val="24"/>
               </w:rPr>
               <w:t>11</w:t>
             </w:r>
             <w:r>
               <w:rPr>
                 <w:noProof/>
+                <w:sz w:val="24"/>
+                <w:szCs w:val="24"/>
               </w:rPr>
               <w:fldChar w:fldCharType="end"/>
             </w:r>
@@ -1430,6 +1786,10 @@
         </w:p>
         <w:p>
           <w:r>
+            <w:rPr>
+              <w:sz w:val="24"/>
+              <w:szCs w:val="24"/>
+            </w:rPr>
             <w:fldChar w:fldCharType="end"/>
           </w:r>
         </w:p>
@@ -1458,29 +1818,63 @@
       <w:pPr>
         <w:spacing w:after="180" w:line="360" w:lineRule="auto"/>
         <w:jc w:val="both"/>
-      </w:pPr>
-      <w:r>
+        <w:rPr>
+          <w:sz w:val="24"/>
+          <w:szCs w:val="24"/>
+        </w:rPr>
+      </w:pPr>
+      <w:r>
+        <w:rPr>
+          <w:sz w:val="24"/>
+          <w:szCs w:val="24"/>
+        </w:rPr>
         <w:t xml:space="preserve">Retrieval-Augmented Generation (RAG) systems answer questions by pairing a retriever that selects relevant evidence from a corpus with a language model that generates a grounded answer (Lewis </w:t>
       </w:r>
       <w:r>
         <w:rPr>
           <w:i/>
           <w:iCs/>
+          <w:sz w:val="24"/>
+          <w:szCs w:val="24"/>
         </w:rPr>
         <w:t>et al.</w:t>
       </w:r>
       <w:r>
+        <w:rPr>
+          <w:sz w:val="24"/>
+          <w:szCs w:val="24"/>
+        </w:rPr>
         <w:t xml:space="preserve">, 2020). Most RAG benchmarks target encyclopaedic or open-domain text; far less is known about how different retrieval paradigms behave on dense, table-heavy financial disclosures such as SEC 10-K filings, where an answer may sit inside a single cell of a multi-row table rather than a sentence of prose (Chen </w:t>
       </w:r>
       <w:r>
         <w:rPr>
           <w:i/>
           <w:iCs/>
+          <w:sz w:val="24"/>
+          <w:szCs w:val="24"/>
         </w:rPr>
         <w:t>et al.</w:t>
       </w:r>
       <w:r>
-        <w:t>, 2021). This project builds and benchmarks three complete RAG pipelines: a semantic retriever, which finds evidence by meaning using numeric representations of text (dense vector embeddings); a statistical retriever, which finds evidence by matching exact words and their frequency using the long-established BM25 algorithm; and a structural retriever, which navigates a tree of AI-generated summaries built once over each document. These three are tested against a 140-query, human-anchored benchmark spanning direct and inferential questions over both narrative text and financial tables, to establish where each paradigm succeeds and where it degrades.</w:t>
+        <w:rPr>
+          <w:sz w:val="24"/>
+          <w:szCs w:val="24"/>
+        </w:rPr>
+        <w:t>, 2021). This project builds and benchmarks three complete RAG pipelines: a semantic retriever, which finds evidence by meaning using numeric representations of text (dense vector embeddings); a statistical retriever, which finds evidence by matching exact words and their frequency using the long-established BM25 algorithm; and a structural retriever, which navigates a tree of AI-generated summaries built once over each document. These three are tested against a 1</w:t>
+      </w:r>
+      <w:r>
+        <w:rPr>
+          <w:sz w:val="24"/>
+          <w:szCs w:val="24"/>
+        </w:rPr>
+        <w:t>4</w:t>
+      </w:r>
+      <w:r>
+        <w:rPr>
+          <w:sz w:val="24"/>
+          <w:szCs w:val="24"/>
+        </w:rPr>
+        <w:t>0-query, human-anchored benchmark spanning direct and inferential questions over both narrative text and financial tables, to establish where each paradigm succeeds and where it degrades.</w:t>
       </w:r>
     </w:p>
     <w:p>
@@ -1515,8 +1909,16 @@
         </w:numPr>
         <w:spacing w:after="110" w:line="360" w:lineRule="auto"/>
         <w:jc w:val="both"/>
-      </w:pPr>
-      <w:r>
+        <w:rPr>
+          <w:sz w:val="24"/>
+          <w:szCs w:val="24"/>
+        </w:rPr>
+      </w:pPr>
+      <w:r>
+        <w:rPr>
+          <w:sz w:val="24"/>
+          <w:szCs w:val="24"/>
+        </w:rPr>
         <w:t>Design and implement three architecturally distinct RAG retrieval pipelines (semantic, statistical, structural) sharing one evaluation harness, so that performance differences are attributable to retrieval strategy rather than to generation.</w:t>
       </w:r>
     </w:p>
@@ -1529,8 +1931,16 @@
         </w:numPr>
         <w:spacing w:after="110" w:line="360" w:lineRule="auto"/>
         <w:jc w:val="both"/>
-      </w:pPr>
-      <w:r>
+        <w:rPr>
+          <w:sz w:val="24"/>
+          <w:szCs w:val="24"/>
+        </w:rPr>
+      </w:pPr>
+      <w:r>
+        <w:rPr>
+          <w:sz w:val="24"/>
+          <w:szCs w:val="24"/>
+        </w:rPr>
         <w:t>Construct an adversarially verified, human-anchored benchmark of 140 questions, stratified across four query types (direct/implicit retrieval over text/table content), grounded in real SEC 10-K filings.</w:t>
       </w:r>
     </w:p>
@@ -1543,8 +1953,16 @@
         </w:numPr>
         <w:spacing w:after="110" w:line="360" w:lineRule="auto"/>
         <w:jc w:val="both"/>
-      </w:pPr>
-      <w:r>
+        <w:rPr>
+          <w:sz w:val="24"/>
+          <w:szCs w:val="24"/>
+        </w:rPr>
+      </w:pPr>
+      <w:r>
+        <w:rPr>
+          <w:sz w:val="24"/>
+          <w:szCs w:val="24"/>
+        </w:rPr>
         <w:t>Quantify each pipeline’s retrieval accuracy, answer quality, and computational efficiency, and identify the conditions under which each paradigm degrades.</w:t>
       </w:r>
     </w:p>
@@ -1567,8 +1985,16 @@
         </w:numPr>
         <w:spacing w:after="110" w:line="360" w:lineRule="auto"/>
         <w:jc w:val="both"/>
-      </w:pPr>
-      <w:r>
+        <w:rPr>
+          <w:sz w:val="24"/>
+          <w:szCs w:val="24"/>
+        </w:rPr>
+      </w:pPr>
+      <w:r>
+        <w:rPr>
+          <w:sz w:val="24"/>
+          <w:szCs w:val="24"/>
+        </w:rPr>
         <w:t>Parse SEC 10-K filings into metadata-enriched, atomic text/table nodes without bisecting tables.</w:t>
       </w:r>
     </w:p>
@@ -1581,9 +2007,31 @@
         </w:numPr>
         <w:spacing w:after="110" w:line="360" w:lineRule="auto"/>
         <w:jc w:val="both"/>
-      </w:pPr>
-      <w:r>
-        <w:t>Implement P1 (dense embeddings with a cross-encoder reranker), P2 (Okapi BM25), and P3 (hierarchical summary-tree) retrievers sharing one answering model.</w:t>
+        <w:rPr>
+          <w:sz w:val="24"/>
+          <w:szCs w:val="24"/>
+        </w:rPr>
+      </w:pPr>
+      <w:r>
+        <w:rPr>
+          <w:sz w:val="24"/>
+          <w:szCs w:val="24"/>
+        </w:rPr>
+        <w:t xml:space="preserve">Implement </w:t>
+      </w:r>
+      <w:r>
+        <w:rPr>
+          <w:sz w:val="24"/>
+          <w:szCs w:val="24"/>
+        </w:rPr>
+        <w:t xml:space="preserve">three distinct pipelines - </w:t>
+      </w:r>
+      <w:r>
+        <w:rPr>
+          <w:sz w:val="24"/>
+          <w:szCs w:val="24"/>
+        </w:rPr>
+        <w:t>P1 (dense embeddings with a cross-encoder reranker), P2 (Okapi BM25), and P3 (hierarchical summary-tree) retrievers sharing one answering model.</w:t>
       </w:r>
     </w:p>
     <w:p>
@@ -1595,9 +2043,46 @@
         </w:numPr>
         <w:spacing w:after="110" w:line="360" w:lineRule="auto"/>
         <w:jc w:val="both"/>
-      </w:pPr>
-      <w:r>
-        <w:t>Generate and adversarially verify a 140-query benchmark with node-level ground-truth citations.</w:t>
+        <w:rPr>
+          <w:sz w:val="24"/>
+          <w:szCs w:val="24"/>
+        </w:rPr>
+      </w:pPr>
+      <w:r>
+        <w:rPr>
+          <w:sz w:val="24"/>
+          <w:szCs w:val="24"/>
+        </w:rPr>
+        <w:lastRenderedPageBreak/>
+        <w:t>Generate and adversarially verify a 140-query benchmark with node</w:t>
+      </w:r>
+      <w:r>
+        <w:rPr>
+          <w:sz w:val="24"/>
+          <w:szCs w:val="24"/>
+        </w:rPr>
+        <w:t xml:space="preserve"> </w:t>
+      </w:r>
+      <w:r>
+        <w:rPr>
+          <w:sz w:val="24"/>
+          <w:szCs w:val="24"/>
+        </w:rPr>
+        <w:t>level ground</w:t>
+      </w:r>
+      <w:r>
+        <w:rPr>
+          <w:sz w:val="24"/>
+          <w:szCs w:val="24"/>
+        </w:rPr>
+        <w:t xml:space="preserve"> </w:t>
+      </w:r>
+      <w:r>
+        <w:rPr>
+          <w:sz w:val="24"/>
+          <w:szCs w:val="24"/>
+        </w:rPr>
+        <w:t>truth citations.</w:t>
       </w:r>
     </w:p>
     <w:p>
@@ -1609,8 +2094,16 @@
         </w:numPr>
         <w:spacing w:after="110" w:line="360" w:lineRule="auto"/>
         <w:jc w:val="both"/>
-      </w:pPr>
-      <w:r>
+        <w:rPr>
+          <w:sz w:val="24"/>
+          <w:szCs w:val="24"/>
+        </w:rPr>
+      </w:pPr>
+      <w:r>
+        <w:rPr>
+          <w:sz w:val="24"/>
+          <w:szCs w:val="24"/>
+        </w:rPr>
         <w:t>Validate an automated LLM judge against human scores before using it to grade the full benchmark.</w:t>
       </w:r>
     </w:p>
@@ -1623,8 +2116,16 @@
         </w:numPr>
         <w:spacing w:after="110" w:line="360" w:lineRule="auto"/>
         <w:jc w:val="both"/>
-      </w:pPr>
-      <w:r>
+        <w:rPr>
+          <w:sz w:val="24"/>
+          <w:szCs w:val="24"/>
+        </w:rPr>
+      </w:pPr>
+      <w:r>
+        <w:rPr>
+          <w:sz w:val="24"/>
+          <w:szCs w:val="24"/>
+        </w:rPr>
         <w:t>Persist all queries, retrieved evidence, and scores in a relational (SQLite) store with crash-safe resume.</w:t>
       </w:r>
     </w:p>
@@ -1634,7 +2135,6 @@
       </w:pPr>
       <w:bookmarkStart w:id="6" w:name="_Toc233304223"/>
       <w:r>
-        <w:lastRenderedPageBreak/>
         <w:t>2.3 Requirements: Desirable</w:t>
       </w:r>
       <w:bookmarkEnd w:id="6"/>
@@ -1648,8 +2148,16 @@
         </w:numPr>
         <w:spacing w:after="110" w:line="360" w:lineRule="auto"/>
         <w:jc w:val="both"/>
-      </w:pPr>
-      <w:r>
+        <w:rPr>
+          <w:sz w:val="24"/>
+          <w:szCs w:val="24"/>
+        </w:rPr>
+      </w:pPr>
+      <w:r>
+        <w:rPr>
+          <w:sz w:val="24"/>
+          <w:szCs w:val="24"/>
+        </w:rPr>
         <w:t>Extend the comparison with a metadata pre-filter or hybrid-fusion ablation (reserved future-scope pipelines).</w:t>
       </w:r>
     </w:p>
@@ -1662,8 +2170,16 @@
         </w:numPr>
         <w:spacing w:after="110" w:line="360" w:lineRule="auto"/>
         <w:jc w:val="both"/>
-      </w:pPr>
-      <w:r>
+        <w:rPr>
+          <w:sz w:val="24"/>
+          <w:szCs w:val="24"/>
+        </w:rPr>
+      </w:pPr>
+      <w:r>
+        <w:rPr>
+          <w:sz w:val="24"/>
+          <w:szCs w:val="24"/>
+        </w:rPr>
         <w:t>Visualise per-quadrant performance gaps in a comparison view for the dissertation write-up.</w:t>
       </w:r>
     </w:p>
@@ -1684,18 +2200,32 @@
       <w:pPr>
         <w:spacing w:after="180" w:line="360" w:lineRule="auto"/>
         <w:jc w:val="both"/>
-      </w:pPr>
-      <w:r>
+        <w:rPr>
+          <w:sz w:val="24"/>
+          <w:szCs w:val="24"/>
+        </w:rPr>
+      </w:pPr>
+      <w:r>
+        <w:rPr>
+          <w:sz w:val="24"/>
+          <w:szCs w:val="24"/>
+        </w:rPr>
         <w:t xml:space="preserve">Lewis </w:t>
       </w:r>
       <w:r>
         <w:rPr>
           <w:i/>
           <w:iCs/>
+          <w:sz w:val="24"/>
+          <w:szCs w:val="24"/>
         </w:rPr>
         <w:t>et al.</w:t>
       </w:r>
       <w:r>
+        <w:rPr>
+          <w:sz w:val="24"/>
+          <w:szCs w:val="24"/>
+        </w:rPr>
         <w:t xml:space="preserve"> (2020) framed answer generation grounded in retrieved evidence as a way of reducing hallucination relative to purely parametric generation, and this Retrieval-Augmented Generation framing motivates the project’s overall design: a retriever supplies evidence, and one shared answerer consumes it.</w:t>
       </w:r>
     </w:p>
@@ -1703,28 +2233,48 @@
       <w:pPr>
         <w:spacing w:after="180" w:line="360" w:lineRule="auto"/>
         <w:jc w:val="both"/>
-      </w:pPr>
-      <w:r>
+        <w:rPr>
+          <w:sz w:val="24"/>
+          <w:szCs w:val="24"/>
+        </w:rPr>
+      </w:pPr>
+      <w:r>
+        <w:rPr>
+          <w:sz w:val="24"/>
+          <w:szCs w:val="24"/>
+        </w:rPr>
         <w:t xml:space="preserve">On the statistical side, Robertson and Zaragoza (2009) formalised the probabilistic relevance framework that underlies BM25, which remains a strong, fully deterministic retrieval baseline and forms this project’s P2 pipeline. On the semantic side, Karpukhin </w:t>
       </w:r>
       <w:r>
         <w:rPr>
           <w:i/>
           <w:iCs/>
+          <w:sz w:val="24"/>
+          <w:szCs w:val="24"/>
         </w:rPr>
         <w:t>et al.</w:t>
       </w:r>
       <w:r>
+        <w:rPr>
+          <w:sz w:val="24"/>
+          <w:szCs w:val="24"/>
+        </w:rPr>
         <w:t xml:space="preserve"> (2020) showed that learned dense bi-encoder retrieval can outperform BM25 by 9–19% absolute on open-domain question answering, while Nogueira and Cho (2019) showed that adding a cross-encoder reranking stage over an initial candidate set materially improves precision; together these findings motivate the project’s P1 embed-then-rerank design. The embedding and reranker models used for P1 draw on the BGE family released by Xiao </w:t>
       </w:r>
       <w:r>
         <w:rPr>
           <w:i/>
           <w:iCs/>
+          <w:sz w:val="24"/>
+          <w:szCs w:val="24"/>
         </w:rPr>
         <w:t>et al.</w:t>
       </w:r>
       <w:r>
+        <w:rPr>
+          <w:sz w:val="24"/>
+          <w:szCs w:val="24"/>
+        </w:rPr>
         <w:t xml:space="preserve"> (2023).</w:t>
       </w:r>
     </w:p>
@@ -1732,18 +2282,32 @@
       <w:pPr>
         <w:spacing w:after="180" w:line="360" w:lineRule="auto"/>
         <w:jc w:val="both"/>
-      </w:pPr>
-      <w:r>
+        <w:rPr>
+          <w:sz w:val="24"/>
+          <w:szCs w:val="24"/>
+        </w:rPr>
+      </w:pPr>
+      <w:r>
+        <w:rPr>
+          <w:sz w:val="24"/>
+          <w:szCs w:val="24"/>
+        </w:rPr>
         <w:t xml:space="preserve">Sarthi </w:t>
       </w:r>
       <w:r>
         <w:rPr>
           <w:i/>
           <w:iCs/>
+          <w:sz w:val="24"/>
+          <w:szCs w:val="24"/>
         </w:rPr>
         <w:t>et al.</w:t>
       </w:r>
       <w:r>
+        <w:rPr>
+          <w:sz w:val="24"/>
+          <w:szCs w:val="24"/>
+        </w:rPr>
         <w:t xml:space="preserve"> (2024) introduced RAPTOR, which recursively clusters and summarises text into a retrievable tree; this is the architectural basis for the project’s P3 structural pipeline, although their evaluation, like most RAG literature, is conducted on narrative rather than tabular text.</w:t>
       </w:r>
     </w:p>
@@ -1751,28 +2315,56 @@
       <w:pPr>
         <w:spacing w:after="180" w:line="360" w:lineRule="auto"/>
         <w:jc w:val="both"/>
-      </w:pPr>
-      <w:r>
+        <w:rPr>
+          <w:sz w:val="24"/>
+          <w:szCs w:val="24"/>
+        </w:rPr>
+      </w:pPr>
+      <w:r>
+        <w:rPr>
+          <w:sz w:val="24"/>
+          <w:szCs w:val="24"/>
+        </w:rPr>
         <w:t xml:space="preserve">The domain challenge that motivates this project is well documented: Chen </w:t>
       </w:r>
       <w:r>
         <w:rPr>
           <w:i/>
           <w:iCs/>
+          <w:sz w:val="24"/>
+          <w:szCs w:val="24"/>
         </w:rPr>
         <w:t>et al.</w:t>
       </w:r>
       <w:r>
-        <w:t xml:space="preserve"> (2021) introduced FinQA and showed that even strong pre-trained models fall far short of expert humans at multi-step numerical reasoning over financial tables, which is why the benchmark constructed here explicitly stratifies table-heavy query quadrants. Liu </w:t>
+        <w:rPr>
+          <w:sz w:val="24"/>
+          <w:szCs w:val="24"/>
+        </w:rPr>
+        <w:t xml:space="preserve"> (2021) introduced FinQA and showed that even strong pre-trained models fall far short of expert humans at multi-step numerical reasoning over financial tables, which is why the benchmark constructed here </w:t>
+      </w:r>
+      <w:r>
+        <w:rPr>
+          <w:sz w:val="24"/>
+          <w:szCs w:val="24"/>
+        </w:rPr>
+        <w:lastRenderedPageBreak/>
+        <w:t xml:space="preserve">explicitly stratifies table-heavy query quadrants. Liu </w:t>
       </w:r>
       <w:r>
         <w:rPr>
           <w:i/>
           <w:iCs/>
+          <w:sz w:val="24"/>
+          <w:szCs w:val="24"/>
         </w:rPr>
         <w:t>et al.</w:t>
       </w:r>
       <w:r>
+        <w:rPr>
+          <w:sz w:val="24"/>
+          <w:szCs w:val="24"/>
+        </w:rPr>
         <w:t xml:space="preserve"> (2024) further showed that model accuracy degrades when relevant evidence sits in the middle of a long context, which is the argument for retrieval-based context selection over naive full-document stuffing.</w:t>
       </w:r>
     </w:p>
@@ -1780,18 +2372,32 @@
       <w:pPr>
         <w:spacing w:after="180" w:line="360" w:lineRule="auto"/>
         <w:jc w:val="both"/>
-      </w:pPr>
-      <w:r>
+        <w:rPr>
+          <w:sz w:val="24"/>
+          <w:szCs w:val="24"/>
+        </w:rPr>
+      </w:pPr>
+      <w:r>
+        <w:rPr>
+          <w:sz w:val="24"/>
+          <w:szCs w:val="24"/>
+        </w:rPr>
         <w:t xml:space="preserve">Finally, on evaluation methodology, Zheng </w:t>
       </w:r>
       <w:r>
         <w:rPr>
           <w:i/>
           <w:iCs/>
+          <w:sz w:val="24"/>
+          <w:szCs w:val="24"/>
         </w:rPr>
         <w:t>et al.</w:t>
       </w:r>
       <w:r>
+        <w:rPr>
+          <w:sz w:val="24"/>
+          <w:szCs w:val="24"/>
+        </w:rPr>
         <w:t xml:space="preserve"> (2023) showed that a strong LLM judge can reach over 80% agreement with human preference judgements, the same threshold this project adopts as its judge-validation gate before trusting an automated judge to grade the full benchmark.</w:t>
       </w:r>
     </w:p>
@@ -1799,9 +2405,31 @@
       <w:pPr>
         <w:spacing w:after="180" w:line="360" w:lineRule="auto"/>
         <w:jc w:val="both"/>
-      </w:pPr>
-      <w:r>
-        <w:t>None of the studies above evaluate all three retrieval paradigms side by side on a single financial-filing benchmark stratified by both query type and content modality (text versus table); this is the specific gap the present project addresses.</w:t>
+        <w:rPr>
+          <w:sz w:val="24"/>
+          <w:szCs w:val="24"/>
+        </w:rPr>
+      </w:pPr>
+      <w:r>
+        <w:rPr>
+          <w:sz w:val="24"/>
+          <w:szCs w:val="24"/>
+        </w:rPr>
+        <w:t xml:space="preserve">None of the studies above evaluate all three retrieval paradigms side by side on a single financial-filing benchmark stratified by both query type and content modality (text versus table); this is the specific gap the </w:t>
+      </w:r>
+      <w:r>
+        <w:rPr>
+          <w:sz w:val="24"/>
+          <w:szCs w:val="24"/>
+        </w:rPr>
+        <w:t>proposed</w:t>
+      </w:r>
+      <w:r>
+        <w:rPr>
+          <w:sz w:val="24"/>
+          <w:szCs w:val="24"/>
+        </w:rPr>
+        <w:t xml:space="preserve"> project addresses.</w:t>
       </w:r>
     </w:p>
     <w:p>
@@ -1813,27 +2441,50 @@
       </w:pPr>
       <w:bookmarkStart w:id="8" w:name="_Toc233304225"/>
       <w:r>
-        <w:lastRenderedPageBreak/>
         <w:t>4. Development and Implementation Summary</w:t>
       </w:r>
       <w:bookmarkEnd w:id="8"/>
     </w:p>
     <w:p>
       <w:pPr>
-        <w:spacing w:after="120" w:line="240" w:lineRule="auto"/>
+        <w:spacing w:after="180" w:line="360" w:lineRule="auto"/>
         <w:jc w:val="both"/>
-      </w:pPr>
-      <w:r>
+        <w:rPr>
+          <w:sz w:val="24"/>
+          <w:szCs w:val="24"/>
+        </w:rPr>
+      </w:pPr>
+      <w:r>
+        <w:rPr>
+          <w:sz w:val="24"/>
+          <w:szCs w:val="24"/>
+        </w:rPr>
         <w:t>The system is implemented in Python 3, using LlamaIndex as a common retrieval and orchestration backbone so that all three pipelines expose the same retriever interface. Python is the natural choice because the entire required ecosystem, LlamaIndex, the Groq SDK, rank_bm25, ChromaDB, and the HuggingFace BGE models, is Python-native, so reimplementing any part of it in another language would mean rebuilding mature retrieval and embedding infrastructure from scratch. LlamaIndex specifically is chosen over a lower-level alternative such as LangChain because its node and scored-result abstractions already match the project’s own node-centric data model (Section 5), allowing the three pipelines to share one retriever interface without an additional adapter layer. Generation, dataset critique, and judging are performed by open-source instruction models served free of charge via Groq (rate-limited rather than billed, so the implementation has zero recurring spend). Embeddings (BAAI/bge-small-en-v1.5) and reranking (BAAI/bge-reranker-base) run locally on CPU.</w:t>
       </w:r>
     </w:p>
     <w:p>
       <w:pPr>
-        <w:spacing w:after="120" w:line="240" w:lineRule="auto"/>
+        <w:spacing w:after="180" w:line="360" w:lineRule="auto"/>
         <w:jc w:val="both"/>
-      </w:pPr>
-      <w:r>
-        <w:t>ChromaDB provides the local vector store for P1, rank_bm25 provides the keyword index for P2, and a cached LlamaIndex SummaryIndex provides the structural pipeline for P3. A single SQLite database, run in Write-Ahead Logging mode, is the sole state store; every benchmark run commits immediately, so a crash resumes from the last written row rather than re-spending free-tier quota. Asynchronous worker pools, bounded by a semaphore and wrapped in an exponential-backoff retry layer, keep concurrent API calls within Groq’s free-tier rate limits. Workflow is organised phase-by-phase as set out in Section 10, with the code for each phase committed and exercised under a three-item local throttle before being released at full scale, so a fault discovered in one phase is never allowed to consume the free-tier quota reserved for an earlier or later phase.</w:t>
+        <w:rPr>
+          <w:sz w:val="24"/>
+          <w:szCs w:val="24"/>
+        </w:rPr>
+      </w:pPr>
+      <w:r>
+        <w:rPr>
+          <w:sz w:val="24"/>
+          <w:szCs w:val="24"/>
+        </w:rPr>
+        <w:t xml:space="preserve">ChromaDB provides the local vector store for P1, rank_bm25 provides the keyword index for P2, and a cached LlamaIndex SummaryIndex provides the structural pipeline for P3. A single SQLite database, run in Write-Ahead Logging mode, is the sole state store; every benchmark run commits immediately, so a crash resumes from the last written row rather than re-spending free-tier quota. Queries are split into three disjoint sets, PQ (100, the benchmark), GQ (20, Judge teaching exemplars) and JEQ (20, Judge validation), enforced at the schema level so no pipeline or prompt ever sees beyond its own group. Asynchronous worker pools, bounded by a semaphore and wrapped in an exponential-backoff retry layer, keep concurrent API calls within Groq’s free-tier rate limits. Workflow is organised phase-by-phase as set out in Section 10, with the code for each </w:t>
+      </w:r>
+      <w:r>
+        <w:rPr>
+          <w:sz w:val="24"/>
+          <w:szCs w:val="24"/>
+        </w:rPr>
+        <w:lastRenderedPageBreak/>
+        <w:t>phase committed and exercised under a three-item local throttle before being released at full scale, so a fault discovered in one phase is never allowed to consume the free-tier quota reserved for an earlier or later phase.</w:t>
       </w:r>
     </w:p>
     <w:tbl>
@@ -2281,7 +2932,7 @@
                 <w:sz w:val="19"/>
                 <w:szCs w:val="19"/>
               </w:rPr>
-              <w:t>LLM Judge (Qwen3-32b, validated &gt;80% human agreement) + Deterministic Code Metrics</w:t>
+              <w:t>LLM Judge (Qwen3-32b, validated &gt;80% human agreement on JEQ) + Deterministic Code Metrics</w:t>
             </w:r>
           </w:p>
         </w:tc>
@@ -2361,16 +3012,97 @@
       <w:pPr>
         <w:spacing w:before="90" w:after="240"/>
         <w:jc w:val="center"/>
-      </w:pPr>
-      <w:r>
         <w:rPr>
           <w:rFonts w:ascii="Calibri" w:eastAsia="Calibri" w:hAnsi="Calibri" w:cs="Calibri"/>
           <w:color w:val="44494F"/>
           <w:sz w:val="20"/>
           <w:szCs w:val="20"/>
         </w:rPr>
+      </w:pPr>
+      <w:r>
+        <w:rPr>
+          <w:rFonts w:ascii="Calibri" w:eastAsia="Calibri" w:hAnsi="Calibri" w:cs="Calibri"/>
+          <w:color w:val="44494F"/>
+          <w:sz w:val="20"/>
+          <w:szCs w:val="20"/>
+        </w:rPr>
         <w:t>Figure 4.1: High-Level Pipeline Architecture</w:t>
       </w:r>
+    </w:p>
+    <w:tbl>
+      <w:tblPr>
+        <w:tblpPr w:leftFromText="180" w:rightFromText="180" w:vertAnchor="text" w:horzAnchor="margin" w:tblpY="89"/>
+        <w:tblW w:w="9103" w:type="dxa"/>
+        <w:tblBorders>
+          <w:top w:val="single" w:sz="4" w:space="0" w:color="auto"/>
+          <w:left w:val="single" w:sz="4" w:space="0" w:color="auto"/>
+          <w:bottom w:val="single" w:sz="4" w:space="0" w:color="auto"/>
+          <w:right w:val="single" w:sz="4" w:space="0" w:color="auto"/>
+          <w:insideH w:val="single" w:sz="4" w:space="0" w:color="auto"/>
+          <w:insideV w:val="single" w:sz="4" w:space="0" w:color="auto"/>
+        </w:tblBorders>
+        <w:tblCellMar>
+          <w:left w:w="10" w:type="dxa"/>
+          <w:right w:w="10" w:type="dxa"/>
+        </w:tblCellMar>
+        <w:tblLook w:val="04A0" w:firstRow="1" w:lastRow="0" w:firstColumn="1" w:lastColumn="0" w:noHBand="0" w:noVBand="1"/>
+      </w:tblPr>
+      <w:tblGrid>
+        <w:gridCol w:w="9103"/>
+      </w:tblGrid>
+      <w:tr>
+        <w:trPr>
+          <w:cantSplit/>
+          <w:trHeight w:val="865"/>
+        </w:trPr>
+        <w:tc>
+          <w:tcPr>
+            <w:tcW w:w="9103" w:type="dxa"/>
+            <w:tcBorders>
+              <w:top w:val="single" w:sz="2" w:space="0" w:color="FBF0D6"/>
+              <w:left w:val="single" w:sz="28" w:space="0" w:color="D4A017"/>
+              <w:bottom w:val="single" w:sz="2" w:space="0" w:color="FBF0D6"/>
+              <w:right w:val="single" w:sz="2" w:space="0" w:color="FBF0D6"/>
+            </w:tcBorders>
+            <w:shd w:val="clear" w:color="auto" w:fill="FBF0D6"/>
+            <w:tcMar>
+              <w:top w:w="160" w:type="dxa"/>
+              <w:left w:w="220" w:type="dxa"/>
+              <w:bottom w:w="160" w:type="dxa"/>
+              <w:right w:w="220" w:type="dxa"/>
+            </w:tcMar>
+          </w:tcPr>
+          <w:p>
+            <w:pPr>
+              <w:jc w:val="both"/>
+            </w:pPr>
+            <w:r>
+              <w:rPr>
+                <w:b/>
+                <w:bCs/>
+                <w:color w:val="0A1F33"/>
+                <w:sz w:val="23"/>
+                <w:szCs w:val="23"/>
+              </w:rPr>
+              <w:t xml:space="preserve">Key point. </w:t>
+            </w:r>
+            <w:r>
+              <w:rPr>
+                <w:color w:val="0A1F33"/>
+                <w:sz w:val="23"/>
+                <w:szCs w:val="23"/>
+              </w:rPr>
+              <w:t>Every recurring component in this pipeline runs on a free tier or local CPU, so the expected spend for the full benchmark is $0.00; the only binding constraint is Groq's daily token throughput, not budget.</w:t>
+            </w:r>
+          </w:p>
+        </w:tc>
+      </w:tr>
+    </w:tbl>
+    <w:p>
+      <w:pPr>
+        <w:spacing w:before="90" w:after="240"/>
+        <w:jc w:val="center"/>
+      </w:pPr>
     </w:p>
     <w:p>
       <w:pPr>
@@ -2381,27 +3113,190 @@
       </w:pPr>
       <w:bookmarkStart w:id="9" w:name="_Toc233304226"/>
       <w:r>
-        <w:lastRenderedPageBreak/>
         <w:t>5. Data Sources</w:t>
       </w:r>
       <w:bookmarkEnd w:id="9"/>
     </w:p>
     <w:p>
       <w:pPr>
+        <w:keepNext/>
+        <w:keepLines/>
         <w:spacing w:after="180" w:line="360" w:lineRule="auto"/>
         <w:jc w:val="both"/>
-      </w:pPr>
-      <w:r>
-        <w:t>All data is sourced from SEC EDGAR, the United States Securities and Exchange Commission’s public filing system: a corpus of approximately six to nine 10-K annual filings, drawn from two to three companies across two to three fiscal years. These are public corporate disclosures and contain no personal or human-subject data. Filings are parsed via LlamaParse (free tier) into metadata-enriched text and table nodes.</w:t>
+        <w:rPr>
+          <w:sz w:val="24"/>
+          <w:szCs w:val="24"/>
+        </w:rPr>
+      </w:pPr>
+      <w:r>
+        <w:rPr>
+          <w:sz w:val="24"/>
+          <w:szCs w:val="24"/>
+        </w:rPr>
+        <w:t xml:space="preserve">All data is sourced from SEC EDGAR, the US Securities and Exchange Commission's public filing system: a corpus of approximately six to nine 10-K annual filings, drawn from two to three companies across two to three fiscal years. These are public corporate disclosures containing no personal or human-subject data; as public-domain US federal regulatory records, they carry no copyright restriction, so no licence or consent is required for their use. Filings are parsed via </w:t>
+      </w:r>
+      <w:proofErr w:type="spellStart"/>
+      <w:r>
+        <w:rPr>
+          <w:sz w:val="24"/>
+          <w:szCs w:val="24"/>
+        </w:rPr>
+        <w:t>LlamaParse</w:t>
+      </w:r>
+      <w:proofErr w:type="spellEnd"/>
+      <w:r>
+        <w:rPr>
+          <w:sz w:val="24"/>
+          <w:szCs w:val="24"/>
+        </w:rPr>
+        <w:t xml:space="preserve"> (free tier) into metadata-enriched text and table nodes.</w:t>
       </w:r>
     </w:p>
     <w:p>
       <w:pPr>
+        <w:pStyle w:val="Heading1"/>
+        <w:pBdr>
+          <w:bottom w:val="single" w:sz="8" w:space="6" w:color="15406B"/>
+        </w:pBdr>
+      </w:pPr>
+      <w:bookmarkStart w:id="10" w:name="_Toc233304227"/>
+      <w:r>
+        <w:t>6. Testing and Evaluation</w:t>
+      </w:r>
+      <w:bookmarkEnd w:id="10"/>
+    </w:p>
+    <w:p>
+      <w:pPr>
+        <w:keepNext/>
+        <w:keepLines/>
         <w:spacing w:after="180" w:line="360" w:lineRule="auto"/>
         <w:jc w:val="both"/>
-      </w:pPr>
-      <w:r>
-        <w:t>The 140-query evaluation benchmark is itself synthetically generated and adversarially verified from this corpus by two independent open-source language models acting as a cross-family generator and critic, with no third-party data collection and no participant data involved at any stage. This satisfies Data Category A0.</w:t>
+        <w:rPr>
+          <w:sz w:val="24"/>
+          <w:szCs w:val="24"/>
+        </w:rPr>
+      </w:pPr>
+      <w:r>
+        <w:rPr>
+          <w:sz w:val="24"/>
+          <w:szCs w:val="24"/>
+        </w:rPr>
+        <w:t>The system is evaluated across three independent pillars:</w:t>
+      </w:r>
+    </w:p>
+    <w:p>
+      <w:pPr>
+        <w:pStyle w:val="ListParagraph"/>
+        <w:numPr>
+          <w:ilvl w:val="0"/>
+          <w:numId w:val="2"/>
+        </w:numPr>
+        <w:spacing w:after="110" w:line="360" w:lineRule="auto"/>
+        <w:jc w:val="both"/>
+      </w:pPr>
+      <w:r>
+        <w:rPr>
+          <w:b/>
+          <w:bCs/>
+          <w:sz w:val="24"/>
+          <w:szCs w:val="24"/>
+        </w:rPr>
+        <w:t>Retrieval metrics</w:t>
+      </w:r>
+      <w:r>
+        <w:rPr>
+          <w:sz w:val="24"/>
+          <w:szCs w:val="24"/>
+        </w:rPr>
+        <w:t xml:space="preserve"> (Precision@K, Recall@K, Evidence Hit Rate) are computed deterministically against node-ID ground truth.</w:t>
+      </w:r>
+    </w:p>
+    <w:p>
+      <w:pPr>
+        <w:pStyle w:val="ListParagraph"/>
+        <w:numPr>
+          <w:ilvl w:val="0"/>
+          <w:numId w:val="2"/>
+        </w:numPr>
+        <w:spacing w:after="110" w:line="360" w:lineRule="auto"/>
+        <w:jc w:val="both"/>
+      </w:pPr>
+      <w:r>
+        <w:rPr>
+          <w:b/>
+          <w:bCs/>
+          <w:sz w:val="24"/>
+          <w:szCs w:val="24"/>
+        </w:rPr>
+        <w:lastRenderedPageBreak/>
+        <w:t>Answer-quality metrics</w:t>
+      </w:r>
+      <w:r>
+        <w:rPr>
+          <w:sz w:val="24"/>
+          <w:szCs w:val="24"/>
+        </w:rPr>
+        <w:t xml:space="preserve"> use an LLM-as-judge score (1–10) as the primary measure, with token-level F1 and numeric-tolerant Exact Match as secondary lexical checks, plus a code-level Citation Audit that flags answers which are correct only by coincidence, where the cited evidence does not match the ground truth.</w:t>
+      </w:r>
+    </w:p>
+    <w:p>
+      <w:pPr>
+        <w:pStyle w:val="ListParagraph"/>
+        <w:numPr>
+          <w:ilvl w:val="0"/>
+          <w:numId w:val="2"/>
+        </w:numPr>
+        <w:spacing w:after="110" w:line="360" w:lineRule="auto"/>
+        <w:jc w:val="both"/>
+      </w:pPr>
+      <w:r>
+        <w:rPr>
+          <w:b/>
+          <w:bCs/>
+          <w:sz w:val="24"/>
+          <w:szCs w:val="24"/>
+        </w:rPr>
+        <w:t>Efficiency metrics</w:t>
+      </w:r>
+      <w:r>
+        <w:rPr>
+          <w:sz w:val="24"/>
+          <w:szCs w:val="24"/>
+        </w:rPr>
+        <w:t xml:space="preserve"> cover latency, token consumption, and one-time index-build cost per pipeline.</w:t>
+      </w:r>
+    </w:p>
+    <w:p>
+      <w:pPr>
+        <w:spacing w:after="180" w:line="360" w:lineRule="auto"/>
+        <w:jc w:val="both"/>
+        <w:rPr>
+          <w:sz w:val="24"/>
+          <w:szCs w:val="24"/>
+        </w:rPr>
+      </w:pPr>
+      <w:r>
+        <w:rPr>
+          <w:sz w:val="24"/>
+          <w:szCs w:val="24"/>
+        </w:rPr>
+        <w:t xml:space="preserve">The automated judge is not trusted by default. It must first clear a hard validation gate, reaching greater than 80% agreement with the researcher’s own hand-scored outputs on a disjoint validation set, before it is permitted to grade the full benchmark, mirroring the agreement threshold reported for LLM judges by Zheng </w:t>
+      </w:r>
+      <w:r>
+        <w:rPr>
+          <w:i/>
+          <w:iCs/>
+          <w:sz w:val="24"/>
+          <w:szCs w:val="24"/>
+        </w:rPr>
+        <w:t>et al.</w:t>
+      </w:r>
+      <w:r>
+        <w:rPr>
+          <w:sz w:val="24"/>
+          <w:szCs w:val="24"/>
+        </w:rPr>
+        <w:t xml:space="preserve"> (2023). Every script that calls a language model is first run end-to-end under a hardcoded three-item local throttle, to catch bugs before any free-tier quota is spent at scale.</w:t>
       </w:r>
     </w:p>
     <w:tbl>
@@ -2465,7 +3360,7 @@
                 <w:sz w:val="23"/>
                 <w:szCs w:val="23"/>
               </w:rPr>
-              <w:t>Every recurring component in this pipeline runs on a free tier or local CPU, so the expected spend for the full benchmark is $0.00; the only binding constraint is Groq's daily token throughput, not budget.</w:t>
+              <w:t>The judge is gated, not trusted by default: it must clear 80% agreement with hand-scored human judgements on a disjoint validation set before it is allowed to grade the full 900-run benchmark.</w:t>
             </w:r>
           </w:p>
         </w:tc>
@@ -2478,20 +3373,41 @@
           <w:bottom w:val="single" w:sz="8" w:space="6" w:color="15406B"/>
         </w:pBdr>
       </w:pPr>
-      <w:bookmarkStart w:id="10" w:name="_Toc233304227"/>
-      <w:r>
-        <w:t>6. Testing and Evaluation</w:t>
-      </w:r>
-      <w:bookmarkEnd w:id="10"/>
+      <w:bookmarkStart w:id="11" w:name="_Toc233304228"/>
+      <w:r>
+        <w:t>7. Project Ethics and Human Participants</w:t>
+      </w:r>
+      <w:bookmarkEnd w:id="11"/>
     </w:p>
     <w:p>
       <w:pPr>
         <w:spacing w:after="180" w:line="360" w:lineRule="auto"/>
         <w:jc w:val="both"/>
-      </w:pPr>
-      <w:r>
-        <w:t>The system is evaluated across three independent pillars:</w:t>
-      </w:r>
+        <w:rPr>
+          <w:sz w:val="24"/>
+          <w:szCs w:val="24"/>
+        </w:rPr>
+      </w:pPr>
+      <w:r>
+        <w:rPr>
+          <w:sz w:val="24"/>
+          <w:szCs w:val="24"/>
+        </w:rPr>
+        <w:t>This project involves no human participants and no personal data; all source material is SEC 10-K filings, which are public corporate disclosures (Data Category A0). The two manual steps in the methodology, hand-labelling 20 teaching exemplars and hand-scoring 60 judge-validation outputs, are carried out solely by the researcher as part of constructing the evaluation harness itself, rather than as a study involving external participants, and therefore fall outside the scope of human-participant ethics review. No further ethical approval beyond this statement is required for the activity planned within this assessment.</w:t>
+      </w:r>
+    </w:p>
+    <w:p>
+      <w:pPr>
+        <w:pStyle w:val="Heading1"/>
+        <w:pBdr>
+          <w:bottom w:val="single" w:sz="8" w:space="6" w:color="15406B"/>
+        </w:pBdr>
+      </w:pPr>
+      <w:bookmarkStart w:id="12" w:name="_Toc233304229"/>
+      <w:r>
+        <w:t>8. BCS Project Criteria</w:t>
+      </w:r>
+      <w:bookmarkEnd w:id="12"/>
     </w:p>
     <w:p>
       <w:pPr>
@@ -2507,11 +3423,26 @@
         <w:rPr>
           <w:b/>
           <w:bCs/>
-        </w:rPr>
-        <w:t>Retrieval metrics</w:t>
-      </w:r>
-      <w:r>
-        <w:t xml:space="preserve"> (Precision@K, Recall@K, Evidence Hit Rate) are computed deterministically against node-ID ground truth.</w:t>
+          <w:sz w:val="24"/>
+          <w:szCs w:val="24"/>
+        </w:rPr>
+        <w:t xml:space="preserve">Systematic </w:t>
+      </w:r>
+      <w:r>
+        <w:rPr>
+          <w:b/>
+          <w:bCs/>
+          <w:sz w:val="24"/>
+          <w:szCs w:val="24"/>
+        </w:rPr>
+        <w:t>understanding:</w:t>
+      </w:r>
+      <w:r>
+        <w:rPr>
+          <w:sz w:val="24"/>
+          <w:szCs w:val="24"/>
+        </w:rPr>
+        <w:t xml:space="preserve"> a cross-paradigm RAG comparison grounded in current literature (Lewis et al., 2020; Karpukhin et al., 2020; Sarthi et al., 2024), exposing paradigm limits not yet documented for SEC-filing data.</w:t>
       </w:r>
     </w:p>
     <w:p>
@@ -2528,11 +3459,36 @@
         <w:rPr>
           <w:b/>
           <w:bCs/>
-        </w:rPr>
-        <w:t>Answer-quality metrics</w:t>
-      </w:r>
-      <w:r>
-        <w:t xml:space="preserve"> use an LLM-as-judge score (1–10) as the primary measure, with token-level F1 and numeric-tolerant Exact Match as secondary lexical checks, plus a code-level Citation Audit that flags answers which are correct only by coincidence, where the cited evidence does not match the ground truth.</w:t>
+          <w:sz w:val="24"/>
+          <w:szCs w:val="24"/>
+        </w:rPr>
+        <w:lastRenderedPageBreak/>
+        <w:t xml:space="preserve">Comprehensive technique </w:t>
+      </w:r>
+      <w:r>
+        <w:rPr>
+          <w:b/>
+          <w:bCs/>
+          <w:sz w:val="24"/>
+          <w:szCs w:val="24"/>
+        </w:rPr>
+        <w:t>understanding</w:t>
+      </w:r>
+      <w:r>
+        <w:rPr>
+          <w:b/>
+          <w:bCs/>
+          <w:sz w:val="24"/>
+          <w:szCs w:val="24"/>
+        </w:rPr>
+        <w:t>:</w:t>
+      </w:r>
+      <w:r>
+        <w:rPr>
+          <w:sz w:val="24"/>
+          <w:szCs w:val="24"/>
+        </w:rPr>
+        <w:t xml:space="preserve"> dense retrieval, sparse retrieval, hierarchical summarisation, reranking, and LLM-based evaluation are all designed and built within a single project.</w:t>
       </w:r>
     </w:p>
     <w:p>
@@ -2549,134 +3505,18 @@
         <w:rPr>
           <w:b/>
           <w:bCs/>
-        </w:rPr>
-        <w:t>Efficiency metrics</w:t>
-      </w:r>
-      <w:r>
-        <w:t xml:space="preserve"> cover latency, token consumption, and one-time index-build cost per pipeline.</w:t>
-      </w:r>
-    </w:p>
-    <w:p>
-      <w:pPr>
-        <w:spacing w:after="180" w:line="360" w:lineRule="auto"/>
-        <w:jc w:val="both"/>
-      </w:pPr>
-      <w:r>
-        <w:t xml:space="preserve">The automated judge is not trusted by default. It must first clear a hard validation gate, reaching greater than 80% agreement with the researcher’s own hand-scored outputs on a disjoint validation set, before it is permitted to grade the full benchmark, mirroring the agreement threshold reported for LLM judges by Zheng </w:t>
-      </w:r>
-      <w:r>
-        <w:rPr>
-          <w:i/>
-          <w:iCs/>
-        </w:rPr>
-        <w:t>et al.</w:t>
-      </w:r>
-      <w:r>
-        <w:t xml:space="preserve"> (2023). Every script that calls a language model is first run end-to-end under a hardcoded three-item local throttle, to catch bugs before any free-tier quota is spent at scale.</w:t>
-      </w:r>
-    </w:p>
-    <w:tbl>
-      <w:tblPr>
-        <w:tblW w:w="9072" w:type="dxa"/>
-        <w:tblBorders>
-          <w:top w:val="single" w:sz="4" w:space="0" w:color="auto"/>
-          <w:left w:val="single" w:sz="4" w:space="0" w:color="auto"/>
-          <w:bottom w:val="single" w:sz="4" w:space="0" w:color="auto"/>
-          <w:right w:val="single" w:sz="4" w:space="0" w:color="auto"/>
-          <w:insideH w:val="single" w:sz="4" w:space="0" w:color="auto"/>
-          <w:insideV w:val="single" w:sz="4" w:space="0" w:color="auto"/>
-        </w:tblBorders>
-        <w:tblCellMar>
-          <w:left w:w="10" w:type="dxa"/>
-          <w:right w:w="10" w:type="dxa"/>
-        </w:tblCellMar>
-        <w:tblLook w:val="04A0" w:firstRow="1" w:lastRow="0" w:firstColumn="1" w:lastColumn="0" w:noHBand="0" w:noVBand="1"/>
-      </w:tblPr>
-      <w:tblGrid>
-        <w:gridCol w:w="9072"/>
-      </w:tblGrid>
-      <w:tr>
-        <w:trPr>
-          <w:cantSplit/>
-        </w:trPr>
-        <w:tc>
-          <w:tcPr>
-            <w:tcW w:w="9072" w:type="dxa"/>
-            <w:tcBorders>
-              <w:top w:val="single" w:sz="2" w:space="0" w:color="FBF0D6"/>
-              <w:left w:val="single" w:sz="28" w:space="0" w:color="D4A017"/>
-              <w:bottom w:val="single" w:sz="2" w:space="0" w:color="FBF0D6"/>
-              <w:right w:val="single" w:sz="2" w:space="0" w:color="FBF0D6"/>
-            </w:tcBorders>
-            <w:shd w:val="clear" w:color="auto" w:fill="FBF0D6"/>
-            <w:tcMar>
-              <w:top w:w="160" w:type="dxa"/>
-              <w:left w:w="220" w:type="dxa"/>
-              <w:bottom w:w="160" w:type="dxa"/>
-              <w:right w:w="220" w:type="dxa"/>
-            </w:tcMar>
-          </w:tcPr>
-          <w:p>
-            <w:pPr>
-              <w:jc w:val="both"/>
-            </w:pPr>
-            <w:r>
-              <w:rPr>
-                <w:b/>
-                <w:bCs/>
-                <w:color w:val="0A1F33"/>
-                <w:sz w:val="23"/>
-                <w:szCs w:val="23"/>
-              </w:rPr>
-              <w:t xml:space="preserve">Key point. </w:t>
-            </w:r>
-            <w:r>
-              <w:rPr>
-                <w:color w:val="0A1F33"/>
-                <w:sz w:val="23"/>
-                <w:szCs w:val="23"/>
-              </w:rPr>
-              <w:t>The judge is gated, not trusted by default: it must clear 80% agreement with hand-scored human judgements on a disjoint validation set before it is allowed to grade the full 900-run benchmark.</w:t>
-            </w:r>
-          </w:p>
-        </w:tc>
-      </w:tr>
-    </w:tbl>
-    <w:p>
-      <w:pPr>
-        <w:pStyle w:val="Heading1"/>
-        <w:pBdr>
-          <w:bottom w:val="single" w:sz="8" w:space="6" w:color="15406B"/>
-        </w:pBdr>
-      </w:pPr>
-      <w:bookmarkStart w:id="11" w:name="_Toc233304228"/>
-      <w:r>
-        <w:lastRenderedPageBreak/>
-        <w:t>7. Project Ethics and Human Participants</w:t>
-      </w:r>
-      <w:bookmarkEnd w:id="11"/>
-    </w:p>
-    <w:p>
-      <w:pPr>
-        <w:spacing w:after="180" w:line="360" w:lineRule="auto"/>
-        <w:jc w:val="both"/>
-      </w:pPr>
-      <w:r>
-        <w:t>This project involves no human participants and no personal data; all source material is SEC 10-K filings, which are public corporate disclosures (Data Category A0). The two manual steps in the methodology, hand-labelling 20 teaching exemplars and hand-scoring 60 judge-validation outputs, are carried out solely by the researcher as part of constructing the evaluation harness itself, rather than as a study involving external participants, and therefore fall outside the scope of human-participant ethics review. No further ethical approval beyond this statement is required for the activity planned within this assessment.</w:t>
-      </w:r>
-    </w:p>
-    <w:p>
-      <w:pPr>
-        <w:pStyle w:val="Heading1"/>
-        <w:pBdr>
-          <w:bottom w:val="single" w:sz="8" w:space="6" w:color="15406B"/>
-        </w:pBdr>
-      </w:pPr>
-      <w:bookmarkStart w:id="12" w:name="_Toc233304229"/>
-      <w:r>
-        <w:t>8. BCS Project Criteria</w:t>
-      </w:r>
-      <w:bookmarkEnd w:id="12"/>
+          <w:sz w:val="24"/>
+          <w:szCs w:val="24"/>
+        </w:rPr>
+        <w:t>Originality:</w:t>
+      </w:r>
+      <w:r>
+        <w:rPr>
+          <w:sz w:val="24"/>
+          <w:szCs w:val="24"/>
+        </w:rPr>
+        <w:t xml:space="preserve"> the cross-family generator/critic adversarial verification pipeline and the disjoint three-set (PQ/GQ/JEQ) evaluation design are original contributions to constructing a RAG benchmark without manual annotation at scale.</w:t>
+      </w:r>
     </w:p>
     <w:p>
       <w:pPr>
@@ -2689,7 +3529,20 @@
         <w:jc w:val="both"/>
       </w:pPr>
       <w:r>
-        <w:t>Systematic understanding: a cross-paradigm RAG comparison grounded in current literature (Lewis et al., 2020; Karpukhin et al., 2020; Sarthi et al., 2024), exposing paradigm limits not yet documented for SEC-filing data.</w:t>
+        <w:rPr>
+          <w:b/>
+          <w:bCs/>
+          <w:sz w:val="24"/>
+          <w:szCs w:val="24"/>
+        </w:rPr>
+        <w:t>Sound judgement under incomplete information:</w:t>
+      </w:r>
+      <w:r>
+        <w:rPr>
+          <w:sz w:val="24"/>
+          <w:szCs w:val="24"/>
+        </w:rPr>
+        <w:t xml:space="preserve"> deliberate, documented scoping decisions, such as dropping a metadata pre-filter and accepting a token-per-day-bound runtime, demonstrate judgement under real resource constraints.</w:t>
       </w:r>
     </w:p>
     <w:p>
@@ -2703,7 +3556,34 @@
         <w:jc w:val="both"/>
       </w:pPr>
       <w:r>
-        <w:t>Comprehensive technique understanding: dense retrieval, sparse retrieval, hierarchical summarisation, reranking, and LLM-based evaluation are all designed and built within a single project.</w:t>
+        <w:rPr>
+          <w:b/>
+          <w:bCs/>
+          <w:sz w:val="24"/>
+          <w:szCs w:val="24"/>
+        </w:rPr>
+        <w:t>Self-direction:</w:t>
+      </w:r>
+      <w:r>
+        <w:rPr>
+          <w:sz w:val="24"/>
+          <w:szCs w:val="24"/>
+        </w:rPr>
+        <w:t xml:space="preserve"> a one person, ten </w:t>
+      </w:r>
+      <w:r>
+        <w:rPr>
+          <w:sz w:val="24"/>
+          <w:szCs w:val="24"/>
+        </w:rPr>
+        <w:t>weeks</w:t>
+      </w:r>
+      <w:r>
+        <w:rPr>
+          <w:sz w:val="24"/>
+          <w:szCs w:val="24"/>
+        </w:rPr>
+        <w:t xml:space="preserve"> build plan run entirely on free-tier infrastructure with no managed budget demonstrates autonomous planning.</w:t>
       </w:r>
     </w:p>
     <w:p>
@@ -2717,49 +3597,20 @@
         <w:jc w:val="both"/>
       </w:pPr>
       <w:r>
-        <w:t>Originality: the cross-family generator/critic adversarial verification pipeline and the disjoint three-set (PQ/GQ/JEQ) evaluation design are original contributions to constructing a RAG benchmark without manual annotation at scale.</w:t>
-      </w:r>
-    </w:p>
-    <w:p>
-      <w:pPr>
-        <w:pStyle w:val="ListParagraph"/>
-        <w:numPr>
-          <w:ilvl w:val="0"/>
-          <w:numId w:val="2"/>
-        </w:numPr>
-        <w:spacing w:after="110" w:line="360" w:lineRule="auto"/>
-        <w:jc w:val="both"/>
-      </w:pPr>
-      <w:r>
-        <w:t>Sound judgement under incomplete information: deliberate, documented scoping decisions, such as dropping a metadata pre-filter and accepting a token-per-day-bound runtime, demonstrate judgement under real resource constraints.</w:t>
-      </w:r>
-    </w:p>
-    <w:p>
-      <w:pPr>
-        <w:pStyle w:val="ListParagraph"/>
-        <w:numPr>
-          <w:ilvl w:val="0"/>
-          <w:numId w:val="2"/>
-        </w:numPr>
-        <w:spacing w:after="110" w:line="360" w:lineRule="auto"/>
-        <w:jc w:val="both"/>
-      </w:pPr>
-      <w:r>
-        <w:t>Self-direction: a one person, ten week build plan run entirely on free-tier infrastructure with no managed budget demonstrates autonomous planning.</w:t>
-      </w:r>
-    </w:p>
-    <w:p>
-      <w:pPr>
-        <w:pStyle w:val="ListParagraph"/>
-        <w:numPr>
-          <w:ilvl w:val="0"/>
-          <w:numId w:val="2"/>
-        </w:numPr>
-        <w:spacing w:after="110" w:line="360" w:lineRule="auto"/>
-        <w:jc w:val="both"/>
-      </w:pPr>
-      <w:r>
-        <w:t>Critical self-evaluation of the process: the Limitations framing already built into the methodology, a single temperature-zero run per benchmark cell and an approximately eighty per cent judge-validation pass on only sixty hand-scored samples, is treated explicitly as a pragmatic constraint rather than a strong statistical proof, and the dissertation write-up will revisit this self-assessment against the actual results obtained.</w:t>
+        <w:rPr>
+          <w:b/>
+          <w:bCs/>
+          <w:sz w:val="24"/>
+          <w:szCs w:val="24"/>
+        </w:rPr>
+        <w:t>Critical self-evaluation of the process:</w:t>
+      </w:r>
+      <w:r>
+        <w:rPr>
+          <w:sz w:val="24"/>
+          <w:szCs w:val="24"/>
+        </w:rPr>
+        <w:t xml:space="preserve"> the Limitations framing already built into the methodology, a single temperature-zero run per benchmark cell and an approximately eighty per cent judge-validation pass on only sixty hand-scored samples, is treated explicitly as a pragmatic constraint rather than a strong statistical proof.</w:t>
       </w:r>
     </w:p>
     <w:p>
@@ -2779,13 +3630,31 @@
       <w:pPr>
         <w:spacing w:after="180" w:line="360" w:lineRule="auto"/>
         <w:jc w:val="both"/>
-      </w:pPr>
-      <w:r>
-        <w:t xml:space="preserve">This is a research and benchmarking system rather than an end-user application, so its principal “interface” is the results comparison view produced at the end of the run and consulted directly in the dissertation </w:t>
-      </w:r>
-      <w:r>
-        <w:lastRenderedPageBreak/>
-        <w:t>analysis. Day to day, the researcher’s surface is a command line: a phase is started with a single script invocation (for example, running the benchmark executor for a given phase), progress and free-tier token usage are checked by glancing at the run log and the index-build cost file, and intermediate results are inspected directly with SQL queries against the results table while a long phase is still in progress. A wireframe sketch of the final comparison view, the artefact the researcher consults most, is shown below.</w:t>
+        <w:rPr>
+          <w:sz w:val="24"/>
+          <w:szCs w:val="24"/>
+        </w:rPr>
+      </w:pPr>
+      <w:r>
+        <w:rPr>
+          <w:sz w:val="24"/>
+          <w:szCs w:val="24"/>
+        </w:rPr>
+        <w:t>This is a research and benchmarking system rather than an end-user application, so its principal "interface" is the results comparison view produced at the end of the run. Day to day, the researcher's surface is a command line</w:t>
+      </w:r>
+      <w:r>
+        <w:rPr>
+          <w:sz w:val="24"/>
+          <w:szCs w:val="24"/>
+        </w:rPr>
+        <w:t xml:space="preserve">. </w:t>
+      </w:r>
+      <w:r>
+        <w:rPr>
+          <w:sz w:val="24"/>
+          <w:szCs w:val="24"/>
+        </w:rPr>
+        <w:t>A wireframe sketch of the final comparison view, the artefact consulted most, is shown below.</w:t>
       </w:r>
     </w:p>
     <w:tbl>
@@ -3641,9 +4510,17 @@
       <w:pPr>
         <w:spacing w:after="180" w:line="360" w:lineRule="auto"/>
         <w:jc w:val="both"/>
-      </w:pPr>
-      <w:r>
-        <w:t>The build is scoped to a one person, ten-week schedule, with active development substantially complete by Week 7 and the final three weeks overlapping the full benchmark run with results analysis and dissertation write-up.</w:t>
+        <w:rPr>
+          <w:sz w:val="24"/>
+          <w:szCs w:val="24"/>
+        </w:rPr>
+      </w:pPr>
+      <w:r>
+        <w:rPr>
+          <w:sz w:val="24"/>
+          <w:szCs w:val="24"/>
+        </w:rPr>
+        <w:t>The build is scoped to a one person, ten-week schedule, with active development substantially complete by Week 7 and the final three weeks overlapping the full benchmark run with results analysis, dissertation write-up, and preparation of the final project presentation.</w:t>
       </w:r>
     </w:p>
     <w:tbl>
@@ -3709,6 +4586,7 @@
                 <w:sz w:val="20"/>
                 <w:szCs w:val="20"/>
               </w:rPr>
+              <w:lastRenderedPageBreak/>
               <w:t>Phase</w:t>
             </w:r>
           </w:p>
@@ -6290,7 +7168,6 @@
                 <w:sz w:val="19"/>
                 <w:szCs w:val="19"/>
               </w:rPr>
-              <w:lastRenderedPageBreak/>
               <w:t>LlamaParse fragments or bisects a financial table</w:t>
             </w:r>
           </w:p>
@@ -7102,7 +7979,13 @@
         <w:jc w:val="both"/>
       </w:pPr>
       <w:r>
-        <w:t>Chen, Z., Chen, W., Smiley, C., Shah, S., Borova, I., Langdon, D., Moussa, R., Beane, M., Huang, T.-H., Routledge, B. and Wang, W.Y. (2021) 'FinQA: A Dataset of Numerical Reasoning over Financial Data', Proceedings of the 2021 Conference on Empirical Methods in Natural Language Processing (EMNLP 2021), pp. 3697–3711.</w:t>
+        <w:t>Chen, Z., Chen, W., Smiley, C., Shah, S., Borova, I., Langdon, D., Moussa, R., Beane, M., Huang, T.-H.,</w:t>
+      </w:r>
+      <w:r>
+        <w:t xml:space="preserve"> </w:t>
+      </w:r>
+      <w:r>
+        <w:t>Routledge, B. and Wang, W.Y. (2021) 'FinQA: A Dataset of Numerical Reasoning over Financial Data', Proceedings of the 2021 Conference on Empirical Methods in Natural Language Processing (EMNLP 2021), pp. 3697–3711.</w:t>
       </w:r>
     </w:p>
     <w:p>
@@ -7450,6 +8333,155 @@
     </w:lvl>
   </w:abstractNum>
   <w:abstractNum w:abstractNumId="1" w15:restartNumberingAfterBreak="0">
+    <w:nsid w:val="394E26CD"/>
+    <w:multiLevelType w:val="multilevel"/>
+    <w:tmpl w:val="7CC63142"/>
+    <w:lvl w:ilvl="0">
+      <w:start w:val="1"/>
+      <w:numFmt w:val="bullet"/>
+      <w:lvlText w:val=""/>
+      <w:lvlJc w:val="left"/>
+      <w:pPr>
+        <w:tabs>
+          <w:tab w:val="num" w:pos="720"/>
+        </w:tabs>
+        <w:ind w:left="720" w:hanging="360"/>
+      </w:pPr>
+      <w:rPr>
+        <w:rFonts w:ascii="Symbol" w:hAnsi="Symbol" w:hint="default"/>
+        <w:sz w:val="20"/>
+      </w:rPr>
+    </w:lvl>
+    <w:lvl w:ilvl="1" w:tentative="1">
+      <w:start w:val="1"/>
+      <w:numFmt w:val="bullet"/>
+      <w:lvlText w:val="o"/>
+      <w:lvlJc w:val="left"/>
+      <w:pPr>
+        <w:tabs>
+          <w:tab w:val="num" w:pos="1440"/>
+        </w:tabs>
+        <w:ind w:left="1440" w:hanging="360"/>
+      </w:pPr>
+      <w:rPr>
+        <w:rFonts w:ascii="Courier New" w:hAnsi="Courier New" w:hint="default"/>
+        <w:sz w:val="20"/>
+      </w:rPr>
+    </w:lvl>
+    <w:lvl w:ilvl="2" w:tentative="1">
+      <w:start w:val="1"/>
+      <w:numFmt w:val="bullet"/>
+      <w:lvlText w:val=""/>
+      <w:lvlJc w:val="left"/>
+      <w:pPr>
+        <w:tabs>
+          <w:tab w:val="num" w:pos="2160"/>
+        </w:tabs>
+        <w:ind w:left="2160" w:hanging="360"/>
+      </w:pPr>
+      <w:rPr>
+        <w:rFonts w:ascii="Wingdings" w:hAnsi="Wingdings" w:hint="default"/>
+        <w:sz w:val="20"/>
+      </w:rPr>
+    </w:lvl>
+    <w:lvl w:ilvl="3" w:tentative="1">
+      <w:start w:val="1"/>
+      <w:numFmt w:val="bullet"/>
+      <w:lvlText w:val=""/>
+      <w:lvlJc w:val="left"/>
+      <w:pPr>
+        <w:tabs>
+          <w:tab w:val="num" w:pos="2880"/>
+        </w:tabs>
+        <w:ind w:left="2880" w:hanging="360"/>
+      </w:pPr>
+      <w:rPr>
+        <w:rFonts w:ascii="Wingdings" w:hAnsi="Wingdings" w:hint="default"/>
+        <w:sz w:val="20"/>
+      </w:rPr>
+    </w:lvl>
+    <w:lvl w:ilvl="4" w:tentative="1">
+      <w:start w:val="1"/>
+      <w:numFmt w:val="bullet"/>
+      <w:lvlText w:val=""/>
+      <w:lvlJc w:val="left"/>
+      <w:pPr>
+        <w:tabs>
+          <w:tab w:val="num" w:pos="3600"/>
+        </w:tabs>
+        <w:ind w:left="3600" w:hanging="360"/>
+      </w:pPr>
+      <w:rPr>
+        <w:rFonts w:ascii="Wingdings" w:hAnsi="Wingdings" w:hint="default"/>
+        <w:sz w:val="20"/>
+      </w:rPr>
+    </w:lvl>
+    <w:lvl w:ilvl="5" w:tentative="1">
+      <w:start w:val="1"/>
+      <w:numFmt w:val="bullet"/>
+      <w:lvlText w:val=""/>
+      <w:lvlJc w:val="left"/>
+      <w:pPr>
+        <w:tabs>
+          <w:tab w:val="num" w:pos="4320"/>
+        </w:tabs>
+        <w:ind w:left="4320" w:hanging="360"/>
+      </w:pPr>
+      <w:rPr>
+        <w:rFonts w:ascii="Wingdings" w:hAnsi="Wingdings" w:hint="default"/>
+        <w:sz w:val="20"/>
+      </w:rPr>
+    </w:lvl>
+    <w:lvl w:ilvl="6" w:tentative="1">
+      <w:start w:val="1"/>
+      <w:numFmt w:val="bullet"/>
+      <w:lvlText w:val=""/>
+      <w:lvlJc w:val="left"/>
+      <w:pPr>
+        <w:tabs>
+          <w:tab w:val="num" w:pos="5040"/>
+        </w:tabs>
+        <w:ind w:left="5040" w:hanging="360"/>
+      </w:pPr>
+      <w:rPr>
+        <w:rFonts w:ascii="Wingdings" w:hAnsi="Wingdings" w:hint="default"/>
+        <w:sz w:val="20"/>
+      </w:rPr>
+    </w:lvl>
+    <w:lvl w:ilvl="7" w:tentative="1">
+      <w:start w:val="1"/>
+      <w:numFmt w:val="bullet"/>
+      <w:lvlText w:val=""/>
+      <w:lvlJc w:val="left"/>
+      <w:pPr>
+        <w:tabs>
+          <w:tab w:val="num" w:pos="5760"/>
+        </w:tabs>
+        <w:ind w:left="5760" w:hanging="360"/>
+      </w:pPr>
+      <w:rPr>
+        <w:rFonts w:ascii="Wingdings" w:hAnsi="Wingdings" w:hint="default"/>
+        <w:sz w:val="20"/>
+      </w:rPr>
+    </w:lvl>
+    <w:lvl w:ilvl="8" w:tentative="1">
+      <w:start w:val="1"/>
+      <w:numFmt w:val="bullet"/>
+      <w:lvlText w:val=""/>
+      <w:lvlJc w:val="left"/>
+      <w:pPr>
+        <w:tabs>
+          <w:tab w:val="num" w:pos="6480"/>
+        </w:tabs>
+        <w:ind w:left="6480" w:hanging="360"/>
+      </w:pPr>
+      <w:rPr>
+        <w:rFonts w:ascii="Wingdings" w:hAnsi="Wingdings" w:hint="default"/>
+        <w:sz w:val="20"/>
+      </w:rPr>
+    </w:lvl>
+  </w:abstractNum>
+  <w:abstractNum w:abstractNumId="2" w15:restartNumberingAfterBreak="0">
     <w:nsid w:val="73BC40F7"/>
     <w:multiLevelType w:val="hybridMultilevel"/>
     <w:tmpl w:val="2C4EEFD4"/>
@@ -7536,7 +8568,7 @@
     </w:lvl>
   </w:abstractNum>
   <w:num w:numId="1" w16cid:durableId="874124432">
-    <w:abstractNumId w:val="1"/>
+    <w:abstractNumId w:val="2"/>
     <w:lvlOverride w:ilvl="0">
       <w:startOverride w:val="1"/>
     </w:lvlOverride>
@@ -7546,6 +8578,9 @@
     <w:lvlOverride w:ilvl="0">
       <w:startOverride w:val="1"/>
     </w:lvlOverride>
+  </w:num>
+  <w:num w:numId="3" w16cid:durableId="13697808">
+    <w:abstractNumId w:val="1"/>
   </w:num>
 </w:numbering>
 </file>
@@ -8183,6 +9218,17 @@
       <w:ind w:left="240"/>
     </w:pPr>
   </w:style>
+  <w:style w:type="character" w:styleId="Strong">
+    <w:name w:val="Strong"/>
+    <w:basedOn w:val="DefaultParagraphFont"/>
+    <w:uiPriority w:val="22"/>
+    <w:qFormat/>
+    <w:rsid w:val="001703B9"/>
+    <w:rPr>
+      <w:b/>
+      <w:bCs/>
+    </w:rPr>
+  </w:style>
 </w:styles>
 </file>
 

</xml_diff>

<commit_message>
added data sample and figures
</commit_message>
<xml_diff>
--- a/artifacts/Proposal_v1.0.0.docx
+++ b/artifacts/Proposal_v1.0.0.docx
@@ -43,43 +43,7 @@
           <w:sz w:val="26"/>
           <w:szCs w:val="26"/>
         </w:rPr>
-        <w:t>Design and Specification Proposal, COMP702 M.Sc. Project (202</w:t>
-      </w:r>
-      <w:r>
-        <w:rPr>
-          <w:rFonts w:ascii="Calibri" w:eastAsia="Calibri" w:hAnsi="Calibri" w:cs="Calibri"/>
-          <w:color w:val="15406B"/>
-          <w:sz w:val="26"/>
-          <w:szCs w:val="26"/>
-        </w:rPr>
-        <w:t>6</w:t>
-      </w:r>
-      <w:r>
-        <w:rPr>
-          <w:rFonts w:ascii="Calibri" w:eastAsia="Calibri" w:hAnsi="Calibri" w:cs="Calibri"/>
-          <w:color w:val="15406B"/>
-          <w:sz w:val="26"/>
-          <w:szCs w:val="26"/>
-        </w:rPr>
-        <w:t>/2</w:t>
-      </w:r>
-      <w:r>
-        <w:rPr>
-          <w:rFonts w:ascii="Calibri" w:eastAsia="Calibri" w:hAnsi="Calibri" w:cs="Calibri"/>
-          <w:color w:val="15406B"/>
-          <w:sz w:val="26"/>
-          <w:szCs w:val="26"/>
-        </w:rPr>
-        <w:t>7</w:t>
-      </w:r>
-      <w:r>
-        <w:rPr>
-          <w:rFonts w:ascii="Calibri" w:eastAsia="Calibri" w:hAnsi="Calibri" w:cs="Calibri"/>
-          <w:color w:val="15406B"/>
-          <w:sz w:val="26"/>
-          <w:szCs w:val="26"/>
-        </w:rPr>
-        <w:t>)</w:t>
+        <w:t>Design and Specification Proposal, COMP702 M.Sc. Project (2026/27)</w:t>
       </w:r>
     </w:p>
     <w:p>
@@ -233,7 +197,7 @@
         </w:pBdr>
         <w:spacing w:before="0"/>
       </w:pPr>
-      <w:bookmarkStart w:id="0" w:name="_Toc233304217"/>
+      <w:bookmarkStart w:id="0" w:name="_Toc233363956"/>
       <w:r>
         <w:lastRenderedPageBreak/>
         <w:t>Statement of Ethical Compliance: A0</w:t>
@@ -322,7 +286,7 @@
         </w:pBdr>
         <w:spacing w:before="0"/>
       </w:pPr>
-      <w:bookmarkStart w:id="1" w:name="_Toc233304218"/>
+      <w:bookmarkStart w:id="1" w:name="_Toc233363957"/>
       <w:r>
         <w:lastRenderedPageBreak/>
         <w:t>Table of Contents</w:t>
@@ -331,6 +295,10 @@
     </w:p>
     <w:sdt>
       <w:sdtPr>
+        <w:rPr>
+          <w:sz w:val="24"/>
+          <w:szCs w:val="24"/>
+        </w:rPr>
         <w:alias w:val="Table of Contents"/>
         <w:id w:val="1906575757"/>
       </w:sdtPr>
@@ -346,8 +314,8 @@
               <w:noProof/>
               <w:color w:val="auto"/>
               <w:kern w:val="2"/>
-              <w:sz w:val="28"/>
-              <w:szCs w:val="28"/>
+              <w:sz w:val="24"/>
+              <w:szCs w:val="24"/>
               <w:lang w:val="en-IN"/>
               <w14:ligatures w14:val="standardContextual"/>
             </w:rPr>
@@ -373,7 +341,7 @@
             </w:rPr>
             <w:fldChar w:fldCharType="separate"/>
           </w:r>
-          <w:hyperlink w:anchor="_Toc233304217" w:history="1">
+          <w:hyperlink w:anchor="_Toc233363956" w:history="1">
             <w:r>
               <w:rPr>
                 <w:rStyle w:val="Hyperlink"/>
@@ -405,7 +373,7 @@
                 <w:sz w:val="24"/>
                 <w:szCs w:val="24"/>
               </w:rPr>
-              <w:instrText xml:space="preserve"> PAGEREF _Toc233304217 \h </w:instrText>
+              <w:instrText xml:space="preserve"> PAGEREF _Toc233363956 \h </w:instrText>
             </w:r>
             <w:r>
               <w:rPr>
@@ -451,13 +419,13 @@
               <w:noProof/>
               <w:color w:val="auto"/>
               <w:kern w:val="2"/>
-              <w:sz w:val="28"/>
-              <w:szCs w:val="28"/>
+              <w:sz w:val="24"/>
+              <w:szCs w:val="24"/>
               <w:lang w:val="en-IN"/>
               <w14:ligatures w14:val="standardContextual"/>
             </w:rPr>
           </w:pPr>
-          <w:hyperlink w:anchor="_Toc233304218" w:history="1">
+          <w:hyperlink w:anchor="_Toc233363957" w:history="1">
             <w:r>
               <w:rPr>
                 <w:rStyle w:val="Hyperlink"/>
@@ -489,7 +457,7 @@
                 <w:sz w:val="24"/>
                 <w:szCs w:val="24"/>
               </w:rPr>
-              <w:instrText xml:space="preserve"> PAGEREF _Toc233304218 \h </w:instrText>
+              <w:instrText xml:space="preserve"> PAGEREF _Toc233363957 \h </w:instrText>
             </w:r>
             <w:r>
               <w:rPr>
@@ -535,13 +503,13 @@
               <w:noProof/>
               <w:color w:val="auto"/>
               <w:kern w:val="2"/>
-              <w:sz w:val="28"/>
-              <w:szCs w:val="28"/>
+              <w:sz w:val="24"/>
+              <w:szCs w:val="24"/>
               <w:lang w:val="en-IN"/>
               <w14:ligatures w14:val="standardContextual"/>
             </w:rPr>
           </w:pPr>
-          <w:hyperlink w:anchor="_Toc233304219" w:history="1">
+          <w:hyperlink w:anchor="_Toc233363958" w:history="1">
             <w:r>
               <w:rPr>
                 <w:rStyle w:val="Hyperlink"/>
@@ -573,7 +541,7 @@
                 <w:sz w:val="24"/>
                 <w:szCs w:val="24"/>
               </w:rPr>
-              <w:instrText xml:space="preserve"> PAGEREF _Toc233304219 \h </w:instrText>
+              <w:instrText xml:space="preserve"> PAGEREF _Toc233363958 \h </w:instrText>
             </w:r>
             <w:r>
               <w:rPr>
@@ -619,13 +587,13 @@
               <w:noProof/>
               <w:color w:val="auto"/>
               <w:kern w:val="2"/>
-              <w:sz w:val="28"/>
-              <w:szCs w:val="28"/>
+              <w:sz w:val="24"/>
+              <w:szCs w:val="24"/>
               <w:lang w:val="en-IN"/>
               <w14:ligatures w14:val="standardContextual"/>
             </w:rPr>
           </w:pPr>
-          <w:hyperlink w:anchor="_Toc233304220" w:history="1">
+          <w:hyperlink w:anchor="_Toc233363959" w:history="1">
             <w:r>
               <w:rPr>
                 <w:rStyle w:val="Hyperlink"/>
@@ -657,7 +625,7 @@
                 <w:sz w:val="24"/>
                 <w:szCs w:val="24"/>
               </w:rPr>
-              <w:instrText xml:space="preserve"> PAGEREF _Toc233304220 \h </w:instrText>
+              <w:instrText xml:space="preserve"> PAGEREF _Toc233363959 \h </w:instrText>
             </w:r>
             <w:r>
               <w:rPr>
@@ -703,13 +671,13 @@
               <w:noProof/>
               <w:color w:val="auto"/>
               <w:kern w:val="2"/>
-              <w:sz w:val="28"/>
-              <w:szCs w:val="28"/>
+              <w:sz w:val="24"/>
+              <w:szCs w:val="24"/>
               <w:lang w:val="en-IN"/>
               <w14:ligatures w14:val="standardContextual"/>
             </w:rPr>
           </w:pPr>
-          <w:hyperlink w:anchor="_Toc233304221" w:history="1">
+          <w:hyperlink w:anchor="_Toc233363960" w:history="1">
             <w:r>
               <w:rPr>
                 <w:rStyle w:val="Hyperlink"/>
@@ -741,7 +709,7 @@
                 <w:sz w:val="24"/>
                 <w:szCs w:val="24"/>
               </w:rPr>
-              <w:instrText xml:space="preserve"> PAGEREF _Toc233304221 \h </w:instrText>
+              <w:instrText xml:space="preserve"> PAGEREF _Toc233363960 \h </w:instrText>
             </w:r>
             <w:r>
               <w:rPr>
@@ -787,13 +755,13 @@
               <w:noProof/>
               <w:color w:val="auto"/>
               <w:kern w:val="2"/>
-              <w:sz w:val="28"/>
-              <w:szCs w:val="28"/>
+              <w:sz w:val="24"/>
+              <w:szCs w:val="24"/>
               <w:lang w:val="en-IN"/>
               <w14:ligatures w14:val="standardContextual"/>
             </w:rPr>
           </w:pPr>
-          <w:hyperlink w:anchor="_Toc233304222" w:history="1">
+          <w:hyperlink w:anchor="_Toc233363961" w:history="1">
             <w:r>
               <w:rPr>
                 <w:rStyle w:val="Hyperlink"/>
@@ -825,7 +793,7 @@
                 <w:sz w:val="24"/>
                 <w:szCs w:val="24"/>
               </w:rPr>
-              <w:instrText xml:space="preserve"> PAGEREF _Toc233304222 \h </w:instrText>
+              <w:instrText xml:space="preserve"> PAGEREF _Toc233363961 \h </w:instrText>
             </w:r>
             <w:r>
               <w:rPr>
@@ -871,13 +839,13 @@
               <w:noProof/>
               <w:color w:val="auto"/>
               <w:kern w:val="2"/>
-              <w:sz w:val="28"/>
-              <w:szCs w:val="28"/>
+              <w:sz w:val="24"/>
+              <w:szCs w:val="24"/>
               <w:lang w:val="en-IN"/>
               <w14:ligatures w14:val="standardContextual"/>
             </w:rPr>
           </w:pPr>
-          <w:hyperlink w:anchor="_Toc233304223" w:history="1">
+          <w:hyperlink w:anchor="_Toc233363962" w:history="1">
             <w:r>
               <w:rPr>
                 <w:rStyle w:val="Hyperlink"/>
@@ -909,7 +877,7 @@
                 <w:sz w:val="24"/>
                 <w:szCs w:val="24"/>
               </w:rPr>
-              <w:instrText xml:space="preserve"> PAGEREF _Toc233304223 \h </w:instrText>
+              <w:instrText xml:space="preserve"> PAGEREF _Toc233363962 \h </w:instrText>
             </w:r>
             <w:r>
               <w:rPr>
@@ -955,13 +923,13 @@
               <w:noProof/>
               <w:color w:val="auto"/>
               <w:kern w:val="2"/>
-              <w:sz w:val="28"/>
-              <w:szCs w:val="28"/>
+              <w:sz w:val="24"/>
+              <w:szCs w:val="24"/>
               <w:lang w:val="en-IN"/>
               <w14:ligatures w14:val="standardContextual"/>
             </w:rPr>
           </w:pPr>
-          <w:hyperlink w:anchor="_Toc233304224" w:history="1">
+          <w:hyperlink w:anchor="_Toc233363963" w:history="1">
             <w:r>
               <w:rPr>
                 <w:rStyle w:val="Hyperlink"/>
@@ -993,7 +961,7 @@
                 <w:sz w:val="24"/>
                 <w:szCs w:val="24"/>
               </w:rPr>
-              <w:instrText xml:space="preserve"> PAGEREF _Toc233304224 \h </w:instrText>
+              <w:instrText xml:space="preserve"> PAGEREF _Toc233363963 \h </w:instrText>
             </w:r>
             <w:r>
               <w:rPr>
@@ -1039,13 +1007,13 @@
               <w:noProof/>
               <w:color w:val="auto"/>
               <w:kern w:val="2"/>
-              <w:sz w:val="28"/>
-              <w:szCs w:val="28"/>
+              <w:sz w:val="24"/>
+              <w:szCs w:val="24"/>
               <w:lang w:val="en-IN"/>
               <w14:ligatures w14:val="standardContextual"/>
             </w:rPr>
           </w:pPr>
-          <w:hyperlink w:anchor="_Toc233304225" w:history="1">
+          <w:hyperlink w:anchor="_Toc233363964" w:history="1">
             <w:r>
               <w:rPr>
                 <w:rStyle w:val="Hyperlink"/>
@@ -1077,7 +1045,7 @@
                 <w:sz w:val="24"/>
                 <w:szCs w:val="24"/>
               </w:rPr>
-              <w:instrText xml:space="preserve"> PAGEREF _Toc233304225 \h </w:instrText>
+              <w:instrText xml:space="preserve"> PAGEREF _Toc233363964 \h </w:instrText>
             </w:r>
             <w:r>
               <w:rPr>
@@ -1123,13 +1091,13 @@
               <w:noProof/>
               <w:color w:val="auto"/>
               <w:kern w:val="2"/>
-              <w:sz w:val="28"/>
-              <w:szCs w:val="28"/>
+              <w:sz w:val="24"/>
+              <w:szCs w:val="24"/>
               <w:lang w:val="en-IN"/>
               <w14:ligatures w14:val="standardContextual"/>
             </w:rPr>
           </w:pPr>
-          <w:hyperlink w:anchor="_Toc233304226" w:history="1">
+          <w:hyperlink w:anchor="_Toc233363965" w:history="1">
             <w:r>
               <w:rPr>
                 <w:rStyle w:val="Hyperlink"/>
@@ -1161,7 +1129,7 @@
                 <w:sz w:val="24"/>
                 <w:szCs w:val="24"/>
               </w:rPr>
-              <w:instrText xml:space="preserve"> PAGEREF _Toc233304226 \h </w:instrText>
+              <w:instrText xml:space="preserve"> PAGEREF _Toc233363965 \h </w:instrText>
             </w:r>
             <w:r>
               <w:rPr>
@@ -1185,6 +1153,174 @@
                 <w:szCs w:val="24"/>
               </w:rPr>
               <w:t>7</w:t>
+            </w:r>
+            <w:r>
+              <w:rPr>
+                <w:noProof/>
+                <w:sz w:val="24"/>
+                <w:szCs w:val="24"/>
+              </w:rPr>
+              <w:fldChar w:fldCharType="end"/>
+            </w:r>
+          </w:hyperlink>
+        </w:p>
+        <w:p>
+          <w:pPr>
+            <w:pStyle w:val="TOC2"/>
+            <w:tabs>
+              <w:tab w:val="right" w:leader="dot" w:pos="9062"/>
+            </w:tabs>
+            <w:rPr>
+              <w:rFonts w:asciiTheme="minorHAnsi" w:eastAsiaTheme="minorEastAsia" w:hAnsiTheme="minorHAnsi" w:cstheme="minorBidi"/>
+              <w:noProof/>
+              <w:color w:val="auto"/>
+              <w:kern w:val="2"/>
+              <w:sz w:val="24"/>
+              <w:szCs w:val="24"/>
+              <w:lang w:val="en-IN"/>
+              <w14:ligatures w14:val="standardContextual"/>
+            </w:rPr>
+          </w:pPr>
+          <w:hyperlink w:anchor="_Toc233363966" w:history="1">
+            <w:r>
+              <w:rPr>
+                <w:rStyle w:val="Hyperlink"/>
+                <w:noProof/>
+                <w:sz w:val="24"/>
+                <w:szCs w:val="24"/>
+              </w:rPr>
+              <w:t>5.1 Nature of the SEC 10-K Filing Data</w:t>
+            </w:r>
+            <w:r>
+              <w:rPr>
+                <w:noProof/>
+                <w:sz w:val="24"/>
+                <w:szCs w:val="24"/>
+              </w:rPr>
+              <w:tab/>
+            </w:r>
+            <w:r>
+              <w:rPr>
+                <w:noProof/>
+                <w:sz w:val="24"/>
+                <w:szCs w:val="24"/>
+              </w:rPr>
+              <w:fldChar w:fldCharType="begin"/>
+            </w:r>
+            <w:r>
+              <w:rPr>
+                <w:noProof/>
+                <w:sz w:val="24"/>
+                <w:szCs w:val="24"/>
+              </w:rPr>
+              <w:instrText xml:space="preserve"> PAGEREF _Toc233363966 \h </w:instrText>
+            </w:r>
+            <w:r>
+              <w:rPr>
+                <w:noProof/>
+                <w:sz w:val="24"/>
+                <w:szCs w:val="24"/>
+              </w:rPr>
+            </w:r>
+            <w:r>
+              <w:rPr>
+                <w:noProof/>
+                <w:sz w:val="24"/>
+                <w:szCs w:val="24"/>
+              </w:rPr>
+              <w:fldChar w:fldCharType="separate"/>
+            </w:r>
+            <w:r>
+              <w:rPr>
+                <w:noProof/>
+                <w:sz w:val="24"/>
+                <w:szCs w:val="24"/>
+              </w:rPr>
+              <w:t>7</w:t>
+            </w:r>
+            <w:r>
+              <w:rPr>
+                <w:noProof/>
+                <w:sz w:val="24"/>
+                <w:szCs w:val="24"/>
+              </w:rPr>
+              <w:fldChar w:fldCharType="end"/>
+            </w:r>
+          </w:hyperlink>
+        </w:p>
+        <w:p>
+          <w:pPr>
+            <w:pStyle w:val="TOC2"/>
+            <w:tabs>
+              <w:tab w:val="right" w:leader="dot" w:pos="9062"/>
+            </w:tabs>
+            <w:rPr>
+              <w:rFonts w:asciiTheme="minorHAnsi" w:eastAsiaTheme="minorEastAsia" w:hAnsiTheme="minorHAnsi" w:cstheme="minorBidi"/>
+              <w:noProof/>
+              <w:color w:val="auto"/>
+              <w:kern w:val="2"/>
+              <w:sz w:val="24"/>
+              <w:szCs w:val="24"/>
+              <w:lang w:val="en-IN"/>
+              <w14:ligatures w14:val="standardContextual"/>
+            </w:rPr>
+          </w:pPr>
+          <w:hyperlink w:anchor="_Toc233363967" w:history="1">
+            <w:r>
+              <w:rPr>
+                <w:rStyle w:val="Hyperlink"/>
+                <w:noProof/>
+                <w:sz w:val="24"/>
+                <w:szCs w:val="24"/>
+              </w:rPr>
+              <w:t>5.2 Raw Data Sample of the SEC 10-K Filing Data</w:t>
+            </w:r>
+            <w:r>
+              <w:rPr>
+                <w:noProof/>
+                <w:sz w:val="24"/>
+                <w:szCs w:val="24"/>
+              </w:rPr>
+              <w:tab/>
+            </w:r>
+            <w:r>
+              <w:rPr>
+                <w:noProof/>
+                <w:sz w:val="24"/>
+                <w:szCs w:val="24"/>
+              </w:rPr>
+              <w:fldChar w:fldCharType="begin"/>
+            </w:r>
+            <w:r>
+              <w:rPr>
+                <w:noProof/>
+                <w:sz w:val="24"/>
+                <w:szCs w:val="24"/>
+              </w:rPr>
+              <w:instrText xml:space="preserve"> PAGEREF _Toc233363967 \h </w:instrText>
+            </w:r>
+            <w:r>
+              <w:rPr>
+                <w:noProof/>
+                <w:sz w:val="24"/>
+                <w:szCs w:val="24"/>
+              </w:rPr>
+            </w:r>
+            <w:r>
+              <w:rPr>
+                <w:noProof/>
+                <w:sz w:val="24"/>
+                <w:szCs w:val="24"/>
+              </w:rPr>
+              <w:fldChar w:fldCharType="separate"/>
+            </w:r>
+            <w:r>
+              <w:rPr>
+                <w:noProof/>
+                <w:sz w:val="24"/>
+                <w:szCs w:val="24"/>
+              </w:rPr>
+              <w:t>8</w:t>
             </w:r>
             <w:r>
               <w:rPr>
@@ -1207,13 +1343,13 @@
               <w:noProof/>
               <w:color w:val="auto"/>
               <w:kern w:val="2"/>
-              <w:sz w:val="28"/>
-              <w:szCs w:val="28"/>
+              <w:sz w:val="24"/>
+              <w:szCs w:val="24"/>
               <w:lang w:val="en-IN"/>
               <w14:ligatures w14:val="standardContextual"/>
             </w:rPr>
           </w:pPr>
-          <w:hyperlink w:anchor="_Toc233304227" w:history="1">
+          <w:hyperlink w:anchor="_Toc233363968" w:history="1">
             <w:r>
               <w:rPr>
                 <w:rStyle w:val="Hyperlink"/>
@@ -1245,7 +1381,7 @@
                 <w:sz w:val="24"/>
                 <w:szCs w:val="24"/>
               </w:rPr>
-              <w:instrText xml:space="preserve"> PAGEREF _Toc233304227 \h </w:instrText>
+              <w:instrText xml:space="preserve"> PAGEREF _Toc233363968 \h </w:instrText>
             </w:r>
             <w:r>
               <w:rPr>
@@ -1268,7 +1404,7 @@
                 <w:sz w:val="24"/>
                 <w:szCs w:val="24"/>
               </w:rPr>
-              <w:t>7</w:t>
+              <w:t>10</w:t>
             </w:r>
             <w:r>
               <w:rPr>
@@ -1291,13 +1427,13 @@
               <w:noProof/>
               <w:color w:val="auto"/>
               <w:kern w:val="2"/>
-              <w:sz w:val="28"/>
-              <w:szCs w:val="28"/>
+              <w:sz w:val="24"/>
+              <w:szCs w:val="24"/>
               <w:lang w:val="en-IN"/>
               <w14:ligatures w14:val="standardContextual"/>
             </w:rPr>
           </w:pPr>
-          <w:hyperlink w:anchor="_Toc233304228" w:history="1">
+          <w:hyperlink w:anchor="_Toc233363969" w:history="1">
             <w:r>
               <w:rPr>
                 <w:rStyle w:val="Hyperlink"/>
@@ -1329,7 +1465,7 @@
                 <w:sz w:val="24"/>
                 <w:szCs w:val="24"/>
               </w:rPr>
-              <w:instrText xml:space="preserve"> PAGEREF _Toc233304228 \h </w:instrText>
+              <w:instrText xml:space="preserve"> PAGEREF _Toc233363969 \h </w:instrText>
             </w:r>
             <w:r>
               <w:rPr>
@@ -1352,7 +1488,7 @@
                 <w:sz w:val="24"/>
                 <w:szCs w:val="24"/>
               </w:rPr>
-              <w:t>8</w:t>
+              <w:t>10</w:t>
             </w:r>
             <w:r>
               <w:rPr>
@@ -1375,13 +1511,13 @@
               <w:noProof/>
               <w:color w:val="auto"/>
               <w:kern w:val="2"/>
-              <w:sz w:val="28"/>
-              <w:szCs w:val="28"/>
+              <w:sz w:val="24"/>
+              <w:szCs w:val="24"/>
               <w:lang w:val="en-IN"/>
               <w14:ligatures w14:val="standardContextual"/>
             </w:rPr>
           </w:pPr>
-          <w:hyperlink w:anchor="_Toc233304229" w:history="1">
+          <w:hyperlink w:anchor="_Toc233363970" w:history="1">
             <w:r>
               <w:rPr>
                 <w:rStyle w:val="Hyperlink"/>
@@ -1413,7 +1549,7 @@
                 <w:sz w:val="24"/>
                 <w:szCs w:val="24"/>
               </w:rPr>
-              <w:instrText xml:space="preserve"> PAGEREF _Toc233304229 \h </w:instrText>
+              <w:instrText xml:space="preserve"> PAGEREF _Toc233363970 \h </w:instrText>
             </w:r>
             <w:r>
               <w:rPr>
@@ -1436,7 +1572,7 @@
                 <w:sz w:val="24"/>
                 <w:szCs w:val="24"/>
               </w:rPr>
-              <w:t>8</w:t>
+              <w:t>11</w:t>
             </w:r>
             <w:r>
               <w:rPr>
@@ -1459,13 +1595,13 @@
               <w:noProof/>
               <w:color w:val="auto"/>
               <w:kern w:val="2"/>
-              <w:sz w:val="28"/>
-              <w:szCs w:val="28"/>
+              <w:sz w:val="24"/>
+              <w:szCs w:val="24"/>
               <w:lang w:val="en-IN"/>
               <w14:ligatures w14:val="standardContextual"/>
             </w:rPr>
           </w:pPr>
-          <w:hyperlink w:anchor="_Toc233304230" w:history="1">
+          <w:hyperlink w:anchor="_Toc233363971" w:history="1">
             <w:r>
               <w:rPr>
                 <w:rStyle w:val="Hyperlink"/>
@@ -1497,7 +1633,7 @@
                 <w:sz w:val="24"/>
                 <w:szCs w:val="24"/>
               </w:rPr>
-              <w:instrText xml:space="preserve"> PAGEREF _Toc233304230 \h </w:instrText>
+              <w:instrText xml:space="preserve"> PAGEREF _Toc233363971 \h </w:instrText>
             </w:r>
             <w:r>
               <w:rPr>
@@ -1520,7 +1656,7 @@
                 <w:sz w:val="24"/>
                 <w:szCs w:val="24"/>
               </w:rPr>
-              <w:t>8</w:t>
+              <w:t>11</w:t>
             </w:r>
             <w:r>
               <w:rPr>
@@ -1543,13 +1679,13 @@
               <w:noProof/>
               <w:color w:val="auto"/>
               <w:kern w:val="2"/>
-              <w:sz w:val="28"/>
-              <w:szCs w:val="28"/>
+              <w:sz w:val="24"/>
+              <w:szCs w:val="24"/>
               <w:lang w:val="en-IN"/>
               <w14:ligatures w14:val="standardContextual"/>
             </w:rPr>
           </w:pPr>
-          <w:hyperlink w:anchor="_Toc233304231" w:history="1">
+          <w:hyperlink w:anchor="_Toc233363972" w:history="1">
             <w:r>
               <w:rPr>
                 <w:rStyle w:val="Hyperlink"/>
@@ -1581,7 +1717,7 @@
                 <w:sz w:val="24"/>
                 <w:szCs w:val="24"/>
               </w:rPr>
-              <w:instrText xml:space="preserve"> PAGEREF _Toc233304231 \h </w:instrText>
+              <w:instrText xml:space="preserve"> PAGEREF _Toc233363972 \h </w:instrText>
             </w:r>
             <w:r>
               <w:rPr>
@@ -1604,7 +1740,7 @@
                 <w:sz w:val="24"/>
                 <w:szCs w:val="24"/>
               </w:rPr>
-              <w:t>9</w:t>
+              <w:t>12</w:t>
             </w:r>
             <w:r>
               <w:rPr>
@@ -1627,13 +1763,13 @@
               <w:noProof/>
               <w:color w:val="auto"/>
               <w:kern w:val="2"/>
-              <w:sz w:val="28"/>
-              <w:szCs w:val="28"/>
+              <w:sz w:val="24"/>
+              <w:szCs w:val="24"/>
               <w:lang w:val="en-IN"/>
               <w14:ligatures w14:val="standardContextual"/>
             </w:rPr>
           </w:pPr>
-          <w:hyperlink w:anchor="_Toc233304232" w:history="1">
+          <w:hyperlink w:anchor="_Toc233363973" w:history="1">
             <w:r>
               <w:rPr>
                 <w:rStyle w:val="Hyperlink"/>
@@ -1665,7 +1801,7 @@
                 <w:sz w:val="24"/>
                 <w:szCs w:val="24"/>
               </w:rPr>
-              <w:instrText xml:space="preserve"> PAGEREF _Toc233304232 \h </w:instrText>
+              <w:instrText xml:space="preserve"> PAGEREF _Toc233363973 \h </w:instrText>
             </w:r>
             <w:r>
               <w:rPr>
@@ -1688,7 +1824,7 @@
                 <w:sz w:val="24"/>
                 <w:szCs w:val="24"/>
               </w:rPr>
-              <w:t>9</w:t>
+              <w:t>12</w:t>
             </w:r>
             <w:r>
               <w:rPr>
@@ -1711,13 +1847,13 @@
               <w:noProof/>
               <w:color w:val="auto"/>
               <w:kern w:val="2"/>
-              <w:sz w:val="28"/>
-              <w:szCs w:val="28"/>
+              <w:sz w:val="24"/>
+              <w:szCs w:val="24"/>
               <w:lang w:val="en-IN"/>
               <w14:ligatures w14:val="standardContextual"/>
             </w:rPr>
           </w:pPr>
-          <w:hyperlink w:anchor="_Toc233304233" w:history="1">
+          <w:hyperlink w:anchor="_Toc233363974" w:history="1">
             <w:r>
               <w:rPr>
                 <w:rStyle w:val="Hyperlink"/>
@@ -1749,7 +1885,7 @@
                 <w:sz w:val="24"/>
                 <w:szCs w:val="24"/>
               </w:rPr>
-              <w:instrText xml:space="preserve"> PAGEREF _Toc233304233 \h </w:instrText>
+              <w:instrText xml:space="preserve"> PAGEREF _Toc233363974 \h </w:instrText>
             </w:r>
             <w:r>
               <w:rPr>
@@ -1772,7 +1908,7 @@
                 <w:sz w:val="24"/>
                 <w:szCs w:val="24"/>
               </w:rPr>
-              <w:t>11</w:t>
+              <w:t>14</w:t>
             </w:r>
             <w:r>
               <w:rPr>
@@ -1807,7 +1943,7 @@
           <w:bottom w:val="single" w:sz="8" w:space="6" w:color="15406B"/>
         </w:pBdr>
       </w:pPr>
-      <w:bookmarkStart w:id="2" w:name="_Toc233304219"/>
+      <w:bookmarkStart w:id="2" w:name="_Toc233363958"/>
       <w:r>
         <w:lastRenderedPageBreak/>
         <w:t>1. Project Description</w:t>
@@ -1860,21 +1996,7 @@
           <w:sz w:val="24"/>
           <w:szCs w:val="24"/>
         </w:rPr>
-        <w:t>, 2021). This project builds and benchmarks three complete RAG pipelines: a semantic retriever, which finds evidence by meaning using numeric representations of text (dense vector embeddings); a statistical retriever, which finds evidence by matching exact words and their frequency using the long-established BM25 algorithm; and a structural retriever, which navigates a tree of AI-generated summaries built once over each document. These three are tested against a 1</w:t>
-      </w:r>
-      <w:r>
-        <w:rPr>
-          <w:sz w:val="24"/>
-          <w:szCs w:val="24"/>
-        </w:rPr>
-        <w:t>4</w:t>
-      </w:r>
-      <w:r>
-        <w:rPr>
-          <w:sz w:val="24"/>
-          <w:szCs w:val="24"/>
-        </w:rPr>
-        <w:t>0-query, human-anchored benchmark spanning direct and inferential questions over both narrative text and financial tables, to establish where each paradigm succeeds and where it degrades.</w:t>
+        <w:t>, 2021). This project builds and benchmarks three complete RAG pipelines: a semantic retriever, which finds evidence by meaning using numeric representations of text (dense vector embeddings); a statistical retriever, which finds evidence by matching exact words and their frequency using the long-established BM25 algorithm; and a structural retriever, which navigates a tree of AI-generated summaries built once over each document. These three are tested against a 140-query, human-anchored benchmark spanning direct and inferential questions over both narrative text and financial tables, to establish where each paradigm succeeds and where it degrades.</w:t>
       </w:r>
     </w:p>
     <w:p>
@@ -1884,7 +2006,7 @@
           <w:bottom w:val="single" w:sz="8" w:space="6" w:color="15406B"/>
         </w:pBdr>
       </w:pPr>
-      <w:bookmarkStart w:id="3" w:name="_Toc233304220"/>
+      <w:bookmarkStart w:id="3" w:name="_Toc233363959"/>
       <w:r>
         <w:t>2. Aims and Requirements</w:t>
       </w:r>
@@ -1894,7 +2016,7 @@
       <w:pPr>
         <w:pStyle w:val="Heading2"/>
       </w:pPr>
-      <w:bookmarkStart w:id="4" w:name="_Toc233304221"/>
+      <w:bookmarkStart w:id="4" w:name="_Toc233363960"/>
       <w:r>
         <w:t>2.1 Aims</w:t>
       </w:r>
@@ -1970,7 +2092,7 @@
       <w:pPr>
         <w:pStyle w:val="Heading2"/>
       </w:pPr>
-      <w:bookmarkStart w:id="5" w:name="_Toc233304222"/>
+      <w:bookmarkStart w:id="5" w:name="_Toc233363961"/>
       <w:r>
         <w:t>2.2 Requirements: Essential</w:t>
       </w:r>
@@ -2017,21 +2139,7 @@
           <w:sz w:val="24"/>
           <w:szCs w:val="24"/>
         </w:rPr>
-        <w:t xml:space="preserve">Implement </w:t>
-      </w:r>
-      <w:r>
-        <w:rPr>
-          <w:sz w:val="24"/>
-          <w:szCs w:val="24"/>
-        </w:rPr>
-        <w:t xml:space="preserve">three distinct pipelines - </w:t>
-      </w:r>
-      <w:r>
-        <w:rPr>
-          <w:sz w:val="24"/>
-          <w:szCs w:val="24"/>
-        </w:rPr>
-        <w:t>P1 (dense embeddings with a cross-encoder reranker), P2 (Okapi BM25), and P3 (hierarchical summary-tree) retrievers sharing one answering model.</w:t>
+        <w:t>Implement three distinct pipelines - P1 (dense embeddings with a cross-encoder reranker), P2 (Okapi BM25), and P3 (hierarchical summary-tree) retrievers sharing one answering model.</w:t>
       </w:r>
     </w:p>
     <w:p>
@@ -2054,35 +2162,7 @@
           <w:szCs w:val="24"/>
         </w:rPr>
         <w:lastRenderedPageBreak/>
-        <w:t>Generate and adversarially verify a 140-query benchmark with node</w:t>
-      </w:r>
-      <w:r>
-        <w:rPr>
-          <w:sz w:val="24"/>
-          <w:szCs w:val="24"/>
-        </w:rPr>
-        <w:t xml:space="preserve"> </w:t>
-      </w:r>
-      <w:r>
-        <w:rPr>
-          <w:sz w:val="24"/>
-          <w:szCs w:val="24"/>
-        </w:rPr>
-        <w:t>level ground</w:t>
-      </w:r>
-      <w:r>
-        <w:rPr>
-          <w:sz w:val="24"/>
-          <w:szCs w:val="24"/>
-        </w:rPr>
-        <w:t xml:space="preserve"> </w:t>
-      </w:r>
-      <w:r>
-        <w:rPr>
-          <w:sz w:val="24"/>
-          <w:szCs w:val="24"/>
-        </w:rPr>
-        <w:t>truth citations.</w:t>
+        <w:t>Generate and adversarially verify a 140-query benchmark with node level ground truth citations.</w:t>
       </w:r>
     </w:p>
     <w:p>
@@ -2133,7 +2213,7 @@
       <w:pPr>
         <w:pStyle w:val="Heading2"/>
       </w:pPr>
-      <w:bookmarkStart w:id="6" w:name="_Toc233304223"/>
+      <w:bookmarkStart w:id="6" w:name="_Toc233363962"/>
       <w:r>
         <w:t>2.3 Requirements: Desirable</w:t>
       </w:r>
@@ -2190,7 +2270,7 @@
           <w:bottom w:val="single" w:sz="8" w:space="6" w:color="15406B"/>
         </w:pBdr>
       </w:pPr>
-      <w:bookmarkStart w:id="7" w:name="_Toc233304224"/>
+      <w:bookmarkStart w:id="7" w:name="_Toc233363963"/>
       <w:r>
         <w:t>3. Key Literature and Background Reading</w:t>
       </w:r>
@@ -2415,21 +2495,7 @@
           <w:sz w:val="24"/>
           <w:szCs w:val="24"/>
         </w:rPr>
-        <w:t xml:space="preserve">None of the studies above evaluate all three retrieval paradigms side by side on a single financial-filing benchmark stratified by both query type and content modality (text versus table); this is the specific gap the </w:t>
-      </w:r>
-      <w:r>
-        <w:rPr>
-          <w:sz w:val="24"/>
-          <w:szCs w:val="24"/>
-        </w:rPr>
-        <w:t>proposed</w:t>
-      </w:r>
-      <w:r>
-        <w:rPr>
-          <w:sz w:val="24"/>
-          <w:szCs w:val="24"/>
-        </w:rPr>
-        <w:t xml:space="preserve"> project addresses.</w:t>
+        <w:t>None of the studies above evaluate all three retrieval paradigms side by side on a single financial-filing benchmark stratified by both query type and content modality (text versus table); this is the specific gap the proposed project addresses.</w:t>
       </w:r>
     </w:p>
     <w:p>
@@ -2439,7 +2505,7 @@
           <w:bottom w:val="single" w:sz="8" w:space="6" w:color="15406B"/>
         </w:pBdr>
       </w:pPr>
-      <w:bookmarkStart w:id="8" w:name="_Toc233304225"/>
+      <w:bookmarkStart w:id="8" w:name="_Toc233363964"/>
       <w:r>
         <w:t>4. Development and Implementation Summary</w:t>
       </w:r>
@@ -3010,6 +3076,7 @@
     </w:tbl>
     <w:p>
       <w:pPr>
+        <w:widowControl w:val="0"/>
         <w:spacing w:before="90" w:after="240"/>
         <w:jc w:val="center"/>
         <w:rPr>
@@ -3074,6 +3141,7 @@
           </w:tcPr>
           <w:p>
             <w:pPr>
+              <w:widowControl w:val="0"/>
               <w:jc w:val="both"/>
             </w:pPr>
             <w:r>
@@ -3100,9 +3168,500 @@
     </w:tbl>
     <w:p>
       <w:pPr>
+        <w:pStyle w:val="Heading1"/>
+        <w:keepNext w:val="0"/>
+        <w:keepLines w:val="0"/>
+        <w:widowControl w:val="0"/>
+        <w:pBdr>
+          <w:bottom w:val="single" w:sz="8" w:space="6" w:color="15406B"/>
+        </w:pBdr>
+      </w:pPr>
+      <w:bookmarkStart w:id="9" w:name="_Toc233363965"/>
+      <w:r>
+        <w:t>5. Data Sources</w:t>
+      </w:r>
+      <w:bookmarkEnd w:id="9"/>
+    </w:p>
+    <w:p>
+      <w:pPr>
+        <w:spacing w:after="360" w:line="360" w:lineRule="auto"/>
+        <w:jc w:val="both"/>
+        <w:rPr>
+          <w:sz w:val="24"/>
+          <w:szCs w:val="24"/>
+        </w:rPr>
+      </w:pPr>
+      <w:r>
+        <w:rPr>
+          <w:sz w:val="24"/>
+          <w:szCs w:val="24"/>
+        </w:rPr>
+        <w:t>All data is sourced from SEC EDGAR, the US Securities and Exchange Commission's public filing system: a corpus of approximately six to nine 10-K annual filings, drawn from two to three companies across two to three fiscal years. Filings are parsed via LlamaParse (free tier) into metadata-enriched text and table nodes.</w:t>
+      </w:r>
+    </w:p>
+    <w:p>
+      <w:pPr>
+        <w:pStyle w:val="Heading2"/>
+      </w:pPr>
+      <w:bookmarkStart w:id="10" w:name="_Toc233363966"/>
+      <w:r>
+        <w:t>5.1 Nature of the SEC 10-K Filing Data</w:t>
+      </w:r>
+      <w:bookmarkEnd w:id="10"/>
+    </w:p>
+    <w:p>
+      <w:pPr>
+        <w:spacing w:after="360" w:line="360" w:lineRule="auto"/>
+        <w:jc w:val="both"/>
+        <w:rPr>
+          <w:sz w:val="24"/>
+          <w:szCs w:val="24"/>
+        </w:rPr>
+      </w:pPr>
+      <w:r>
+        <w:rPr>
+          <w:sz w:val="24"/>
+          <w:szCs w:val="24"/>
+        </w:rPr>
+        <w:t xml:space="preserve">Each filing contains narrative sections (risk factors, business description, management's discussion) and structured tables (financial statements, segment data, numerical metrics with currency values). The data is heterogeneous: prose sections use formal language with embedded financial figures, while tables present precisely formatted multi-year numerical comparisons. This heterogeneity is valuable for benchmarking. It tests whether retrieval pipelines can handle both semantic and structured data extraction. </w:t>
+      </w:r>
+      <w:r>
+        <w:rPr>
+          <w:sz w:val="24"/>
+          <w:szCs w:val="24"/>
+        </w:rPr>
+        <w:t xml:space="preserve">The </w:t>
+      </w:r>
+      <w:r>
+        <w:rPr>
+          <w:sz w:val="24"/>
+          <w:szCs w:val="24"/>
+        </w:rPr>
+        <w:t>raw structure of the data</w:t>
+      </w:r>
+      <w:r>
+        <w:rPr>
+          <w:sz w:val="24"/>
+          <w:szCs w:val="24"/>
+        </w:rPr>
+        <w:t xml:space="preserve"> </w:t>
+      </w:r>
+      <w:r>
+        <w:rPr>
+          <w:sz w:val="24"/>
+          <w:szCs w:val="24"/>
+        </w:rPr>
+        <w:t>is</w:t>
+      </w:r>
+      <w:r>
+        <w:rPr>
+          <w:sz w:val="24"/>
+          <w:szCs w:val="24"/>
+        </w:rPr>
+        <w:t xml:space="preserve"> covered in the next section (5.2).</w:t>
+      </w:r>
+    </w:p>
+    <w:p>
+      <w:pPr>
+        <w:pStyle w:val="Heading2"/>
+      </w:pPr>
+      <w:bookmarkStart w:id="11" w:name="_Toc233363967"/>
+      <w:r>
+        <w:lastRenderedPageBreak/>
+        <w:t>5.</w:t>
+      </w:r>
+      <w:r>
+        <w:t>2</w:t>
+      </w:r>
+      <w:r>
+        <w:t xml:space="preserve"> </w:t>
+      </w:r>
+      <w:r>
+        <w:t>Raw Data Sample of the SEC 10-K Filing Data</w:t>
+      </w:r>
+      <w:bookmarkEnd w:id="11"/>
+    </w:p>
+    <w:p>
+      <w:pPr>
+        <w:spacing w:after="360" w:line="360" w:lineRule="auto"/>
+        <w:jc w:val="both"/>
+        <w:rPr>
+          <w:sz w:val="24"/>
+          <w:szCs w:val="24"/>
+        </w:rPr>
+      </w:pPr>
+      <w:r>
+        <w:rPr>
+          <w:sz w:val="24"/>
+          <w:szCs w:val="24"/>
+        </w:rPr>
+        <w:t xml:space="preserve">Figure 5.1 shows a sample paragraph from Apple's SEC 10-K filing in raw </w:t>
+      </w:r>
+      <w:proofErr w:type="spellStart"/>
+      <w:r>
+        <w:rPr>
+          <w:sz w:val="24"/>
+          <w:szCs w:val="24"/>
+        </w:rPr>
+        <w:t>iXBRL</w:t>
+      </w:r>
+      <w:proofErr w:type="spellEnd"/>
+      <w:r>
+        <w:rPr>
+          <w:sz w:val="24"/>
+          <w:szCs w:val="24"/>
+        </w:rPr>
+        <w:t xml:space="preserve"> format, with a financial figure embedded in XML markup. Figure 5.2 displays the rendered table corresponding to the raw HTML/XML code in Figure 5.3. This table from Apple's 10-K, presents interest rate sensitivity analysis with comparative figures across fiscal years. Together, these samples illustrate the dual nature of SEC 10-K data: unstructured prose with embedded financial figures and structured tabular data with precise column and row definitions. Both formats are parsed as nodes during data preparation, preserving their original structure and metadata for retrieval and evaluation.</w:t>
+      </w:r>
+    </w:p>
+    <w:p>
+      <w:pPr>
+        <w:spacing w:after="360" w:line="360" w:lineRule="auto"/>
+        <w:jc w:val="center"/>
+        <w:rPr>
+          <w:rFonts w:ascii="Calibri" w:eastAsia="Calibri" w:hAnsi="Calibri" w:cs="Calibri"/>
+          <w:color w:val="44494F"/>
+          <w:sz w:val="20"/>
+          <w:szCs w:val="20"/>
+        </w:rPr>
+      </w:pPr>
+      <w:r>
+        <w:rPr>
+          <w:noProof/>
+        </w:rPr>
+        <w:drawing>
+          <wp:inline distT="0" distB="0" distL="0" distR="0" wp14:anchorId="4B77AA57" wp14:editId="78B6FAD9">
+            <wp:extent cx="5794426" cy="3099816"/>
+            <wp:effectExtent l="0" t="0" r="0" b="0"/>
+            <wp:docPr id="733437994" name="Picture 2"/>
+            <wp:cNvGraphicFramePr>
+              <a:graphicFrameLocks xmlns:a="http://schemas.openxmlformats.org/drawingml/2006/main" noChangeAspect="1"/>
+            </wp:cNvGraphicFramePr>
+            <a:graphic xmlns:a="http://schemas.openxmlformats.org/drawingml/2006/main">
+              <a:graphicData uri="http://schemas.openxmlformats.org/drawingml/2006/picture">
+                <pic:pic xmlns:pic="http://schemas.openxmlformats.org/drawingml/2006/picture">
+                  <pic:nvPicPr>
+                    <pic:cNvPr id="733437994" name="Picture 733437994"/>
+                    <pic:cNvPicPr/>
+                  </pic:nvPicPr>
+                  <pic:blipFill rotWithShape="1">
+                    <a:blip r:embed="rId9">
+                      <a:extLst>
+                        <a:ext uri="{28A0092B-C50C-407E-A947-70E740481C1C}">
+                          <a14:useLocalDpi xmlns:a14="http://schemas.microsoft.com/office/drawing/2010/main" val="0"/>
+                        </a:ext>
+                      </a:extLst>
+                    </a:blip>
+                    <a:srcRect l="4604" t="7990" r="4595" b="7703"/>
+                    <a:stretch>
+                      <a:fillRect/>
+                    </a:stretch>
+                  </pic:blipFill>
+                  <pic:spPr bwMode="auto">
+                    <a:xfrm>
+                      <a:off x="0" y="0"/>
+                      <a:ext cx="5947956" cy="3181949"/>
+                    </a:xfrm>
+                    <a:prstGeom prst="rect">
+                      <a:avLst/>
+                    </a:prstGeom>
+                    <a:ln>
+                      <a:noFill/>
+                    </a:ln>
+                    <a:extLst>
+                      <a:ext uri="{53640926-AAD7-44D8-BBD7-CCE9431645EC}">
+                        <a14:shadowObscured xmlns:a14="http://schemas.microsoft.com/office/drawing/2010/main"/>
+                      </a:ext>
+                    </a:extLst>
+                  </pic:spPr>
+                </pic:pic>
+              </a:graphicData>
+            </a:graphic>
+          </wp:inline>
+        </w:drawing>
+      </w:r>
+    </w:p>
+    <w:p>
+      <w:pPr>
+        <w:spacing w:after="360" w:line="360" w:lineRule="auto"/>
+        <w:jc w:val="center"/>
+        <w:rPr>
+          <w:rFonts w:ascii="Calibri" w:eastAsia="Calibri" w:hAnsi="Calibri" w:cs="Calibri"/>
+          <w:color w:val="44494F"/>
+          <w:sz w:val="20"/>
+          <w:szCs w:val="20"/>
+        </w:rPr>
+      </w:pPr>
+      <w:r>
+        <w:rPr>
+          <w:rFonts w:ascii="Calibri" w:eastAsia="Calibri" w:hAnsi="Calibri" w:cs="Calibri"/>
+          <w:color w:val="44494F"/>
+          <w:sz w:val="20"/>
+          <w:szCs w:val="20"/>
+        </w:rPr>
+        <w:t>Figure</w:t>
+      </w:r>
+      <w:r>
+        <w:rPr>
+          <w:rFonts w:ascii="Calibri" w:eastAsia="Calibri" w:hAnsi="Calibri" w:cs="Calibri"/>
+          <w:color w:val="44494F"/>
+          <w:sz w:val="20"/>
+          <w:szCs w:val="20"/>
+        </w:rPr>
+        <w:t xml:space="preserve"> 5.1: Sample paragraph data structure (</w:t>
+      </w:r>
+      <w:proofErr w:type="spellStart"/>
+      <w:r>
+        <w:rPr>
+          <w:rFonts w:ascii="Calibri" w:eastAsia="Calibri" w:hAnsi="Calibri" w:cs="Calibri"/>
+          <w:color w:val="44494F"/>
+          <w:sz w:val="20"/>
+          <w:szCs w:val="20"/>
+        </w:rPr>
+        <w:t>iXBRL</w:t>
+      </w:r>
+      <w:proofErr w:type="spellEnd"/>
+      <w:r>
+        <w:rPr>
+          <w:rFonts w:ascii="Calibri" w:eastAsia="Calibri" w:hAnsi="Calibri" w:cs="Calibri"/>
+          <w:color w:val="44494F"/>
+          <w:sz w:val="20"/>
+          <w:szCs w:val="20"/>
+        </w:rPr>
+        <w:t xml:space="preserve"> disclosure section)</w:t>
+      </w:r>
+    </w:p>
+    <w:p>
+      <w:pPr>
+        <w:spacing w:after="360" w:line="360" w:lineRule="auto"/>
+        <w:jc w:val="center"/>
+      </w:pPr>
+    </w:p>
+    <w:p>
+      <w:pPr>
         <w:spacing w:before="90" w:after="240"/>
         <w:jc w:val="center"/>
-      </w:pPr>
+        <w:rPr>
+          <w:rFonts w:ascii="Calibri" w:eastAsia="Calibri" w:hAnsi="Calibri" w:cs="Calibri"/>
+          <w:color w:val="44494F"/>
+          <w:sz w:val="20"/>
+          <w:szCs w:val="20"/>
+        </w:rPr>
+      </w:pPr>
+      <w:r>
+        <w:rPr>
+          <w:rFonts w:ascii="Calibri" w:eastAsia="Calibri" w:hAnsi="Calibri" w:cs="Calibri"/>
+          <w:noProof/>
+          <w:color w:val="44494F"/>
+          <w:sz w:val="20"/>
+          <w:szCs w:val="20"/>
+        </w:rPr>
+        <w:drawing>
+          <wp:inline distT="0" distB="0" distL="0" distR="0" wp14:anchorId="7EFF1738" wp14:editId="2A303E2B">
+            <wp:extent cx="5760720" cy="1295400"/>
+            <wp:effectExtent l="0" t="0" r="5080" b="0"/>
+            <wp:docPr id="1065290518" name="Picture 1"/>
+            <wp:cNvGraphicFramePr>
+              <a:graphicFrameLocks xmlns:a="http://schemas.openxmlformats.org/drawingml/2006/main" noChangeAspect="1"/>
+            </wp:cNvGraphicFramePr>
+            <a:graphic xmlns:a="http://schemas.openxmlformats.org/drawingml/2006/main">
+              <a:graphicData uri="http://schemas.openxmlformats.org/drawingml/2006/picture">
+                <pic:pic xmlns:pic="http://schemas.openxmlformats.org/drawingml/2006/picture">
+                  <pic:nvPicPr>
+                    <pic:cNvPr id="1065290518" name="Picture 1065290518"/>
+                    <pic:cNvPicPr/>
+                  </pic:nvPicPr>
+                  <pic:blipFill>
+                    <a:blip r:embed="rId10">
+                      <a:extLst>
+                        <a:ext uri="{28A0092B-C50C-407E-A947-70E740481C1C}">
+                          <a14:useLocalDpi xmlns:a14="http://schemas.microsoft.com/office/drawing/2010/main" val="0"/>
+                        </a:ext>
+                      </a:extLst>
+                    </a:blip>
+                    <a:stretch>
+                      <a:fillRect/>
+                    </a:stretch>
+                  </pic:blipFill>
+                  <pic:spPr>
+                    <a:xfrm>
+                      <a:off x="0" y="0"/>
+                      <a:ext cx="5760720" cy="1295400"/>
+                    </a:xfrm>
+                    <a:prstGeom prst="rect">
+                      <a:avLst/>
+                    </a:prstGeom>
+                  </pic:spPr>
+                </pic:pic>
+              </a:graphicData>
+            </a:graphic>
+          </wp:inline>
+        </w:drawing>
+      </w:r>
+    </w:p>
+    <w:p>
+      <w:pPr>
+        <w:spacing w:before="90" w:after="240"/>
+        <w:jc w:val="center"/>
+      </w:pPr>
+      <w:r>
+        <w:rPr>
+          <w:rFonts w:ascii="Calibri" w:eastAsia="Calibri" w:hAnsi="Calibri" w:cs="Calibri"/>
+          <w:color w:val="44494F"/>
+          <w:sz w:val="20"/>
+          <w:szCs w:val="20"/>
+        </w:rPr>
+        <w:t>Image</w:t>
+      </w:r>
+      <w:r>
+        <w:rPr>
+          <w:rFonts w:ascii="Calibri" w:eastAsia="Calibri" w:hAnsi="Calibri" w:cs="Calibri"/>
+          <w:color w:val="44494F"/>
+          <w:sz w:val="20"/>
+          <w:szCs w:val="20"/>
+        </w:rPr>
+        <w:t xml:space="preserve"> 5.</w:t>
+      </w:r>
+      <w:r>
+        <w:rPr>
+          <w:rFonts w:ascii="Calibri" w:eastAsia="Calibri" w:hAnsi="Calibri" w:cs="Calibri"/>
+          <w:color w:val="44494F"/>
+          <w:sz w:val="20"/>
+          <w:szCs w:val="20"/>
+        </w:rPr>
+        <w:t>2</w:t>
+      </w:r>
+      <w:r>
+        <w:rPr>
+          <w:rFonts w:ascii="Calibri" w:eastAsia="Calibri" w:hAnsi="Calibri" w:cs="Calibri"/>
+          <w:color w:val="44494F"/>
+          <w:sz w:val="20"/>
+          <w:szCs w:val="20"/>
+        </w:rPr>
+        <w:t xml:space="preserve">: Sample table </w:t>
+      </w:r>
+      <w:r>
+        <w:rPr>
+          <w:rFonts w:ascii="Calibri" w:eastAsia="Calibri" w:hAnsi="Calibri" w:cs="Calibri"/>
+          <w:color w:val="44494F"/>
+          <w:sz w:val="20"/>
+          <w:szCs w:val="20"/>
+        </w:rPr>
+        <w:t xml:space="preserve">render </w:t>
+      </w:r>
+      <w:r>
+        <w:rPr>
+          <w:rFonts w:ascii="Calibri" w:eastAsia="Calibri" w:hAnsi="Calibri" w:cs="Calibri"/>
+          <w:color w:val="44494F"/>
+          <w:sz w:val="20"/>
+          <w:szCs w:val="20"/>
+        </w:rPr>
+        <w:t>(Interest Rate Sensitivity table)</w:t>
+      </w:r>
+    </w:p>
+    <w:p>
+      <w:pPr>
+        <w:spacing w:after="360" w:line="360" w:lineRule="auto"/>
+        <w:jc w:val="center"/>
+      </w:pPr>
+      <w:r>
+        <w:rPr>
+          <w:noProof/>
+        </w:rPr>
+        <w:lastRenderedPageBreak/>
+        <w:drawing>
+          <wp:inline distT="0" distB="0" distL="0" distR="0" wp14:anchorId="33A4C594" wp14:editId="766544E6">
+            <wp:extent cx="5286828" cy="8380081"/>
+            <wp:effectExtent l="0" t="0" r="0" b="2540"/>
+            <wp:docPr id="7526926" name="Picture 3"/>
+            <wp:cNvGraphicFramePr>
+              <a:graphicFrameLocks xmlns:a="http://schemas.openxmlformats.org/drawingml/2006/main" noChangeAspect="1"/>
+            </wp:cNvGraphicFramePr>
+            <a:graphic xmlns:a="http://schemas.openxmlformats.org/drawingml/2006/main">
+              <a:graphicData uri="http://schemas.openxmlformats.org/drawingml/2006/picture">
+                <pic:pic xmlns:pic="http://schemas.openxmlformats.org/drawingml/2006/picture">
+                  <pic:nvPicPr>
+                    <pic:cNvPr id="7526926" name="Picture 7526926"/>
+                    <pic:cNvPicPr/>
+                  </pic:nvPicPr>
+                  <pic:blipFill rotWithShape="1">
+                    <a:blip r:embed="rId11">
+                      <a:extLst>
+                        <a:ext uri="{28A0092B-C50C-407E-A947-70E740481C1C}">
+                          <a14:useLocalDpi xmlns:a14="http://schemas.microsoft.com/office/drawing/2010/main" val="0"/>
+                        </a:ext>
+                      </a:extLst>
+                    </a:blip>
+                    <a:srcRect l="4921" t="3006" r="4445" b="3175"/>
+                    <a:stretch>
+                      <a:fillRect/>
+                    </a:stretch>
+                  </pic:blipFill>
+                  <pic:spPr bwMode="auto">
+                    <a:xfrm>
+                      <a:off x="0" y="0"/>
+                      <a:ext cx="5319978" cy="8432626"/>
+                    </a:xfrm>
+                    <a:prstGeom prst="rect">
+                      <a:avLst/>
+                    </a:prstGeom>
+                    <a:ln>
+                      <a:noFill/>
+                    </a:ln>
+                    <a:extLst>
+                      <a:ext uri="{53640926-AAD7-44D8-BBD7-CCE9431645EC}">
+                        <a14:shadowObscured xmlns:a14="http://schemas.microsoft.com/office/drawing/2010/main"/>
+                      </a:ext>
+                    </a:extLst>
+                  </pic:spPr>
+                </pic:pic>
+              </a:graphicData>
+            </a:graphic>
+          </wp:inline>
+        </w:drawing>
+      </w:r>
+    </w:p>
+    <w:p>
+      <w:pPr>
+        <w:spacing w:before="90" w:after="240"/>
+        <w:jc w:val="center"/>
+      </w:pPr>
+      <w:r>
+        <w:rPr>
+          <w:rFonts w:ascii="Calibri" w:eastAsia="Calibri" w:hAnsi="Calibri" w:cs="Calibri"/>
+          <w:color w:val="44494F"/>
+          <w:sz w:val="20"/>
+          <w:szCs w:val="20"/>
+        </w:rPr>
+        <w:t>Figure</w:t>
+      </w:r>
+      <w:r>
+        <w:rPr>
+          <w:rFonts w:ascii="Calibri" w:eastAsia="Calibri" w:hAnsi="Calibri" w:cs="Calibri"/>
+          <w:color w:val="44494F"/>
+          <w:sz w:val="20"/>
+          <w:szCs w:val="20"/>
+        </w:rPr>
+        <w:t xml:space="preserve"> 5.</w:t>
+      </w:r>
+      <w:r>
+        <w:rPr>
+          <w:rFonts w:ascii="Calibri" w:eastAsia="Calibri" w:hAnsi="Calibri" w:cs="Calibri"/>
+          <w:color w:val="44494F"/>
+          <w:sz w:val="20"/>
+          <w:szCs w:val="20"/>
+        </w:rPr>
+        <w:t>3</w:t>
+      </w:r>
+      <w:r>
+        <w:rPr>
+          <w:rFonts w:ascii="Calibri" w:eastAsia="Calibri" w:hAnsi="Calibri" w:cs="Calibri"/>
+          <w:color w:val="44494F"/>
+          <w:sz w:val="20"/>
+          <w:szCs w:val="20"/>
+        </w:rPr>
+        <w:t>: Sample table data structure (Interest Rate Sensitivity table)</w:t>
+      </w:r>
     </w:p>
     <w:p>
       <w:pPr>
@@ -3111,59 +3670,12 @@
           <w:bottom w:val="single" w:sz="8" w:space="6" w:color="15406B"/>
         </w:pBdr>
       </w:pPr>
-      <w:bookmarkStart w:id="9" w:name="_Toc233304226"/>
-      <w:r>
-        <w:t>5. Data Sources</w:t>
-      </w:r>
-      <w:bookmarkEnd w:id="9"/>
-    </w:p>
-    <w:p>
-      <w:pPr>
-        <w:keepNext/>
-        <w:keepLines/>
-        <w:spacing w:after="180" w:line="360" w:lineRule="auto"/>
-        <w:jc w:val="both"/>
-        <w:rPr>
-          <w:sz w:val="24"/>
-          <w:szCs w:val="24"/>
-        </w:rPr>
-      </w:pPr>
-      <w:r>
-        <w:rPr>
-          <w:sz w:val="24"/>
-          <w:szCs w:val="24"/>
-        </w:rPr>
-        <w:t xml:space="preserve">All data is sourced from SEC EDGAR, the US Securities and Exchange Commission's public filing system: a corpus of approximately six to nine 10-K annual filings, drawn from two to three companies across two to three fiscal years. These are public corporate disclosures containing no personal or human-subject data; as public-domain US federal regulatory records, they carry no copyright restriction, so no licence or consent is required for their use. Filings are parsed via </w:t>
-      </w:r>
-      <w:proofErr w:type="spellStart"/>
-      <w:r>
-        <w:rPr>
-          <w:sz w:val="24"/>
-          <w:szCs w:val="24"/>
-        </w:rPr>
-        <w:t>LlamaParse</w:t>
-      </w:r>
-      <w:proofErr w:type="spellEnd"/>
-      <w:r>
-        <w:rPr>
-          <w:sz w:val="24"/>
-          <w:szCs w:val="24"/>
-        </w:rPr>
-        <w:t xml:space="preserve"> (free tier) into metadata-enriched text and table nodes.</w:t>
-      </w:r>
-    </w:p>
-    <w:p>
-      <w:pPr>
-        <w:pStyle w:val="Heading1"/>
-        <w:pBdr>
-          <w:bottom w:val="single" w:sz="8" w:space="6" w:color="15406B"/>
-        </w:pBdr>
-      </w:pPr>
-      <w:bookmarkStart w:id="10" w:name="_Toc233304227"/>
-      <w:r>
+      <w:bookmarkStart w:id="12" w:name="_Toc233363968"/>
+      <w:r>
+        <w:lastRenderedPageBreak/>
         <w:t>6. Testing and Evaluation</w:t>
       </w:r>
-      <w:bookmarkEnd w:id="10"/>
+      <w:bookmarkEnd w:id="12"/>
     </w:p>
     <w:p>
       <w:pPr>
@@ -3228,7 +3740,6 @@
           <w:sz w:val="24"/>
           <w:szCs w:val="24"/>
         </w:rPr>
-        <w:lastRenderedPageBreak/>
         <w:t>Answer-quality metrics</w:t>
       </w:r>
       <w:r>
@@ -3373,11 +3884,11 @@
           <w:bottom w:val="single" w:sz="8" w:space="6" w:color="15406B"/>
         </w:pBdr>
       </w:pPr>
-      <w:bookmarkStart w:id="11" w:name="_Toc233304228"/>
+      <w:bookmarkStart w:id="13" w:name="_Toc233363969"/>
       <w:r>
         <w:t>7. Project Ethics and Human Participants</w:t>
       </w:r>
-      <w:bookmarkEnd w:id="11"/>
+      <w:bookmarkEnd w:id="13"/>
     </w:p>
     <w:p>
       <w:pPr>
@@ -3403,11 +3914,12 @@
           <w:bottom w:val="single" w:sz="8" w:space="6" w:color="15406B"/>
         </w:pBdr>
       </w:pPr>
-      <w:bookmarkStart w:id="12" w:name="_Toc233304229"/>
-      <w:r>
+      <w:bookmarkStart w:id="14" w:name="_Toc233363970"/>
+      <w:r>
+        <w:lastRenderedPageBreak/>
         <w:t>8. BCS Project Criteria</w:t>
       </w:r>
-      <w:bookmarkEnd w:id="12"/>
+      <w:bookmarkEnd w:id="14"/>
     </w:p>
     <w:p>
       <w:pPr>
@@ -3426,16 +3938,7 @@
           <w:sz w:val="24"/>
           <w:szCs w:val="24"/>
         </w:rPr>
-        <w:t xml:space="preserve">Systematic </w:t>
-      </w:r>
-      <w:r>
-        <w:rPr>
-          <w:b/>
-          <w:bCs/>
-          <w:sz w:val="24"/>
-          <w:szCs w:val="24"/>
-        </w:rPr>
-        <w:t>understanding:</w:t>
+        <w:t>Systematic understanding:</w:t>
       </w:r>
       <w:r>
         <w:rPr>
@@ -3462,26 +3965,7 @@
           <w:sz w:val="24"/>
           <w:szCs w:val="24"/>
         </w:rPr>
-        <w:lastRenderedPageBreak/>
-        <w:t xml:space="preserve">Comprehensive technique </w:t>
-      </w:r>
-      <w:r>
-        <w:rPr>
-          <w:b/>
-          <w:bCs/>
-          <w:sz w:val="24"/>
-          <w:szCs w:val="24"/>
-        </w:rPr>
-        <w:t>understanding</w:t>
-      </w:r>
-      <w:r>
-        <w:rPr>
-          <w:b/>
-          <w:bCs/>
-          <w:sz w:val="24"/>
-          <w:szCs w:val="24"/>
-        </w:rPr>
-        <w:t>:</w:t>
+        <w:t>Comprehensive technique understanding:</w:t>
       </w:r>
       <w:r>
         <w:rPr>
@@ -3569,21 +4053,7 @@
           <w:sz w:val="24"/>
           <w:szCs w:val="24"/>
         </w:rPr>
-        <w:t xml:space="preserve"> a one person, ten </w:t>
-      </w:r>
-      <w:r>
-        <w:rPr>
-          <w:sz w:val="24"/>
-          <w:szCs w:val="24"/>
-        </w:rPr>
-        <w:t>weeks</w:t>
-      </w:r>
-      <w:r>
-        <w:rPr>
-          <w:sz w:val="24"/>
-          <w:szCs w:val="24"/>
-        </w:rPr>
-        <w:t xml:space="preserve"> build plan run entirely on free-tier infrastructure with no managed budget demonstrates autonomous planning.</w:t>
+        <w:t xml:space="preserve"> a one person, ten weeks build plan run entirely on free-tier infrastructure with no managed budget demonstrates autonomous planning.</w:t>
       </w:r>
     </w:p>
     <w:p>
@@ -3620,11 +4090,11 @@
           <w:bottom w:val="single" w:sz="8" w:space="6" w:color="15406B"/>
         </w:pBdr>
       </w:pPr>
-      <w:bookmarkStart w:id="13" w:name="_Toc233304230"/>
+      <w:bookmarkStart w:id="15" w:name="_Toc233363971"/>
       <w:r>
         <w:t>9. UI/UX Mockup</w:t>
       </w:r>
-      <w:bookmarkEnd w:id="13"/>
+      <w:bookmarkEnd w:id="15"/>
     </w:p>
     <w:p>
       <w:pPr>
@@ -3640,21 +4110,7 @@
           <w:sz w:val="24"/>
           <w:szCs w:val="24"/>
         </w:rPr>
-        <w:t>This is a research and benchmarking system rather than an end-user application, so its principal "interface" is the results comparison view produced at the end of the run. Day to day, the researcher's surface is a command line</w:t>
-      </w:r>
-      <w:r>
-        <w:rPr>
-          <w:sz w:val="24"/>
-          <w:szCs w:val="24"/>
-        </w:rPr>
-        <w:t xml:space="preserve">. </w:t>
-      </w:r>
-      <w:r>
-        <w:rPr>
-          <w:sz w:val="24"/>
-          <w:szCs w:val="24"/>
-        </w:rPr>
-        <w:t>A wireframe sketch of the final comparison view, the artefact consulted most, is shown below.</w:t>
+        <w:t>This is a research and benchmarking system rather than an end-user application, so its principal "interface" is the results comparison view produced at the end of the run. Day to day, the researcher's surface is a command line. A wireframe sketch of the final comparison view, the artefact consulted most, is shown below.</w:t>
       </w:r>
     </w:p>
     <w:tbl>
@@ -4500,11 +4956,12 @@
           <w:bottom w:val="single" w:sz="8" w:space="6" w:color="15406B"/>
         </w:pBdr>
       </w:pPr>
-      <w:bookmarkStart w:id="14" w:name="_Toc233304231"/>
-      <w:r>
+      <w:bookmarkStart w:id="16" w:name="_Toc233363972"/>
+      <w:r>
+        <w:lastRenderedPageBreak/>
         <w:t>10. Project Plan</w:t>
       </w:r>
-      <w:bookmarkEnd w:id="14"/>
+      <w:bookmarkEnd w:id="16"/>
     </w:p>
     <w:p>
       <w:pPr>
@@ -4586,7 +5043,6 @@
                 <w:sz w:val="20"/>
                 <w:szCs w:val="20"/>
               </w:rPr>
-              <w:lastRenderedPageBreak/>
               <w:t>Phase</w:t>
             </w:r>
           </w:p>
@@ -6837,11 +7293,11 @@
           <w:bottom w:val="single" w:sz="8" w:space="6" w:color="15406B"/>
         </w:pBdr>
       </w:pPr>
-      <w:bookmarkStart w:id="15" w:name="_Toc233304232"/>
+      <w:bookmarkStart w:id="17" w:name="_Toc233363973"/>
       <w:r>
         <w:t>11. Risks and Contingency Plans</w:t>
       </w:r>
-      <w:bookmarkEnd w:id="15"/>
+      <w:bookmarkEnd w:id="17"/>
     </w:p>
     <w:tbl>
       <w:tblPr>
@@ -7833,6 +8289,7 @@
                 <w:sz w:val="19"/>
                 <w:szCs w:val="19"/>
               </w:rPr>
+              <w:lastRenderedPageBreak/>
               <w:t>Local machine failure or loss of unsynced work (no backups)</w:t>
             </w:r>
           </w:p>
@@ -7965,12 +8422,12 @@
           <w:bottom w:val="single" w:sz="8" w:space="6" w:color="15406B"/>
         </w:pBdr>
       </w:pPr>
-      <w:bookmarkStart w:id="16" w:name="_Toc233304233"/>
+      <w:bookmarkStart w:id="18" w:name="_Toc233363974"/>
       <w:r>
         <w:lastRenderedPageBreak/>
         <w:t>12. References</w:t>
       </w:r>
-      <w:bookmarkEnd w:id="16"/>
+      <w:bookmarkEnd w:id="18"/>
     </w:p>
     <w:p>
       <w:pPr>
@@ -7979,13 +8436,7 @@
         <w:jc w:val="both"/>
       </w:pPr>
       <w:r>
-        <w:t>Chen, Z., Chen, W., Smiley, C., Shah, S., Borova, I., Langdon, D., Moussa, R., Beane, M., Huang, T.-H.,</w:t>
-      </w:r>
-      <w:r>
-        <w:t xml:space="preserve"> </w:t>
-      </w:r>
-      <w:r>
-        <w:t>Routledge, B. and Wang, W.Y. (2021) 'FinQA: A Dataset of Numerical Reasoning over Financial Data', Proceedings of the 2021 Conference on Empirical Methods in Natural Language Processing (EMNLP 2021), pp. 3697–3711.</w:t>
+        <w:t>Chen, Z., Chen, W., Smiley, C., Shah, S., Borova, I., Langdon, D., Moussa, R., Beane, M., Huang, T.-H., Routledge, B. and Wang, W.Y. (2021) 'FinQA: A Dataset of Numerical Reasoning over Financial Data', Proceedings of the 2021 Conference on Empirical Methods in Natural Language Processing (EMNLP 2021), pp. 3697–3711.</w:t>
       </w:r>
     </w:p>
     <w:p>
@@ -8069,8 +8520,8 @@
       </w:r>
     </w:p>
     <w:sectPr>
-      <w:headerReference w:type="default" r:id="rId9"/>
-      <w:footerReference w:type="default" r:id="rId10"/>
+      <w:headerReference w:type="default" r:id="rId12"/>
+      <w:footerReference w:type="default" r:id="rId13"/>
       <w:pgSz w:w="11906" w:h="16838"/>
       <w:pgMar w:top="1417" w:right="1417" w:bottom="1417" w:left="1417" w:header="708" w:footer="708" w:gutter="0"/>
       <w:cols w:space="720"/>
@@ -8980,6 +9431,7 @@
   <w:style w:type="paragraph" w:default="1" w:styleId="Normal">
     <w:name w:val="Normal"/>
     <w:qFormat/>
+    <w:rsid w:val="00A51F30"/>
   </w:style>
   <w:style w:type="paragraph" w:styleId="Heading1">
     <w:name w:val="heading 1"/>
@@ -9002,6 +9454,7 @@
   </w:style>
   <w:style w:type="paragraph" w:styleId="Heading2">
     <w:name w:val="heading 2"/>
+    <w:link w:val="Heading2Char"/>
     <w:uiPriority w:val="9"/>
     <w:unhideWhenUsed/>
     <w:qFormat/>
@@ -9227,6 +9680,21 @@
     <w:rPr>
       <w:b/>
       <w:bCs/>
+    </w:rPr>
+  </w:style>
+  <w:style w:type="character" w:customStyle="1" w:styleId="Heading2Char">
+    <w:name w:val="Heading 2 Char"/>
+    <w:basedOn w:val="DefaultParagraphFont"/>
+    <w:link w:val="Heading2"/>
+    <w:uiPriority w:val="9"/>
+    <w:rsid w:val="00057128"/>
+    <w:rPr>
+      <w:rFonts w:ascii="Calibri" w:eastAsia="Calibri" w:hAnsi="Calibri" w:cs="Calibri"/>
+      <w:b/>
+      <w:bCs/>
+      <w:color w:val="15406B"/>
+      <w:sz w:val="30"/>
+      <w:szCs w:val="30"/>
     </w:rPr>
   </w:style>
 </w:styles>

</xml_diff>

<commit_message>
Humanised some parts of the body.
</commit_message>
<xml_diff>
--- a/artifacts/Proposal_v1.0.0.docx
+++ b/artifacts/Proposal_v1.0.0.docx
@@ -2525,7 +2525,321 @@
           <w:sz w:val="24"/>
           <w:szCs w:val="24"/>
         </w:rPr>
-        <w:t>The system is implemented in Python 3, using LlamaIndex as a common retrieval and orchestration backbone so that all three pipelines expose the same retriever interface. Python is the natural choice because the entire required ecosystem, LlamaIndex, the Groq SDK, rank_bm25, ChromaDB, and the HuggingFace BGE models, is Python-native, so reimplementing any part of it in another language would mean rebuilding mature retrieval and embedding infrastructure from scratch. LlamaIndex specifically is chosen over a lower-level alternative such as LangChain because its node and scored-result abstractions already match the project’s own node-centric data model (Section 5), allowing the three pipelines to share one retriever interface without an additional adapter layer. Generation, dataset critique, and judging are performed by open-source instruction models served free of charge via Groq (rate-limited rather than billed, so the implementation has zero recurring spend). Embeddings (BAAI/bge-small-en-v1.5) and reranking (BAAI/bge-reranker-base) run locally on CPU.</w:t>
+        <w:t>The</w:t>
+      </w:r>
+      <w:r>
+        <w:rPr>
+          <w:sz w:val="24"/>
+          <w:szCs w:val="24"/>
+        </w:rPr>
+        <w:t xml:space="preserve"> core of the</w:t>
+      </w:r>
+      <w:r>
+        <w:rPr>
+          <w:sz w:val="24"/>
+          <w:szCs w:val="24"/>
+        </w:rPr>
+        <w:t xml:space="preserve"> system is built </w:t>
+      </w:r>
+      <w:r>
+        <w:rPr>
+          <w:sz w:val="24"/>
+          <w:szCs w:val="24"/>
+        </w:rPr>
+        <w:t>in</w:t>
+      </w:r>
+      <w:r>
+        <w:rPr>
+          <w:sz w:val="24"/>
+          <w:szCs w:val="24"/>
+        </w:rPr>
+        <w:t xml:space="preserve"> Python </w:t>
+      </w:r>
+      <w:r>
+        <w:rPr>
+          <w:sz w:val="24"/>
+          <w:szCs w:val="24"/>
+        </w:rPr>
+        <w:t>3 and</w:t>
+      </w:r>
+      <w:r>
+        <w:rPr>
+          <w:sz w:val="24"/>
+          <w:szCs w:val="24"/>
+        </w:rPr>
+        <w:t xml:space="preserve"> uses </w:t>
+      </w:r>
+      <w:proofErr w:type="spellStart"/>
+      <w:r>
+        <w:rPr>
+          <w:sz w:val="24"/>
+          <w:szCs w:val="24"/>
+        </w:rPr>
+        <w:t>LlamaIndex</w:t>
+      </w:r>
+      <w:proofErr w:type="spellEnd"/>
+      <w:r>
+        <w:rPr>
+          <w:sz w:val="24"/>
+          <w:szCs w:val="24"/>
+        </w:rPr>
+        <w:t xml:space="preserve"> as a common retrieval and orchestration backbone</w:t>
+      </w:r>
+      <w:r>
+        <w:rPr>
+          <w:sz w:val="24"/>
+          <w:szCs w:val="24"/>
+        </w:rPr>
+        <w:t>,</w:t>
+      </w:r>
+      <w:r>
+        <w:rPr>
+          <w:sz w:val="24"/>
+          <w:szCs w:val="24"/>
+        </w:rPr>
+        <w:t xml:space="preserve"> so that all three pipelines </w:t>
+      </w:r>
+      <w:r>
+        <w:rPr>
+          <w:sz w:val="24"/>
+          <w:szCs w:val="24"/>
+        </w:rPr>
+        <w:t>expose</w:t>
+      </w:r>
+      <w:r>
+        <w:rPr>
+          <w:sz w:val="24"/>
+          <w:szCs w:val="24"/>
+        </w:rPr>
+        <w:t xml:space="preserve"> the same retriever interface. Python</w:t>
+      </w:r>
+      <w:r>
+        <w:rPr>
+          <w:sz w:val="24"/>
+          <w:szCs w:val="24"/>
+        </w:rPr>
+        <w:t xml:space="preserve"> is</w:t>
+      </w:r>
+      <w:r>
+        <w:rPr>
+          <w:sz w:val="24"/>
+          <w:szCs w:val="24"/>
+        </w:rPr>
+        <w:t xml:space="preserve"> </w:t>
+      </w:r>
+      <w:r>
+        <w:rPr>
+          <w:sz w:val="24"/>
+          <w:szCs w:val="24"/>
+        </w:rPr>
+        <w:t xml:space="preserve">chosen </w:t>
+      </w:r>
+      <w:r>
+        <w:rPr>
+          <w:sz w:val="24"/>
+          <w:szCs w:val="24"/>
+        </w:rPr>
+        <w:t>because the whole ecosystem</w:t>
+      </w:r>
+      <w:r>
+        <w:rPr>
+          <w:sz w:val="24"/>
+          <w:szCs w:val="24"/>
+        </w:rPr>
+        <w:t>, i.e.,</w:t>
+      </w:r>
+      <w:r>
+        <w:rPr>
+          <w:sz w:val="24"/>
+          <w:szCs w:val="24"/>
+        </w:rPr>
+        <w:t xml:space="preserve"> </w:t>
+      </w:r>
+      <w:proofErr w:type="spellStart"/>
+      <w:r>
+        <w:rPr>
+          <w:sz w:val="24"/>
+          <w:szCs w:val="24"/>
+        </w:rPr>
+        <w:t>LlamaIndex</w:t>
+      </w:r>
+      <w:proofErr w:type="spellEnd"/>
+      <w:r>
+        <w:rPr>
+          <w:sz w:val="24"/>
+          <w:szCs w:val="24"/>
+        </w:rPr>
+        <w:t xml:space="preserve">, the </w:t>
+      </w:r>
+      <w:proofErr w:type="spellStart"/>
+      <w:r>
+        <w:rPr>
+          <w:sz w:val="24"/>
+          <w:szCs w:val="24"/>
+        </w:rPr>
+        <w:t>Groq</w:t>
+      </w:r>
+      <w:proofErr w:type="spellEnd"/>
+      <w:r>
+        <w:rPr>
+          <w:sz w:val="24"/>
+          <w:szCs w:val="24"/>
+        </w:rPr>
+        <w:t xml:space="preserve"> SDK, rank_bm25, </w:t>
+      </w:r>
+      <w:proofErr w:type="spellStart"/>
+      <w:r>
+        <w:rPr>
+          <w:sz w:val="24"/>
+          <w:szCs w:val="24"/>
+        </w:rPr>
+        <w:t>ChromaDB</w:t>
+      </w:r>
+      <w:proofErr w:type="spellEnd"/>
+      <w:r>
+        <w:rPr>
+          <w:sz w:val="24"/>
+          <w:szCs w:val="24"/>
+        </w:rPr>
+        <w:t xml:space="preserve">, and the </w:t>
+      </w:r>
+      <w:proofErr w:type="spellStart"/>
+      <w:r>
+        <w:rPr>
+          <w:sz w:val="24"/>
+          <w:szCs w:val="24"/>
+        </w:rPr>
+        <w:t>HuggingFace</w:t>
+      </w:r>
+      <w:proofErr w:type="spellEnd"/>
+      <w:r>
+        <w:rPr>
+          <w:sz w:val="24"/>
+          <w:szCs w:val="24"/>
+        </w:rPr>
+        <w:t xml:space="preserve"> BGE models</w:t>
+      </w:r>
+      <w:r>
+        <w:rPr>
+          <w:sz w:val="24"/>
+          <w:szCs w:val="24"/>
+        </w:rPr>
+        <w:t>,</w:t>
+      </w:r>
+      <w:r>
+        <w:rPr>
+          <w:sz w:val="24"/>
+          <w:szCs w:val="24"/>
+        </w:rPr>
+        <w:t xml:space="preserve"> is all Python-native, so trying to rebuild </w:t>
+      </w:r>
+      <w:r>
+        <w:rPr>
+          <w:sz w:val="24"/>
+          <w:szCs w:val="24"/>
+        </w:rPr>
+        <w:t>these components in</w:t>
+      </w:r>
+      <w:r>
+        <w:rPr>
+          <w:sz w:val="24"/>
+          <w:szCs w:val="24"/>
+        </w:rPr>
+        <w:t xml:space="preserve"> another language would mean redoing mature retrieval and embedding infrastructure from scratch. </w:t>
+      </w:r>
+      <w:proofErr w:type="spellStart"/>
+      <w:r>
+        <w:rPr>
+          <w:sz w:val="24"/>
+          <w:szCs w:val="24"/>
+        </w:rPr>
+        <w:t>LlamaIndex</w:t>
+      </w:r>
+      <w:proofErr w:type="spellEnd"/>
+      <w:r>
+        <w:rPr>
+          <w:sz w:val="24"/>
+          <w:szCs w:val="24"/>
+        </w:rPr>
+        <w:t xml:space="preserve"> </w:t>
+      </w:r>
+      <w:r>
+        <w:rPr>
+          <w:sz w:val="24"/>
+          <w:szCs w:val="24"/>
+        </w:rPr>
+        <w:t xml:space="preserve">is specifically chosen </w:t>
+      </w:r>
+      <w:r>
+        <w:rPr>
+          <w:sz w:val="24"/>
+          <w:szCs w:val="24"/>
+        </w:rPr>
+        <w:t xml:space="preserve">over a lower-level option like </w:t>
+      </w:r>
+      <w:proofErr w:type="spellStart"/>
+      <w:r>
+        <w:rPr>
+          <w:sz w:val="24"/>
+          <w:szCs w:val="24"/>
+        </w:rPr>
+        <w:t>LangChain</w:t>
+      </w:r>
+      <w:proofErr w:type="spellEnd"/>
+      <w:r>
+        <w:rPr>
+          <w:sz w:val="24"/>
+          <w:szCs w:val="24"/>
+        </w:rPr>
+        <w:t xml:space="preserve">, because its node and scored-result abstractions already line up with the project's node-centric data model (Section 5), which lets the three pipelines share one retriever interface without needing an extra adapter layer. Generation, dataset critique, and judging are all handled by open-source instruction models served for free through </w:t>
+      </w:r>
+      <w:proofErr w:type="spellStart"/>
+      <w:r>
+        <w:rPr>
+          <w:sz w:val="24"/>
+          <w:szCs w:val="24"/>
+        </w:rPr>
+        <w:t>Groq</w:t>
+      </w:r>
+      <w:proofErr w:type="spellEnd"/>
+      <w:r>
+        <w:rPr>
+          <w:sz w:val="24"/>
+          <w:szCs w:val="24"/>
+        </w:rPr>
+        <w:t xml:space="preserve"> (rate-limited rather than billed, so the implementation ends up with zero recurring spend). Embeddings (BAAI/bge-small-en-v1.5) and reranking (BAAI/</w:t>
+      </w:r>
+      <w:proofErr w:type="spellStart"/>
+      <w:r>
+        <w:rPr>
+          <w:sz w:val="24"/>
+          <w:szCs w:val="24"/>
+        </w:rPr>
+        <w:t>bge</w:t>
+      </w:r>
+      <w:proofErr w:type="spellEnd"/>
+      <w:r>
+        <w:rPr>
+          <w:sz w:val="24"/>
+          <w:szCs w:val="24"/>
+        </w:rPr>
+        <w:t>-</w:t>
+      </w:r>
+      <w:proofErr w:type="spellStart"/>
+      <w:r>
+        <w:rPr>
+          <w:sz w:val="24"/>
+          <w:szCs w:val="24"/>
+        </w:rPr>
+        <w:t>reranker</w:t>
+      </w:r>
+      <w:proofErr w:type="spellEnd"/>
+      <w:r>
+        <w:rPr>
+          <w:sz w:val="24"/>
+          <w:szCs w:val="24"/>
+        </w:rPr>
+        <w:t>-base) both run locally on CPU.</w:t>
       </w:r>
     </w:p>
     <w:p>
@@ -2537,12 +2851,111 @@
           <w:szCs w:val="24"/>
         </w:rPr>
       </w:pPr>
-      <w:r>
-        <w:rPr>
-          <w:sz w:val="24"/>
-          <w:szCs w:val="24"/>
-        </w:rPr>
-        <w:t xml:space="preserve">ChromaDB provides the local vector store for P1, rank_bm25 provides the keyword index for P2, and a cached LlamaIndex SummaryIndex provides the structural pipeline for P3. A single SQLite database, run in Write-Ahead Logging mode, is the sole state store; every benchmark run commits immediately, so a crash resumes from the last written row rather than re-spending free-tier quota. Queries are split into three disjoint sets, PQ (100, the benchmark), GQ (20, Judge teaching exemplars) and JEQ (20, Judge validation), enforced at the schema level so no pipeline or prompt ever sees beyond its own group. Asynchronous worker pools, bounded by a semaphore and wrapped in an exponential-backoff retry layer, keep concurrent API calls within Groq’s free-tier rate limits. Workflow is organised phase-by-phase as set out in Section 10, with the code for each </w:t>
+      <w:proofErr w:type="spellStart"/>
+      <w:r>
+        <w:rPr>
+          <w:sz w:val="24"/>
+          <w:szCs w:val="24"/>
+        </w:rPr>
+        <w:t>ChromaDB</w:t>
+      </w:r>
+      <w:proofErr w:type="spellEnd"/>
+      <w:r>
+        <w:rPr>
+          <w:sz w:val="24"/>
+          <w:szCs w:val="24"/>
+        </w:rPr>
+        <w:t xml:space="preserve"> acts as the local vector store for P1, rank_bm25 handles the keyword index for P2, and a cached </w:t>
+      </w:r>
+      <w:proofErr w:type="spellStart"/>
+      <w:r>
+        <w:rPr>
+          <w:sz w:val="24"/>
+          <w:szCs w:val="24"/>
+        </w:rPr>
+        <w:t>LlamaIndex</w:t>
+      </w:r>
+      <w:proofErr w:type="spellEnd"/>
+      <w:r>
+        <w:rPr>
+          <w:sz w:val="24"/>
+          <w:szCs w:val="24"/>
+        </w:rPr>
+        <w:t xml:space="preserve"> </w:t>
+      </w:r>
+      <w:proofErr w:type="spellStart"/>
+      <w:r>
+        <w:rPr>
+          <w:sz w:val="24"/>
+          <w:szCs w:val="24"/>
+        </w:rPr>
+        <w:t>SummaryIndex</w:t>
+      </w:r>
+      <w:proofErr w:type="spellEnd"/>
+      <w:r>
+        <w:rPr>
+          <w:sz w:val="24"/>
+          <w:szCs w:val="24"/>
+        </w:rPr>
+        <w:t xml:space="preserve"> serves as the structural pipeline for P3. A single SQLite database, run in Write-Ahead Logging mode, is the only state store; every benchmark run commits right away, so if there's a crash, it picks back up from the last written row instead of burning </w:t>
+      </w:r>
+      <w:r>
+        <w:rPr>
+          <w:sz w:val="24"/>
+          <w:szCs w:val="24"/>
+        </w:rPr>
+        <w:t>unnecessary</w:t>
+      </w:r>
+      <w:r>
+        <w:rPr>
+          <w:sz w:val="24"/>
+          <w:szCs w:val="24"/>
+        </w:rPr>
+        <w:t xml:space="preserve"> </w:t>
+      </w:r>
+      <w:r>
+        <w:rPr>
+          <w:sz w:val="24"/>
+          <w:szCs w:val="24"/>
+        </w:rPr>
+        <w:t>tokens</w:t>
+      </w:r>
+      <w:r>
+        <w:rPr>
+          <w:sz w:val="24"/>
+          <w:szCs w:val="24"/>
+        </w:rPr>
+        <w:t xml:space="preserve"> again. Queries get split into three separate sets, PQ (100, the benchmark), GQ (20, Judge teaching exemplars), and JEQ (20, Judge validation), and this is enforced at the schema </w:t>
+      </w:r>
+      <w:r>
+        <w:rPr>
+          <w:sz w:val="24"/>
+          <w:szCs w:val="24"/>
+        </w:rPr>
+        <w:t>level,</w:t>
+      </w:r>
+      <w:r>
+        <w:rPr>
+          <w:sz w:val="24"/>
+          <w:szCs w:val="24"/>
+        </w:rPr>
+        <w:t xml:space="preserve"> so no pipeline or prompt ever sees past its own group. Asynchronous worker pools, kept in check by a semaphore and wrapped in an exponential-backoff retry layer, keep concurrent API calls within </w:t>
+      </w:r>
+      <w:proofErr w:type="spellStart"/>
+      <w:r>
+        <w:rPr>
+          <w:sz w:val="24"/>
+          <w:szCs w:val="24"/>
+        </w:rPr>
+        <w:t>Groq's</w:t>
+      </w:r>
+      <w:proofErr w:type="spellEnd"/>
+      <w:r>
+        <w:rPr>
+          <w:sz w:val="24"/>
+          <w:szCs w:val="24"/>
+        </w:rPr>
+        <w:t xml:space="preserve"> free-tier rate limits. The workflow is organized phase by phase as laid out in </w:t>
       </w:r>
       <w:r>
         <w:rPr>
@@ -2550,7 +2963,7 @@
           <w:szCs w:val="24"/>
         </w:rPr>
         <w:lastRenderedPageBreak/>
-        <w:t>phase committed and exercised under a three-item local throttle before being released at full scale, so a fault discovered in one phase is never allowed to consume the free-tier quota reserved for an earlier or later phase.</w:t>
+        <w:t>Section 10, with the code for each phase committed and tested under a three-item local throttle before it gets released at full scale, so a fault found in one phase never ends up eating into the free-tier quota set aside for an earlier or later phase.</w:t>
       </w:r>
     </w:p>
     <w:tbl>
@@ -3223,42 +3636,7 @@
           <w:sz w:val="24"/>
           <w:szCs w:val="24"/>
         </w:rPr>
-        <w:t xml:space="preserve">Each filing contains narrative sections (risk factors, business description, management's discussion) and structured tables (financial statements, segment data, numerical metrics with currency values). The data is heterogeneous: prose sections use formal language with embedded financial figures, while tables present precisely formatted multi-year numerical comparisons. This heterogeneity is valuable for benchmarking. It tests whether retrieval pipelines can handle both semantic and structured data extraction. </w:t>
-      </w:r>
-      <w:r>
-        <w:rPr>
-          <w:sz w:val="24"/>
-          <w:szCs w:val="24"/>
-        </w:rPr>
-        <w:t xml:space="preserve">The </w:t>
-      </w:r>
-      <w:r>
-        <w:rPr>
-          <w:sz w:val="24"/>
-          <w:szCs w:val="24"/>
-        </w:rPr>
-        <w:t>raw structure of the data</w:t>
-      </w:r>
-      <w:r>
-        <w:rPr>
-          <w:sz w:val="24"/>
-          <w:szCs w:val="24"/>
-        </w:rPr>
-        <w:t xml:space="preserve"> </w:t>
-      </w:r>
-      <w:r>
-        <w:rPr>
-          <w:sz w:val="24"/>
-          <w:szCs w:val="24"/>
-        </w:rPr>
-        <w:t>is</w:t>
-      </w:r>
-      <w:r>
-        <w:rPr>
-          <w:sz w:val="24"/>
-          <w:szCs w:val="24"/>
-        </w:rPr>
-        <w:t xml:space="preserve"> covered in the next section (5.2).</w:t>
+        <w:t>Each filing contains narrative sections (risk factors, business description, management's discussion) and structured tables (financial statements, segment data, numerical metrics with currency values). The data is heterogeneous: prose sections use formal language with embedded financial figures, while tables present precisely formatted multi-year numerical comparisons. This heterogeneity is valuable for benchmarking. It tests whether retrieval pipelines can handle both semantic and structured data extraction. The raw structure of the data is covered in the next section (5.2).</w:t>
       </w:r>
     </w:p>
     <w:p>
@@ -3286,23 +3664,7 @@
           <w:sz w:val="24"/>
           <w:szCs w:val="24"/>
         </w:rPr>
-        <w:t xml:space="preserve">Figure 5.1 shows a sample paragraph from Apple's SEC 10-K filing in raw </w:t>
-      </w:r>
-      <w:proofErr w:type="spellStart"/>
-      <w:r>
-        <w:rPr>
-          <w:sz w:val="24"/>
-          <w:szCs w:val="24"/>
-        </w:rPr>
-        <w:t>iXBRL</w:t>
-      </w:r>
-      <w:proofErr w:type="spellEnd"/>
-      <w:r>
-        <w:rPr>
-          <w:sz w:val="24"/>
-          <w:szCs w:val="24"/>
-        </w:rPr>
-        <w:t xml:space="preserve"> format, with a financial figure embedded in XML markup. Figure 5.2 displays the rendered table corresponding to the raw HTML/XML code in Figure 5.3. This table from Apple's 10-K, presents interest rate sensitivity analysis with comparative figures across fiscal years. Together, these samples illustrate the dual nature of SEC 10-K data: unstructured prose with embedded financial figures and structured tabular data with precise column and row definitions. Both formats are parsed as nodes during data preparation, preserving their original structure and metadata for retrieval and evaluation.</w:t>
+        <w:t>Figure 5.1 shows a sample paragraph from Apple's SEC 10-K filing in raw iXBRL format, with a financial figure embedded in XML markup. Figure 5.2 displays the rendered table corresponding to the raw HTML/XML code in Figure 5.3. This table from Apple's 10-K, presents interest rate sensitivity analysis with comparative figures across fiscal years. Together, these samples illustrate the dual nature of SEC 10-K data: unstructured prose with embedded financial figures and structured tabular data with precise column and row definitions. Both formats are parsed as nodes during data preparation, preserving their original structure and metadata for retrieval and evaluation.</w:t>
       </w:r>
     </w:p>
     <w:p>
@@ -3390,36 +3752,7 @@
           <w:sz w:val="20"/>
           <w:szCs w:val="20"/>
         </w:rPr>
-        <w:t>Figure</w:t>
-      </w:r>
-      <w:r>
-        <w:rPr>
-          <w:rFonts w:ascii="Calibri" w:eastAsia="Calibri" w:hAnsi="Calibri" w:cs="Calibri"/>
-          <w:color w:val="44494F"/>
-          <w:sz w:val="20"/>
-          <w:szCs w:val="20"/>
-        </w:rPr>
-        <w:t xml:space="preserve"> 5.1: Sample paragraph data structure (</w:t>
-      </w:r>
-      <w:proofErr w:type="spellStart"/>
-      <w:r>
-        <w:rPr>
-          <w:rFonts w:ascii="Calibri" w:eastAsia="Calibri" w:hAnsi="Calibri" w:cs="Calibri"/>
-          <w:color w:val="44494F"/>
-          <w:sz w:val="20"/>
-          <w:szCs w:val="20"/>
-        </w:rPr>
-        <w:t>iXBRL</w:t>
-      </w:r>
-      <w:proofErr w:type="spellEnd"/>
-      <w:r>
-        <w:rPr>
-          <w:rFonts w:ascii="Calibri" w:eastAsia="Calibri" w:hAnsi="Calibri" w:cs="Calibri"/>
-          <w:color w:val="44494F"/>
-          <w:sz w:val="20"/>
-          <w:szCs w:val="20"/>
-        </w:rPr>
-        <w:t xml:space="preserve"> disclosure section)</w:t>
+        <w:t>Figure 5.1: Sample paragraph data structure (iXBRL disclosure section)</w:t>
       </w:r>
     </w:p>
     <w:p>
@@ -3502,52 +3835,7 @@
           <w:sz w:val="20"/>
           <w:szCs w:val="20"/>
         </w:rPr>
-        <w:t>Figure</w:t>
-      </w:r>
-      <w:r>
-        <w:rPr>
-          <w:rFonts w:ascii="Calibri" w:eastAsia="Calibri" w:hAnsi="Calibri" w:cs="Calibri"/>
-          <w:color w:val="44494F"/>
-          <w:sz w:val="20"/>
-          <w:szCs w:val="20"/>
-        </w:rPr>
-        <w:t xml:space="preserve"> 5.</w:t>
-      </w:r>
-      <w:r>
-        <w:rPr>
-          <w:rFonts w:ascii="Calibri" w:eastAsia="Calibri" w:hAnsi="Calibri" w:cs="Calibri"/>
-          <w:color w:val="44494F"/>
-          <w:sz w:val="20"/>
-          <w:szCs w:val="20"/>
-        </w:rPr>
-        <w:t>2</w:t>
-      </w:r>
-      <w:r>
-        <w:rPr>
-          <w:rFonts w:ascii="Calibri" w:eastAsia="Calibri" w:hAnsi="Calibri" w:cs="Calibri"/>
-          <w:color w:val="44494F"/>
-          <w:sz w:val="20"/>
-          <w:szCs w:val="20"/>
-        </w:rPr>
-        <w:t xml:space="preserve">: Sample table </w:t>
-      </w:r>
-      <w:r>
-        <w:rPr>
-          <w:rFonts w:ascii="Calibri" w:eastAsia="Calibri" w:hAnsi="Calibri" w:cs="Calibri"/>
-          <w:color w:val="44494F"/>
-          <w:sz w:val="20"/>
-          <w:szCs w:val="20"/>
-        </w:rPr>
-        <w:t xml:space="preserve">render </w:t>
-      </w:r>
-      <w:r>
-        <w:rPr>
-          <w:rFonts w:ascii="Calibri" w:eastAsia="Calibri" w:hAnsi="Calibri" w:cs="Calibri"/>
-          <w:color w:val="44494F"/>
-          <w:sz w:val="20"/>
-          <w:szCs w:val="20"/>
-        </w:rPr>
-        <w:t>(Interest Rate Sensitivity table)</w:t>
+        <w:t>Figure 5.2: Sample table render (Interest Rate Sensitivity table)</w:t>
       </w:r>
     </w:p>
     <w:p>
@@ -3624,34 +3912,7 @@
           <w:sz w:val="20"/>
           <w:szCs w:val="20"/>
         </w:rPr>
-        <w:t>Figure</w:t>
-      </w:r>
-      <w:r>
-        <w:rPr>
-          <w:rFonts w:ascii="Calibri" w:eastAsia="Calibri" w:hAnsi="Calibri" w:cs="Calibri"/>
-          <w:color w:val="44494F"/>
-          <w:sz w:val="20"/>
-          <w:szCs w:val="20"/>
-        </w:rPr>
-        <w:t xml:space="preserve"> 5.</w:t>
-      </w:r>
-      <w:r>
-        <w:rPr>
-          <w:rFonts w:ascii="Calibri" w:eastAsia="Calibri" w:hAnsi="Calibri" w:cs="Calibri"/>
-          <w:color w:val="44494F"/>
-          <w:sz w:val="20"/>
-          <w:szCs w:val="20"/>
-        </w:rPr>
-        <w:t>3</w:t>
-      </w:r>
-      <w:r>
-        <w:rPr>
-          <w:rFonts w:ascii="Calibri" w:eastAsia="Calibri" w:hAnsi="Calibri" w:cs="Calibri"/>
-          <w:color w:val="44494F"/>
-          <w:sz w:val="20"/>
-          <w:szCs w:val="20"/>
-        </w:rPr>
-        <w:t>: Sample table data structure (Interest Rate Sensitivity table)</w:t>
+        <w:t>Figure 5.3: Sample table data structure (Interest Rate Sensitivity table)</w:t>
       </w:r>
     </w:p>
     <w:p>
@@ -3684,7 +3945,7 @@
           <w:sz w:val="24"/>
           <w:szCs w:val="24"/>
         </w:rPr>
-        <w:t>The system is evaluated across three independent pillars:</w:t>
+        <w:t>We evaluate the system along three key dimensions, each chosen to reveal where different retrieval approaches excel or struggle:</w:t>
       </w:r>
     </w:p>
     <w:p>
@@ -3711,7 +3972,7 @@
           <w:sz w:val="24"/>
           <w:szCs w:val="24"/>
         </w:rPr>
-        <w:t xml:space="preserve"> (Precision@K, Recall@K, Evidence Hit Rate) are computed deterministically against node-ID ground truth.</w:t>
+        <w:t xml:space="preserve"> (Precision@K, Recall@K, Evidence Hit Rate) measure how well each pipeline finds the right evidence nodes. Since we know exactly which nodes answer each query, we compute these deterministically against that ground truth.</w:t>
       </w:r>
     </w:p>
     <w:p>
@@ -3738,7 +3999,7 @@
           <w:sz w:val="24"/>
           <w:szCs w:val="24"/>
         </w:rPr>
-        <w:t xml:space="preserve"> use an LLM-as-judge score (1–10) as the primary measure, with token-level F1 and numeric-tolerant Exact Match as secondary lexical checks, plus a code-level Citation Audit that flags answers which are correct only by coincidence, where the cited evidence does not match the ground truth.</w:t>
+        <w:t xml:space="preserve"> assess how well the final answers actually work. We use an LLM-as-judge scoring on a 1–10 scale as our primary measure, backed up by lexical checks (token-level F1 and numeric-tolerant Exact Match) and a Citation Audit that flags answers which happen to be correct despite citing the wrong evidence.</w:t>
       </w:r>
     </w:p>
     <w:p>
@@ -3765,7 +4026,7 @@
           <w:sz w:val="24"/>
           <w:szCs w:val="24"/>
         </w:rPr>
-        <w:t xml:space="preserve"> cover latency, token consumption, and one-time index-build cost per pipeline.</w:t>
+        <w:t xml:space="preserve"> capture the real cost of running each approach: wall-clock latency, LLM token consumption, and the one-time cost to build each pipeline’s index.</w:t>
       </w:r>
     </w:p>
     <w:p>
@@ -3782,7 +4043,7 @@
           <w:sz w:val="24"/>
           <w:szCs w:val="24"/>
         </w:rPr>
-        <w:t xml:space="preserve">The automated judge is not trusted by default. It must first clear a hard validation gate, reaching greater than 80% agreement with the researcher’s own hand-scored outputs on a disjoint validation set, before it is permitted to grade the full benchmark, mirroring the agreement threshold reported for LLM judges by Zheng </w:t>
+        <w:t xml:space="preserve">The automated judge isn’t trusted right out of the box. Before it’s allowed to grade all 900 benchmark runs, it must first pass a validation gate: achieving greater than 80% agreement with hand-scored outputs on a separate validation set, a threshold established by prior work on LLM judges (Zheng </w:t>
       </w:r>
       <w:r>
         <w:rPr>
@@ -3798,7 +4059,7 @@
           <w:sz w:val="24"/>
           <w:szCs w:val="24"/>
         </w:rPr>
-        <w:t xml:space="preserve"> (2023). Every script that calls a language model is first run end-to-end under a hardcoded three-item local throttle, to catch bugs before any free-tier quota is spent at scale.</w:t>
+        <w:t>, 2023). To catch bugs before spending free-tier quota at scale, every script that calls a language model is run end-to-end first under a hardcoded three-item local throttle.</w:t>
       </w:r>
     </w:p>
     <w:tbl>
@@ -3936,7 +4197,60 @@
           <w:sz w:val="24"/>
           <w:szCs w:val="24"/>
         </w:rPr>
-        <w:t xml:space="preserve"> a cross-paradigm RAG comparison grounded in current literature (Lewis et al., 2020; Karpukhin et al., 2020; Sarthi et al., 2024), exposing paradigm limits not yet documented for SEC-filing data.</w:t>
+        <w:t xml:space="preserve"> </w:t>
+      </w:r>
+      <w:r>
+        <w:rPr>
+          <w:sz w:val="24"/>
+          <w:szCs w:val="24"/>
+        </w:rPr>
+        <w:t xml:space="preserve">a cross-paradigm RAG comparison grounded in current literature (Lewis et al., 2020; </w:t>
+      </w:r>
+      <w:proofErr w:type="spellStart"/>
+      <w:r>
+        <w:rPr>
+          <w:sz w:val="24"/>
+          <w:szCs w:val="24"/>
+        </w:rPr>
+        <w:t>Karpukhin</w:t>
+      </w:r>
+      <w:proofErr w:type="spellEnd"/>
+      <w:r>
+        <w:rPr>
+          <w:sz w:val="24"/>
+          <w:szCs w:val="24"/>
+        </w:rPr>
+        <w:t xml:space="preserve"> et al., 2020; </w:t>
+      </w:r>
+      <w:proofErr w:type="spellStart"/>
+      <w:r>
+        <w:rPr>
+          <w:sz w:val="24"/>
+          <w:szCs w:val="24"/>
+        </w:rPr>
+        <w:t>Sarthi</w:t>
+      </w:r>
+      <w:proofErr w:type="spellEnd"/>
+      <w:r>
+        <w:rPr>
+          <w:sz w:val="24"/>
+          <w:szCs w:val="24"/>
+        </w:rPr>
+        <w:t xml:space="preserve"> et al., 2024), exposing paradigm limits which is not yet documented for </w:t>
+      </w:r>
+      <w:r>
+        <w:rPr>
+          <w:sz w:val="24"/>
+          <w:szCs w:val="24"/>
+        </w:rPr>
+        <w:t xml:space="preserve">the </w:t>
+      </w:r>
+      <w:r>
+        <w:rPr>
+          <w:sz w:val="24"/>
+          <w:szCs w:val="24"/>
+        </w:rPr>
+        <w:t>SEC-filing data.</w:t>
       </w:r>
     </w:p>
     <w:p>

</xml_diff>